<commit_message>
feat: add boss breakthrough progression and update design doc
</commit_message>
<xml_diff>
--- a/星界之律遊戲設定總覽.docx
+++ b/星界之律遊戲設定總覽.docx
@@ -361,7 +361,7 @@
                 <w:color w:val="20242C"/>
                 <w:sz w:val="18"/>
               </w:rPr>
-              <w:t>主線與支線 1.0–2.5，共 24 章，每章 3 幕</w:t>
+              <w:t>主線與支線 1.0–2.5，共 18 章，每章 3 幕</w:t>
             </w:r>
           </w:p>
         </w:tc>
@@ -647,7 +647,7 @@
                 <w:color w:val="20242C"/>
                 <w:sz w:val="18"/>
               </w:rPr>
-              <w:t>星港委託</w:t>
+              <w:t>Boss 突破</w:t>
             </w:r>
           </w:p>
         </w:tc>
@@ -682,7 +682,7 @@
                 <w:color w:val="20242C"/>
                 <w:sz w:val="18"/>
               </w:rPr>
-              <w:t>3 份短篇戰鬥任務，每版本各完成一次</w:t>
+              <w:t>6 種 Boss；角色 80 等後取得指定材料，突破至 90 等</w:t>
             </w:r>
           </w:p>
         </w:tc>
@@ -754,7 +754,7 @@
                 <w:color w:val="20242C"/>
                 <w:sz w:val="18"/>
               </w:rPr>
-              <w:t>後續內容</w:t>
+              <w:t>星港委託</w:t>
             </w:r>
           </w:p>
         </w:tc>
@@ -789,6 +789,113 @@
                 <w:color w:val="20242C"/>
                 <w:sz w:val="18"/>
               </w:rPr>
+              <w:t>3 份短篇戰鬥任務，每版本各完成一次</w:t>
+            </w:r>
+          </w:p>
+        </w:tc>
+        <w:tc>
+          <w:tcPr>
+            <w:tcW w:type="dxa" w:w="1584"/>
+            <w:vAlign w:val="center"/>
+            <w:shd w:fill="F4F7FB"/>
+            <w:tcBorders>
+              <w:top w:val="single" w:sz="6" w:space="0" w:color="D9D9D9"/>
+              <w:left w:val="single" w:sz="6" w:space="0" w:color="D9D9D9"/>
+              <w:bottom w:val="single" w:sz="6" w:space="0" w:color="D9D9D9"/>
+              <w:right w:val="single" w:sz="6" w:space="0" w:color="D9D9D9"/>
+              <w:insideH w:val="single" w:sz="6" w:space="0" w:color="D9D9D9"/>
+              <w:insideV w:val="single" w:sz="6" w:space="0" w:color="D9D9D9"/>
+            </w:tcBorders>
+            <w:tcMar>
+              <w:top w:w="100" w:type="dxa"/>
+              <w:start w:w="120" w:type="dxa"/>
+              <w:bottom w:w="100" w:type="dxa"/>
+              <w:end w:w="120" w:type="dxa"/>
+            </w:tcMar>
+          </w:tcPr>
+          <w:p>
+            <w:pPr>
+              <w:spacing w:after="20" w:line="276" w:lineRule="auto"/>
+            </w:pPr>
+            <w:r/>
+            <w:r>
+              <w:rPr>
+                <w:rFonts w:ascii="Microsoft JhengHei" w:hAnsi="Microsoft JhengHei" w:eastAsia="Microsoft JhengHei"/>
+                <w:color w:val="20242C"/>
+                <w:sz w:val="18"/>
+              </w:rPr>
+              <w:t>新增玩法</w:t>
+            </w:r>
+          </w:p>
+        </w:tc>
+      </w:tr>
+      <w:tr>
+        <w:tc>
+          <w:tcPr>
+            <w:tcW w:type="dxa" w:w="1944"/>
+            <w:vAlign w:val="center"/>
+            <w:shd w:fill="FFFFFF"/>
+            <w:tcBorders>
+              <w:top w:val="single" w:sz="6" w:space="0" w:color="D9D9D9"/>
+              <w:left w:val="single" w:sz="6" w:space="0" w:color="D9D9D9"/>
+              <w:bottom w:val="single" w:sz="6" w:space="0" w:color="D9D9D9"/>
+              <w:right w:val="single" w:sz="6" w:space="0" w:color="D9D9D9"/>
+              <w:insideH w:val="single" w:sz="6" w:space="0" w:color="D9D9D9"/>
+              <w:insideV w:val="single" w:sz="6" w:space="0" w:color="D9D9D9"/>
+            </w:tcBorders>
+            <w:tcMar>
+              <w:top w:w="100" w:type="dxa"/>
+              <w:start w:w="120" w:type="dxa"/>
+              <w:bottom w:w="100" w:type="dxa"/>
+              <w:end w:w="120" w:type="dxa"/>
+            </w:tcMar>
+          </w:tcPr>
+          <w:p>
+            <w:pPr>
+              <w:spacing w:after="20" w:line="276" w:lineRule="auto"/>
+            </w:pPr>
+            <w:r/>
+            <w:r>
+              <w:rPr>
+                <w:rFonts w:ascii="Microsoft JhengHei" w:hAnsi="Microsoft JhengHei" w:eastAsia="Microsoft JhengHei"/>
+                <w:color w:val="20242C"/>
+                <w:sz w:val="18"/>
+              </w:rPr>
+              <w:t>後續內容</w:t>
+            </w:r>
+          </w:p>
+        </w:tc>
+        <w:tc>
+          <w:tcPr>
+            <w:tcW w:type="dxa" w:w="5976"/>
+            <w:vAlign w:val="center"/>
+            <w:shd w:fill="FFFFFF"/>
+            <w:tcBorders>
+              <w:top w:val="single" w:sz="6" w:space="0" w:color="D9D9D9"/>
+              <w:left w:val="single" w:sz="6" w:space="0" w:color="D9D9D9"/>
+              <w:bottom w:val="single" w:sz="6" w:space="0" w:color="D9D9D9"/>
+              <w:right w:val="single" w:sz="6" w:space="0" w:color="D9D9D9"/>
+              <w:insideH w:val="single" w:sz="6" w:space="0" w:color="D9D9D9"/>
+              <w:insideV w:val="single" w:sz="6" w:space="0" w:color="D9D9D9"/>
+            </w:tcBorders>
+            <w:tcMar>
+              <w:top w:w="100" w:type="dxa"/>
+              <w:start w:w="120" w:type="dxa"/>
+              <w:bottom w:w="100" w:type="dxa"/>
+              <w:end w:w="120" w:type="dxa"/>
+            </w:tcMar>
+          </w:tcPr>
+          <w:p>
+            <w:pPr>
+              <w:spacing w:after="20" w:line="276" w:lineRule="auto"/>
+            </w:pPr>
+            <w:r/>
+            <w:r>
+              <w:rPr>
+                <w:rFonts w:ascii="Microsoft JhengHei" w:hAnsi="Microsoft JhengHei" w:eastAsia="Microsoft JhengHei"/>
+                <w:color w:val="20242C"/>
+                <w:sz w:val="18"/>
+              </w:rPr>
               <w:t>3.0–4.5 劇情、角色、敵人與數值</w:t>
             </w:r>
           </w:p>
@@ -797,7 +904,7 @@
           <w:tcPr>
             <w:tcW w:type="dxa" w:w="1584"/>
             <w:vAlign w:val="center"/>
-            <w:shd w:fill="F4F7FB"/>
+            <w:shd w:fill="FFFFFF"/>
             <w:tcBorders>
               <w:top w:val="single" w:sz="6" w:space="0" w:color="D9D9D9"/>
               <w:left w:val="single" w:sz="6" w:space="0" w:color="D9D9D9"/>
@@ -862,7 +969,7 @@
           <w:color w:val="20242C"/>
           <w:sz w:val="21"/>
         </w:rPr>
-        <w:t>版本標記為 2.0-2.5。伺服器在玩家建立帳號或登入時檢查 updateRewards.claimedVersions，只要該帳號尚未領取本版本，就加入 3,200 星砂並寫入領取時間。新帳號與舊帳號使用同一套邏輯，因此不會因為建立時間不同而漏領或重複領取。</w:t>
+        <w:t>版本標記為 2.0-2.5。伺服器在玩家建立帳號或登入時檢查 updateRewards.claimedVersions，只要該帳號尚未領取本版本，就加入 3,200 星砂並寫入領取時間。新帳號與舊帳號使用同一套邏輯，因此不會因為建立時間不同而漏領或重複領取。試煉獎勵次數與 Boss 挑戰紀錄按版本重置，但玩家角色、等級、命座、突破狀態與已取得的突破材料不重置。</w:t>
       </w:r>
     </w:p>
     <w:p>
@@ -891,6 +998,20 @@
           <w:sz w:val="20"/>
         </w:rPr>
         <w:t>星港委託的完成紀錄也以 2.0-2.5 為版本鍵，下次版本更新時清空。</w:t>
+      </w:r>
+    </w:p>
+    <w:p>
+      <w:pPr>
+        <w:pStyle w:val="ListBullet"/>
+        <w:spacing w:after="60" w:line="288" w:lineRule="auto"/>
+      </w:pPr>
+      <w:r>
+        <w:rPr>
+          <w:rFonts w:ascii="Microsoft JhengHei" w:hAnsi="Microsoft JhengHei" w:eastAsia="Microsoft JhengHei"/>
+          <w:color w:val="20242C"/>
+          <w:sz w:val="20"/>
+        </w:rPr>
+        <w:t>Boss 每個版本重新計算成功獎勵次數；已取得的材料與角色突破狀態跨版本保留。</w:t>
       </w:r>
     </w:p>
     <w:p>
@@ -2677,7 +2798,7 @@
                 <w:color w:val="20242C"/>
                 <w:sz w:val="18"/>
               </w:rPr>
-              <w:t>共鳴券</w:t>
+              <w:t>星痕</w:t>
             </w:r>
           </w:p>
         </w:tc>
@@ -2712,7 +2833,7 @@
                 <w:color w:val="20242C"/>
                 <w:sz w:val="18"/>
               </w:rPr>
-              <w:t>試煉與委託等玩法</w:t>
+              <w:t>重複 4★</w:t>
             </w:r>
           </w:p>
         </w:tc>
@@ -2747,7 +2868,7 @@
                 <w:color w:val="20242C"/>
                 <w:sz w:val="18"/>
               </w:rPr>
-              <w:t>免費單抽</w:t>
+              <w:t>10 枚兌換限定池精選 4★</w:t>
             </w:r>
           </w:p>
         </w:tc>
@@ -2784,7 +2905,7 @@
                 <w:color w:val="20242C"/>
                 <w:sz w:val="18"/>
               </w:rPr>
-              <w:t>星痕</w:t>
+              <w:t>回響粉</w:t>
             </w:r>
           </w:p>
         </w:tc>
@@ -2819,7 +2940,7 @@
                 <w:color w:val="20242C"/>
                 <w:sz w:val="18"/>
               </w:rPr>
-              <w:t>重複 4★</w:t>
+              <w:t>一般回響結果</w:t>
             </w:r>
           </w:p>
         </w:tc>
@@ -2854,7 +2975,7 @@
                 <w:color w:val="20242C"/>
                 <w:sz w:val="18"/>
               </w:rPr>
-              <w:t>10 枚兌換限定池精選 4★</w:t>
+              <w:t>抽卡系統內的非角色回響資源</w:t>
             </w:r>
           </w:p>
         </w:tc>
@@ -2891,7 +3012,7 @@
                 <w:color w:val="20242C"/>
                 <w:sz w:val="18"/>
               </w:rPr>
-              <w:t>回響粉</w:t>
+              <w:t>角色經驗</w:t>
             </w:r>
           </w:p>
         </w:tc>
@@ -2926,7 +3047,7 @@
                 <w:color w:val="20242C"/>
                 <w:sz w:val="18"/>
               </w:rPr>
-              <w:t>一般回響結果</w:t>
+              <w:t>試煉、委託、重複 3★等</w:t>
             </w:r>
           </w:p>
         </w:tc>
@@ -2961,7 +3082,7 @@
                 <w:color w:val="20242C"/>
                 <w:sz w:val="18"/>
               </w:rPr>
-              <w:t>抽卡系統內的非角色回響資源</w:t>
+              <w:t>角色升級，不與星砂共用</w:t>
             </w:r>
           </w:p>
         </w:tc>
@@ -2998,7 +3119,7 @@
                 <w:color w:val="20242C"/>
                 <w:sz w:val="18"/>
               </w:rPr>
-              <w:t>角色經驗</w:t>
+              <w:t>突破材料</w:t>
             </w:r>
           </w:p>
         </w:tc>
@@ -3033,7 +3154,7 @@
                 <w:color w:val="20242C"/>
                 <w:sz w:val="18"/>
               </w:rPr>
-              <w:t>試煉、委託、重複 3★等</w:t>
+              <w:t>指定 Boss 勝利</w:t>
             </w:r>
           </w:p>
         </w:tc>
@@ -3068,7 +3189,7 @@
                 <w:color w:val="20242C"/>
                 <w:sz w:val="18"/>
               </w:rPr>
-              <w:t>角色升級，不與星砂共用</w:t>
+              <w:t>依角色指定 Boss 取得；80 等突破後升到 90 等</w:t>
             </w:r>
           </w:p>
         </w:tc>
@@ -5520,7 +5641,7 @@
                 <w:color w:val="20242C"/>
                 <w:sz w:val="18"/>
               </w:rPr>
-              <w:t>每級 2.8% 主要屬性、2.2% 防禦、0.9% 速度</w:t>
+              <w:t>每級 3.2% 主要屬性、2.5% 防禦、1.1% 速度</w:t>
             </w:r>
           </w:p>
         </w:tc>
@@ -5592,7 +5713,7 @@
                 <w:color w:val="20242C"/>
                 <w:sz w:val="18"/>
               </w:rPr>
-              <w:t>起始 60 角色經驗，每級增加 30</w:t>
+              <w:t>起始 45 角色經驗，每級增加 18</w:t>
             </w:r>
           </w:p>
         </w:tc>
@@ -5627,7 +5748,7 @@
                 <w:color w:val="20242C"/>
                 <w:sz w:val="18"/>
               </w:rPr>
-              <w:t>起始 100 角色經驗，每級增加 55</w:t>
+              <w:t>起始 70 角色經驗，每級增加 32</w:t>
             </w:r>
           </w:p>
         </w:tc>
@@ -5744,6 +5865,64 @@
       <w:pPr>
         <w:spacing w:after="20"/>
       </w:pPr>
+    </w:p>
+    <w:p>
+      <w:pPr>
+        <w:pStyle w:val="Heading2"/>
+        <w:keepNext/>
+        <w:spacing w:before="160" w:after="100"/>
+      </w:pPr>
+      <w:r>
+        <w:rPr>
+          <w:rFonts w:ascii="Microsoft JhengHei" w:hAnsi="Microsoft JhengHei" w:eastAsia="Microsoft JhengHei"/>
+          <w:b/>
+          <w:color w:val="000000"/>
+          <w:sz w:val="26"/>
+        </w:rPr>
+        <w:t>等級上限與突破</w:t>
+      </w:r>
+    </w:p>
+    <w:p>
+      <w:pPr>
+        <w:pStyle w:val="ListBullet"/>
+        <w:spacing w:after="60" w:line="288" w:lineRule="auto"/>
+      </w:pPr>
+      <w:r>
+        <w:rPr>
+          <w:rFonts w:ascii="Microsoft JhengHei" w:hAnsi="Microsoft JhengHei" w:eastAsia="Microsoft JhengHei"/>
+          <w:color w:val="20242C"/>
+          <w:sz w:val="20"/>
+        </w:rPr>
+        <w:t>現行角色等級上限為 90；角色可先升到 80 等，達到 80 等後必須完成指定 Boss 突破才能繼續升級。</w:t>
+      </w:r>
+    </w:p>
+    <w:p>
+      <w:pPr>
+        <w:pStyle w:val="ListBullet"/>
+        <w:spacing w:after="60" w:line="288" w:lineRule="auto"/>
+      </w:pPr>
+      <w:r>
+        <w:rPr>
+          <w:rFonts w:ascii="Microsoft JhengHei" w:hAnsi="Microsoft JhengHei" w:eastAsia="Microsoft JhengHei"/>
+          <w:color w:val="20242C"/>
+          <w:sz w:val="20"/>
+        </w:rPr>
+        <w:t>每名角色只對應一種 Boss 與一種突破材料：三星角色每次突破需要 3 枚，四星角色需要 4 枚。</w:t>
+      </w:r>
+    </w:p>
+    <w:p>
+      <w:pPr>
+        <w:pStyle w:val="ListBullet"/>
+        <w:spacing w:after="60" w:line="288" w:lineRule="auto"/>
+      </w:pPr>
+      <w:r>
+        <w:rPr>
+          <w:rFonts w:ascii="Microsoft JhengHei" w:hAnsi="Microsoft JhengHei" w:eastAsia="Microsoft JhengHei"/>
+          <w:color w:val="20242C"/>
+          <w:sz w:val="20"/>
+        </w:rPr>
+        <w:t>100 等只完成規則與資料預留，本次不在玩家介面開放，也不會被當成目前等級上限。</w:t>
+      </w:r>
     </w:p>
     <w:p>
       <w:pPr>
@@ -6223,7 +6402,7 @@
                 <w:color w:val="20242C"/>
                 <w:sz w:val="18"/>
               </w:rPr>
-              <w:t>100 星砂、1 共鳴券、該關角色經驗</w:t>
+              <w:t>260 星砂、該關角色經驗</w:t>
             </w:r>
           </w:p>
         </w:tc>
@@ -6526,6 +6705,1103 @@
           <w:color w:val="000000"/>
           <w:sz w:val="36"/>
         </w:rPr>
+        <w:t>Boss 與 80 等突破</w:t>
+      </w:r>
+    </w:p>
+    <w:p>
+      <w:pPr>
+        <w:spacing w:after="140" w:line="312" w:lineRule="auto"/>
+      </w:pPr>
+      <w:r>
+        <w:rPr>
+          <w:rFonts w:ascii="Microsoft JhengHei" w:hAnsi="Microsoft JhengHei" w:eastAsia="Microsoft JhengHei"/>
+          <w:b w:val="0"/>
+          <w:color w:val="20242C"/>
+          <w:sz w:val="21"/>
+        </w:rPr>
+        <w:t>Boss 是角色 80 等後的專屬突破玩法。玩家在 Boss 頁選擇首領、查看敵人與環境情報，再從已取得角色中派出最多 4 人。每名角色的培養頁會明確顯示指定 Boss、材料名稱、需求數量與目前持有量。</w:t>
+      </w:r>
+    </w:p>
+    <w:tbl>
+      <w:tblPr>
+        <w:tblW w:type="auto" w:w="0"/>
+        <w:jc w:val="center"/>
+        <w:tblLayout w:type="fixed"/>
+        <w:tblLook w:firstColumn="1" w:firstRow="1" w:lastColumn="0" w:lastRow="0" w:noHBand="0" w:noVBand="1" w:val="04A0"/>
+      </w:tblPr>
+      <w:tblGrid>
+        <w:gridCol w:w="2541"/>
+        <w:gridCol w:w="2541"/>
+        <w:gridCol w:w="2541"/>
+        <w:gridCol w:w="2541"/>
+      </w:tblGrid>
+      <w:tr>
+        <w:trPr>
+          <w:tblHeader w:val="true"/>
+        </w:trPr>
+        <w:tc>
+          <w:tcPr>
+            <w:tcW w:type="dxa" w:w="2016"/>
+            <w:vAlign w:val="center"/>
+            <w:shd w:fill="193B63"/>
+            <w:tcBorders>
+              <w:top w:val="single" w:sz="6" w:space="0" w:color="D9D9D9"/>
+              <w:left w:val="single" w:sz="6" w:space="0" w:color="D9D9D9"/>
+              <w:bottom w:val="single" w:sz="6" w:space="0" w:color="D9D9D9"/>
+              <w:right w:val="single" w:sz="6" w:space="0" w:color="D9D9D9"/>
+              <w:insideH w:val="single" w:sz="6" w:space="0" w:color="D9D9D9"/>
+              <w:insideV w:val="single" w:sz="6" w:space="0" w:color="D9D9D9"/>
+            </w:tcBorders>
+            <w:tcMar>
+              <w:top w:w="100" w:type="dxa"/>
+              <w:start w:w="120" w:type="dxa"/>
+              <w:bottom w:w="100" w:type="dxa"/>
+              <w:end w:w="120" w:type="dxa"/>
+            </w:tcMar>
+          </w:tcPr>
+          <w:p>
+            <w:pPr>
+              <w:jc w:val="left"/>
+            </w:pPr>
+            <w:r/>
+            <w:r>
+              <w:rPr>
+                <w:rFonts w:ascii="Microsoft JhengHei" w:hAnsi="Microsoft JhengHei" w:eastAsia="Microsoft JhengHei"/>
+                <w:b/>
+                <w:color w:val="FFFFFF"/>
+                <w:sz w:val="18"/>
+              </w:rPr>
+              <w:t>Boss</w:t>
+            </w:r>
+          </w:p>
+        </w:tc>
+        <w:tc>
+          <w:tcPr>
+            <w:tcW w:type="dxa" w:w="1944"/>
+            <w:vAlign w:val="center"/>
+            <w:shd w:fill="193B63"/>
+            <w:tcBorders>
+              <w:top w:val="single" w:sz="6" w:space="0" w:color="D9D9D9"/>
+              <w:left w:val="single" w:sz="6" w:space="0" w:color="D9D9D9"/>
+              <w:bottom w:val="single" w:sz="6" w:space="0" w:color="D9D9D9"/>
+              <w:right w:val="single" w:sz="6" w:space="0" w:color="D9D9D9"/>
+              <w:insideH w:val="single" w:sz="6" w:space="0" w:color="D9D9D9"/>
+              <w:insideV w:val="single" w:sz="6" w:space="0" w:color="D9D9D9"/>
+            </w:tcBorders>
+            <w:tcMar>
+              <w:top w:w="100" w:type="dxa"/>
+              <w:start w:w="120" w:type="dxa"/>
+              <w:bottom w:w="100" w:type="dxa"/>
+              <w:end w:w="120" w:type="dxa"/>
+            </w:tcMar>
+          </w:tcPr>
+          <w:p>
+            <w:pPr>
+              <w:jc w:val="left"/>
+            </w:pPr>
+            <w:r/>
+            <w:r>
+              <w:rPr>
+                <w:rFonts w:ascii="Microsoft JhengHei" w:hAnsi="Microsoft JhengHei" w:eastAsia="Microsoft JhengHei"/>
+                <w:b/>
+                <w:color w:val="FFFFFF"/>
+                <w:sz w:val="18"/>
+              </w:rPr>
+              <w:t>突破材料</w:t>
+            </w:r>
+          </w:p>
+        </w:tc>
+        <w:tc>
+          <w:tcPr>
+            <w:tcW w:type="dxa" w:w="3528"/>
+            <w:vAlign w:val="center"/>
+            <w:shd w:fill="193B63"/>
+            <w:tcBorders>
+              <w:top w:val="single" w:sz="6" w:space="0" w:color="D9D9D9"/>
+              <w:left w:val="single" w:sz="6" w:space="0" w:color="D9D9D9"/>
+              <w:bottom w:val="single" w:sz="6" w:space="0" w:color="D9D9D9"/>
+              <w:right w:val="single" w:sz="6" w:space="0" w:color="D9D9D9"/>
+              <w:insideH w:val="single" w:sz="6" w:space="0" w:color="D9D9D9"/>
+              <w:insideV w:val="single" w:sz="6" w:space="0" w:color="D9D9D9"/>
+            </w:tcBorders>
+            <w:tcMar>
+              <w:top w:w="100" w:type="dxa"/>
+              <w:start w:w="120" w:type="dxa"/>
+              <w:bottom w:w="100" w:type="dxa"/>
+              <w:end w:w="120" w:type="dxa"/>
+            </w:tcMar>
+          </w:tcPr>
+          <w:p>
+            <w:pPr>
+              <w:jc w:val="left"/>
+            </w:pPr>
+            <w:r/>
+            <w:r>
+              <w:rPr>
+                <w:rFonts w:ascii="Microsoft JhengHei" w:hAnsi="Microsoft JhengHei" w:eastAsia="Microsoft JhengHei"/>
+                <w:b/>
+                <w:color w:val="FFFFFF"/>
+                <w:sz w:val="18"/>
+              </w:rPr>
+              <w:t>對應角色群</w:t>
+            </w:r>
+          </w:p>
+        </w:tc>
+        <w:tc>
+          <w:tcPr>
+            <w:tcW w:type="dxa" w:w="2016"/>
+            <w:vAlign w:val="center"/>
+            <w:shd w:fill="193B63"/>
+            <w:tcBorders>
+              <w:top w:val="single" w:sz="6" w:space="0" w:color="D9D9D9"/>
+              <w:left w:val="single" w:sz="6" w:space="0" w:color="D9D9D9"/>
+              <w:bottom w:val="single" w:sz="6" w:space="0" w:color="D9D9D9"/>
+              <w:right w:val="single" w:sz="6" w:space="0" w:color="D9D9D9"/>
+              <w:insideH w:val="single" w:sz="6" w:space="0" w:color="D9D9D9"/>
+              <w:insideV w:val="single" w:sz="6" w:space="0" w:color="D9D9D9"/>
+            </w:tcBorders>
+            <w:tcMar>
+              <w:top w:w="100" w:type="dxa"/>
+              <w:start w:w="120" w:type="dxa"/>
+              <w:bottom w:w="100" w:type="dxa"/>
+              <w:end w:w="120" w:type="dxa"/>
+            </w:tcMar>
+          </w:tcPr>
+          <w:p>
+            <w:pPr>
+              <w:jc w:val="left"/>
+            </w:pPr>
+            <w:r/>
+            <w:r>
+              <w:rPr>
+                <w:rFonts w:ascii="Microsoft JhengHei" w:hAnsi="Microsoft JhengHei" w:eastAsia="Microsoft JhengHei"/>
+                <w:b/>
+                <w:color w:val="FFFFFF"/>
+                <w:sz w:val="18"/>
+              </w:rPr>
+              <w:t>每名角色需求</w:t>
+            </w:r>
+          </w:p>
+        </w:tc>
+      </w:tr>
+      <w:tr>
+        <w:tc>
+          <w:tcPr>
+            <w:tcW w:type="dxa" w:w="2016"/>
+            <w:vAlign w:val="center"/>
+            <w:shd w:fill="FFFFFF"/>
+            <w:tcBorders>
+              <w:top w:val="single" w:sz="6" w:space="0" w:color="D9D9D9"/>
+              <w:left w:val="single" w:sz="6" w:space="0" w:color="D9D9D9"/>
+              <w:bottom w:val="single" w:sz="6" w:space="0" w:color="D9D9D9"/>
+              <w:right w:val="single" w:sz="6" w:space="0" w:color="D9D9D9"/>
+              <w:insideH w:val="single" w:sz="6" w:space="0" w:color="D9D9D9"/>
+              <w:insideV w:val="single" w:sz="6" w:space="0" w:color="D9D9D9"/>
+            </w:tcBorders>
+            <w:tcMar>
+              <w:top w:w="100" w:type="dxa"/>
+              <w:start w:w="120" w:type="dxa"/>
+              <w:bottom w:w="100" w:type="dxa"/>
+              <w:end w:w="120" w:type="dxa"/>
+            </w:tcMar>
+          </w:tcPr>
+          <w:p>
+            <w:pPr>
+              <w:spacing w:after="20" w:line="276" w:lineRule="auto"/>
+            </w:pPr>
+            <w:r/>
+            <w:r>
+              <w:rPr>
+                <w:rFonts w:ascii="Microsoft JhengHei" w:hAnsi="Microsoft JhengHei" w:eastAsia="Microsoft JhengHei"/>
+                <w:color w:val="20242C"/>
+                <w:sz w:val="18"/>
+              </w:rPr>
+              <w:t>星序守望者</w:t>
+            </w:r>
+          </w:p>
+        </w:tc>
+        <w:tc>
+          <w:tcPr>
+            <w:tcW w:type="dxa" w:w="1944"/>
+            <w:vAlign w:val="center"/>
+            <w:shd w:fill="FFFFFF"/>
+            <w:tcBorders>
+              <w:top w:val="single" w:sz="6" w:space="0" w:color="D9D9D9"/>
+              <w:left w:val="single" w:sz="6" w:space="0" w:color="D9D9D9"/>
+              <w:bottom w:val="single" w:sz="6" w:space="0" w:color="D9D9D9"/>
+              <w:right w:val="single" w:sz="6" w:space="0" w:color="D9D9D9"/>
+              <w:insideH w:val="single" w:sz="6" w:space="0" w:color="D9D9D9"/>
+              <w:insideV w:val="single" w:sz="6" w:space="0" w:color="D9D9D9"/>
+            </w:tcBorders>
+            <w:tcMar>
+              <w:top w:w="100" w:type="dxa"/>
+              <w:start w:w="120" w:type="dxa"/>
+              <w:bottom w:w="100" w:type="dxa"/>
+              <w:end w:w="120" w:type="dxa"/>
+            </w:tcMar>
+          </w:tcPr>
+          <w:p>
+            <w:pPr>
+              <w:spacing w:after="20" w:line="276" w:lineRule="auto"/>
+            </w:pPr>
+            <w:r/>
+            <w:r>
+              <w:rPr>
+                <w:rFonts w:ascii="Microsoft JhengHei" w:hAnsi="Microsoft JhengHei" w:eastAsia="Microsoft JhengHei"/>
+                <w:color w:val="20242C"/>
+                <w:sz w:val="18"/>
+              </w:rPr>
+              <w:t>星序碎晶</w:t>
+            </w:r>
+          </w:p>
+        </w:tc>
+        <w:tc>
+          <w:tcPr>
+            <w:tcW w:type="dxa" w:w="3528"/>
+            <w:vAlign w:val="center"/>
+            <w:shd w:fill="FFFFFF"/>
+            <w:tcBorders>
+              <w:top w:val="single" w:sz="6" w:space="0" w:color="D9D9D9"/>
+              <w:left w:val="single" w:sz="6" w:space="0" w:color="D9D9D9"/>
+              <w:bottom w:val="single" w:sz="6" w:space="0" w:color="D9D9D9"/>
+              <w:right w:val="single" w:sz="6" w:space="0" w:color="D9D9D9"/>
+              <w:insideH w:val="single" w:sz="6" w:space="0" w:color="D9D9D9"/>
+              <w:insideV w:val="single" w:sz="6" w:space="0" w:color="D9D9D9"/>
+            </w:tcBorders>
+            <w:tcMar>
+              <w:top w:w="100" w:type="dxa"/>
+              <w:start w:w="120" w:type="dxa"/>
+              <w:bottom w:w="100" w:type="dxa"/>
+              <w:end w:w="120" w:type="dxa"/>
+            </w:tcMar>
+          </w:tcPr>
+          <w:p>
+            <w:pPr>
+              <w:spacing w:after="20" w:line="276" w:lineRule="auto"/>
+            </w:pPr>
+            <w:r/>
+            <w:r>
+              <w:rPr>
+                <w:rFonts w:ascii="Microsoft JhengHei" w:hAnsi="Microsoft JhengHei" w:eastAsia="Microsoft JhengHei"/>
+                <w:color w:val="20242C"/>
+                <w:sz w:val="18"/>
+              </w:rPr>
+              <w:t>瑟蕾雅、艾妲、諾芮亞、奧蕾雅、伊萊拉</w:t>
+            </w:r>
+          </w:p>
+        </w:tc>
+        <w:tc>
+          <w:tcPr>
+            <w:tcW w:type="dxa" w:w="2016"/>
+            <w:vAlign w:val="center"/>
+            <w:shd w:fill="FFFFFF"/>
+            <w:tcBorders>
+              <w:top w:val="single" w:sz="6" w:space="0" w:color="D9D9D9"/>
+              <w:left w:val="single" w:sz="6" w:space="0" w:color="D9D9D9"/>
+              <w:bottom w:val="single" w:sz="6" w:space="0" w:color="D9D9D9"/>
+              <w:right w:val="single" w:sz="6" w:space="0" w:color="D9D9D9"/>
+              <w:insideH w:val="single" w:sz="6" w:space="0" w:color="D9D9D9"/>
+              <w:insideV w:val="single" w:sz="6" w:space="0" w:color="D9D9D9"/>
+            </w:tcBorders>
+            <w:tcMar>
+              <w:top w:w="100" w:type="dxa"/>
+              <w:start w:w="120" w:type="dxa"/>
+              <w:bottom w:w="100" w:type="dxa"/>
+              <w:end w:w="120" w:type="dxa"/>
+            </w:tcMar>
+          </w:tcPr>
+          <w:p>
+            <w:pPr>
+              <w:spacing w:after="20" w:line="276" w:lineRule="auto"/>
+            </w:pPr>
+            <w:r/>
+            <w:r>
+              <w:rPr>
+                <w:rFonts w:ascii="Microsoft JhengHei" w:hAnsi="Microsoft JhengHei" w:eastAsia="Microsoft JhengHei"/>
+                <w:color w:val="20242C"/>
+                <w:sz w:val="18"/>
+              </w:rPr>
+              <w:t>三星 3 枚；四星 4 枚</w:t>
+            </w:r>
+          </w:p>
+        </w:tc>
+      </w:tr>
+      <w:tr>
+        <w:tc>
+          <w:tcPr>
+            <w:tcW w:type="dxa" w:w="2016"/>
+            <w:vAlign w:val="center"/>
+            <w:shd w:fill="F4F7FB"/>
+            <w:tcBorders>
+              <w:top w:val="single" w:sz="6" w:space="0" w:color="D9D9D9"/>
+              <w:left w:val="single" w:sz="6" w:space="0" w:color="D9D9D9"/>
+              <w:bottom w:val="single" w:sz="6" w:space="0" w:color="D9D9D9"/>
+              <w:right w:val="single" w:sz="6" w:space="0" w:color="D9D9D9"/>
+              <w:insideH w:val="single" w:sz="6" w:space="0" w:color="D9D9D9"/>
+              <w:insideV w:val="single" w:sz="6" w:space="0" w:color="D9D9D9"/>
+            </w:tcBorders>
+            <w:tcMar>
+              <w:top w:w="100" w:type="dxa"/>
+              <w:start w:w="120" w:type="dxa"/>
+              <w:bottom w:w="100" w:type="dxa"/>
+              <w:end w:w="120" w:type="dxa"/>
+            </w:tcMar>
+          </w:tcPr>
+          <w:p>
+            <w:pPr>
+              <w:spacing w:after="20" w:line="276" w:lineRule="auto"/>
+            </w:pPr>
+            <w:r/>
+            <w:r>
+              <w:rPr>
+                <w:rFonts w:ascii="Microsoft JhengHei" w:hAnsi="Microsoft JhengHei" w:eastAsia="Microsoft JhengHei"/>
+                <w:color w:val="20242C"/>
+                <w:sz w:val="18"/>
+              </w:rPr>
+              <w:t>潮眼書庫獸</w:t>
+            </w:r>
+          </w:p>
+        </w:tc>
+        <w:tc>
+          <w:tcPr>
+            <w:tcW w:type="dxa" w:w="1944"/>
+            <w:vAlign w:val="center"/>
+            <w:shd w:fill="F4F7FB"/>
+            <w:tcBorders>
+              <w:top w:val="single" w:sz="6" w:space="0" w:color="D9D9D9"/>
+              <w:left w:val="single" w:sz="6" w:space="0" w:color="D9D9D9"/>
+              <w:bottom w:val="single" w:sz="6" w:space="0" w:color="D9D9D9"/>
+              <w:right w:val="single" w:sz="6" w:space="0" w:color="D9D9D9"/>
+              <w:insideH w:val="single" w:sz="6" w:space="0" w:color="D9D9D9"/>
+              <w:insideV w:val="single" w:sz="6" w:space="0" w:color="D9D9D9"/>
+            </w:tcBorders>
+            <w:tcMar>
+              <w:top w:w="100" w:type="dxa"/>
+              <w:start w:w="120" w:type="dxa"/>
+              <w:bottom w:w="100" w:type="dxa"/>
+              <w:end w:w="120" w:type="dxa"/>
+            </w:tcMar>
+          </w:tcPr>
+          <w:p>
+            <w:pPr>
+              <w:spacing w:after="20" w:line="276" w:lineRule="auto"/>
+            </w:pPr>
+            <w:r/>
+            <w:r>
+              <w:rPr>
+                <w:rFonts w:ascii="Microsoft JhengHei" w:hAnsi="Microsoft JhengHei" w:eastAsia="Microsoft JhengHei"/>
+                <w:color w:val="20242C"/>
+                <w:sz w:val="18"/>
+              </w:rPr>
+              <w:t>潮眼晶核</w:t>
+            </w:r>
+          </w:p>
+        </w:tc>
+        <w:tc>
+          <w:tcPr>
+            <w:tcW w:type="dxa" w:w="3528"/>
+            <w:vAlign w:val="center"/>
+            <w:shd w:fill="F4F7FB"/>
+            <w:tcBorders>
+              <w:top w:val="single" w:sz="6" w:space="0" w:color="D9D9D9"/>
+              <w:left w:val="single" w:sz="6" w:space="0" w:color="D9D9D9"/>
+              <w:bottom w:val="single" w:sz="6" w:space="0" w:color="D9D9D9"/>
+              <w:right w:val="single" w:sz="6" w:space="0" w:color="D9D9D9"/>
+              <w:insideH w:val="single" w:sz="6" w:space="0" w:color="D9D9D9"/>
+              <w:insideV w:val="single" w:sz="6" w:space="0" w:color="D9D9D9"/>
+            </w:tcBorders>
+            <w:tcMar>
+              <w:top w:w="100" w:type="dxa"/>
+              <w:start w:w="120" w:type="dxa"/>
+              <w:bottom w:w="100" w:type="dxa"/>
+              <w:end w:w="120" w:type="dxa"/>
+            </w:tcMar>
+          </w:tcPr>
+          <w:p>
+            <w:pPr>
+              <w:spacing w:after="20" w:line="276" w:lineRule="auto"/>
+            </w:pPr>
+            <w:r/>
+            <w:r>
+              <w:rPr>
+                <w:rFonts w:ascii="Microsoft JhengHei" w:hAnsi="Microsoft JhengHei" w:eastAsia="Microsoft JhengHei"/>
+                <w:color w:val="20242C"/>
+                <w:sz w:val="18"/>
+              </w:rPr>
+              <w:t>莉亞、蕾娜、艾洛娜、璃珊、澪歌、奧薇拉等</w:t>
+            </w:r>
+          </w:p>
+        </w:tc>
+        <w:tc>
+          <w:tcPr>
+            <w:tcW w:type="dxa" w:w="2016"/>
+            <w:vAlign w:val="center"/>
+            <w:shd w:fill="F4F7FB"/>
+            <w:tcBorders>
+              <w:top w:val="single" w:sz="6" w:space="0" w:color="D9D9D9"/>
+              <w:left w:val="single" w:sz="6" w:space="0" w:color="D9D9D9"/>
+              <w:bottom w:val="single" w:sz="6" w:space="0" w:color="D9D9D9"/>
+              <w:right w:val="single" w:sz="6" w:space="0" w:color="D9D9D9"/>
+              <w:insideH w:val="single" w:sz="6" w:space="0" w:color="D9D9D9"/>
+              <w:insideV w:val="single" w:sz="6" w:space="0" w:color="D9D9D9"/>
+            </w:tcBorders>
+            <w:tcMar>
+              <w:top w:w="100" w:type="dxa"/>
+              <w:start w:w="120" w:type="dxa"/>
+              <w:bottom w:w="100" w:type="dxa"/>
+              <w:end w:w="120" w:type="dxa"/>
+            </w:tcMar>
+          </w:tcPr>
+          <w:p>
+            <w:pPr>
+              <w:spacing w:after="20" w:line="276" w:lineRule="auto"/>
+            </w:pPr>
+            <w:r/>
+            <w:r>
+              <w:rPr>
+                <w:rFonts w:ascii="Microsoft JhengHei" w:hAnsi="Microsoft JhengHei" w:eastAsia="Microsoft JhengHei"/>
+                <w:color w:val="20242C"/>
+                <w:sz w:val="18"/>
+              </w:rPr>
+              <w:t>三星 3 枚；四星 4 枚</w:t>
+            </w:r>
+          </w:p>
+        </w:tc>
+      </w:tr>
+      <w:tr>
+        <w:tc>
+          <w:tcPr>
+            <w:tcW w:type="dxa" w:w="2016"/>
+            <w:vAlign w:val="center"/>
+            <w:shd w:fill="FFFFFF"/>
+            <w:tcBorders>
+              <w:top w:val="single" w:sz="6" w:space="0" w:color="D9D9D9"/>
+              <w:left w:val="single" w:sz="6" w:space="0" w:color="D9D9D9"/>
+              <w:bottom w:val="single" w:sz="6" w:space="0" w:color="D9D9D9"/>
+              <w:right w:val="single" w:sz="6" w:space="0" w:color="D9D9D9"/>
+              <w:insideH w:val="single" w:sz="6" w:space="0" w:color="D9D9D9"/>
+              <w:insideV w:val="single" w:sz="6" w:space="0" w:color="D9D9D9"/>
+            </w:tcBorders>
+            <w:tcMar>
+              <w:top w:w="100" w:type="dxa"/>
+              <w:start w:w="120" w:type="dxa"/>
+              <w:bottom w:w="100" w:type="dxa"/>
+              <w:end w:w="120" w:type="dxa"/>
+            </w:tcMar>
+          </w:tcPr>
+          <w:p>
+            <w:pPr>
+              <w:spacing w:after="20" w:line="276" w:lineRule="auto"/>
+            </w:pPr>
+            <w:r/>
+            <w:r>
+              <w:rPr>
+                <w:rFonts w:ascii="Microsoft JhengHei" w:hAnsi="Microsoft JhengHei" w:eastAsia="Microsoft JhengHei"/>
+                <w:color w:val="20242C"/>
+                <w:sz w:val="18"/>
+              </w:rPr>
+              <w:t>逆時守鐘人</w:t>
+            </w:r>
+          </w:p>
+        </w:tc>
+        <w:tc>
+          <w:tcPr>
+            <w:tcW w:type="dxa" w:w="1944"/>
+            <w:vAlign w:val="center"/>
+            <w:shd w:fill="FFFFFF"/>
+            <w:tcBorders>
+              <w:top w:val="single" w:sz="6" w:space="0" w:color="D9D9D9"/>
+              <w:left w:val="single" w:sz="6" w:space="0" w:color="D9D9D9"/>
+              <w:bottom w:val="single" w:sz="6" w:space="0" w:color="D9D9D9"/>
+              <w:right w:val="single" w:sz="6" w:space="0" w:color="D9D9D9"/>
+              <w:insideH w:val="single" w:sz="6" w:space="0" w:color="D9D9D9"/>
+              <w:insideV w:val="single" w:sz="6" w:space="0" w:color="D9D9D9"/>
+            </w:tcBorders>
+            <w:tcMar>
+              <w:top w:w="100" w:type="dxa"/>
+              <w:start w:w="120" w:type="dxa"/>
+              <w:bottom w:w="100" w:type="dxa"/>
+              <w:end w:w="120" w:type="dxa"/>
+            </w:tcMar>
+          </w:tcPr>
+          <w:p>
+            <w:pPr>
+              <w:spacing w:after="20" w:line="276" w:lineRule="auto"/>
+            </w:pPr>
+            <w:r/>
+            <w:r>
+              <w:rPr>
+                <w:rFonts w:ascii="Microsoft JhengHei" w:hAnsi="Microsoft JhengHei" w:eastAsia="Microsoft JhengHei"/>
+                <w:color w:val="20242C"/>
+                <w:sz w:val="18"/>
+              </w:rPr>
+              <w:t>逆時鐘核</w:t>
+            </w:r>
+          </w:p>
+        </w:tc>
+        <w:tc>
+          <w:tcPr>
+            <w:tcW w:type="dxa" w:w="3528"/>
+            <w:vAlign w:val="center"/>
+            <w:shd w:fill="FFFFFF"/>
+            <w:tcBorders>
+              <w:top w:val="single" w:sz="6" w:space="0" w:color="D9D9D9"/>
+              <w:left w:val="single" w:sz="6" w:space="0" w:color="D9D9D9"/>
+              <w:bottom w:val="single" w:sz="6" w:space="0" w:color="D9D9D9"/>
+              <w:right w:val="single" w:sz="6" w:space="0" w:color="D9D9D9"/>
+              <w:insideH w:val="single" w:sz="6" w:space="0" w:color="D9D9D9"/>
+              <w:insideV w:val="single" w:sz="6" w:space="0" w:color="D9D9D9"/>
+            </w:tcBorders>
+            <w:tcMar>
+              <w:top w:w="100" w:type="dxa"/>
+              <w:start w:w="120" w:type="dxa"/>
+              <w:bottom w:w="100" w:type="dxa"/>
+              <w:end w:w="120" w:type="dxa"/>
+            </w:tcMar>
+          </w:tcPr>
+          <w:p>
+            <w:pPr>
+              <w:spacing w:after="20" w:line="276" w:lineRule="auto"/>
+            </w:pPr>
+            <w:r/>
+            <w:r>
+              <w:rPr>
+                <w:rFonts w:ascii="Microsoft JhengHei" w:hAnsi="Microsoft JhengHei" w:eastAsia="Microsoft JhengHei"/>
+                <w:color w:val="20242C"/>
+                <w:sz w:val="18"/>
+              </w:rPr>
+              <w:t>雷恩、Chodan、Siyeon</w:t>
+            </w:r>
+          </w:p>
+        </w:tc>
+        <w:tc>
+          <w:tcPr>
+            <w:tcW w:type="dxa" w:w="2016"/>
+            <w:vAlign w:val="center"/>
+            <w:shd w:fill="FFFFFF"/>
+            <w:tcBorders>
+              <w:top w:val="single" w:sz="6" w:space="0" w:color="D9D9D9"/>
+              <w:left w:val="single" w:sz="6" w:space="0" w:color="D9D9D9"/>
+              <w:bottom w:val="single" w:sz="6" w:space="0" w:color="D9D9D9"/>
+              <w:right w:val="single" w:sz="6" w:space="0" w:color="D9D9D9"/>
+              <w:insideH w:val="single" w:sz="6" w:space="0" w:color="D9D9D9"/>
+              <w:insideV w:val="single" w:sz="6" w:space="0" w:color="D9D9D9"/>
+            </w:tcBorders>
+            <w:tcMar>
+              <w:top w:w="100" w:type="dxa"/>
+              <w:start w:w="120" w:type="dxa"/>
+              <w:bottom w:w="100" w:type="dxa"/>
+              <w:end w:w="120" w:type="dxa"/>
+            </w:tcMar>
+          </w:tcPr>
+          <w:p>
+            <w:pPr>
+              <w:spacing w:after="20" w:line="276" w:lineRule="auto"/>
+            </w:pPr>
+            <w:r/>
+            <w:r>
+              <w:rPr>
+                <w:rFonts w:ascii="Microsoft JhengHei" w:hAnsi="Microsoft JhengHei" w:eastAsia="Microsoft JhengHei"/>
+                <w:color w:val="20242C"/>
+                <w:sz w:val="18"/>
+              </w:rPr>
+              <w:t>三星 3 枚；四星 4 枚</w:t>
+            </w:r>
+          </w:p>
+        </w:tc>
+      </w:tr>
+      <w:tr>
+        <w:tc>
+          <w:tcPr>
+            <w:tcW w:type="dxa" w:w="2016"/>
+            <w:vAlign w:val="center"/>
+            <w:shd w:fill="F4F7FB"/>
+            <w:tcBorders>
+              <w:top w:val="single" w:sz="6" w:space="0" w:color="D9D9D9"/>
+              <w:left w:val="single" w:sz="6" w:space="0" w:color="D9D9D9"/>
+              <w:bottom w:val="single" w:sz="6" w:space="0" w:color="D9D9D9"/>
+              <w:right w:val="single" w:sz="6" w:space="0" w:color="D9D9D9"/>
+              <w:insideH w:val="single" w:sz="6" w:space="0" w:color="D9D9D9"/>
+              <w:insideV w:val="single" w:sz="6" w:space="0" w:color="D9D9D9"/>
+            </w:tcBorders>
+            <w:tcMar>
+              <w:top w:w="100" w:type="dxa"/>
+              <w:start w:w="120" w:type="dxa"/>
+              <w:bottom w:w="100" w:type="dxa"/>
+              <w:end w:w="120" w:type="dxa"/>
+            </w:tcMar>
+          </w:tcPr>
+          <w:p>
+            <w:pPr>
+              <w:spacing w:after="20" w:line="276" w:lineRule="auto"/>
+            </w:pPr>
+            <w:r/>
+            <w:r>
+              <w:rPr>
+                <w:rFonts w:ascii="Microsoft JhengHei" w:hAnsi="Microsoft JhengHei" w:eastAsia="Microsoft JhengHei"/>
+                <w:color w:val="20242C"/>
+                <w:sz w:val="18"/>
+              </w:rPr>
+              <w:t>鍛路熔殼王</w:t>
+            </w:r>
+          </w:p>
+        </w:tc>
+        <w:tc>
+          <w:tcPr>
+            <w:tcW w:type="dxa" w:w="1944"/>
+            <w:vAlign w:val="center"/>
+            <w:shd w:fill="F4F7FB"/>
+            <w:tcBorders>
+              <w:top w:val="single" w:sz="6" w:space="0" w:color="D9D9D9"/>
+              <w:left w:val="single" w:sz="6" w:space="0" w:color="D9D9D9"/>
+              <w:bottom w:val="single" w:sz="6" w:space="0" w:color="D9D9D9"/>
+              <w:right w:val="single" w:sz="6" w:space="0" w:color="D9D9D9"/>
+              <w:insideH w:val="single" w:sz="6" w:space="0" w:color="D9D9D9"/>
+              <w:insideV w:val="single" w:sz="6" w:space="0" w:color="D9D9D9"/>
+            </w:tcBorders>
+            <w:tcMar>
+              <w:top w:w="100" w:type="dxa"/>
+              <w:start w:w="120" w:type="dxa"/>
+              <w:bottom w:w="100" w:type="dxa"/>
+              <w:end w:w="120" w:type="dxa"/>
+            </w:tcMar>
+          </w:tcPr>
+          <w:p>
+            <w:pPr>
+              <w:spacing w:after="20" w:line="276" w:lineRule="auto"/>
+            </w:pPr>
+            <w:r/>
+            <w:r>
+              <w:rPr>
+                <w:rFonts w:ascii="Microsoft JhengHei" w:hAnsi="Microsoft JhengHei" w:eastAsia="Microsoft JhengHei"/>
+                <w:color w:val="20242C"/>
+                <w:sz w:val="18"/>
+              </w:rPr>
+              <w:t>熱管熔核</w:t>
+            </w:r>
+          </w:p>
+        </w:tc>
+        <w:tc>
+          <w:tcPr>
+            <w:tcW w:type="dxa" w:w="3528"/>
+            <w:vAlign w:val="center"/>
+            <w:shd w:fill="F4F7FB"/>
+            <w:tcBorders>
+              <w:top w:val="single" w:sz="6" w:space="0" w:color="D9D9D9"/>
+              <w:left w:val="single" w:sz="6" w:space="0" w:color="D9D9D9"/>
+              <w:bottom w:val="single" w:sz="6" w:space="0" w:color="D9D9D9"/>
+              <w:right w:val="single" w:sz="6" w:space="0" w:color="D9D9D9"/>
+              <w:insideH w:val="single" w:sz="6" w:space="0" w:color="D9D9D9"/>
+              <w:insideV w:val="single" w:sz="6" w:space="0" w:color="D9D9D9"/>
+            </w:tcBorders>
+            <w:tcMar>
+              <w:top w:w="100" w:type="dxa"/>
+              <w:start w:w="120" w:type="dxa"/>
+              <w:bottom w:w="100" w:type="dxa"/>
+              <w:end w:w="120" w:type="dxa"/>
+            </w:tcMar>
+          </w:tcPr>
+          <w:p>
+            <w:pPr>
+              <w:spacing w:after="20" w:line="276" w:lineRule="auto"/>
+            </w:pPr>
+            <w:r/>
+            <w:r>
+              <w:rPr>
+                <w:rFonts w:ascii="Microsoft JhengHei" w:hAnsi="Microsoft JhengHei" w:eastAsia="Microsoft JhengHei"/>
+                <w:color w:val="20242C"/>
+                <w:sz w:val="18"/>
+              </w:rPr>
+              <w:t>伊薩爾、赫洛、Magenta、曜澤、洛恩、凱嵐等</w:t>
+            </w:r>
+          </w:p>
+        </w:tc>
+        <w:tc>
+          <w:tcPr>
+            <w:tcW w:type="dxa" w:w="2016"/>
+            <w:vAlign w:val="center"/>
+            <w:shd w:fill="F4F7FB"/>
+            <w:tcBorders>
+              <w:top w:val="single" w:sz="6" w:space="0" w:color="D9D9D9"/>
+              <w:left w:val="single" w:sz="6" w:space="0" w:color="D9D9D9"/>
+              <w:bottom w:val="single" w:sz="6" w:space="0" w:color="D9D9D9"/>
+              <w:right w:val="single" w:sz="6" w:space="0" w:color="D9D9D9"/>
+              <w:insideH w:val="single" w:sz="6" w:space="0" w:color="D9D9D9"/>
+              <w:insideV w:val="single" w:sz="6" w:space="0" w:color="D9D9D9"/>
+            </w:tcBorders>
+            <w:tcMar>
+              <w:top w:w="100" w:type="dxa"/>
+              <w:start w:w="120" w:type="dxa"/>
+              <w:bottom w:w="100" w:type="dxa"/>
+              <w:end w:w="120" w:type="dxa"/>
+            </w:tcMar>
+          </w:tcPr>
+          <w:p>
+            <w:pPr>
+              <w:spacing w:after="20" w:line="276" w:lineRule="auto"/>
+            </w:pPr>
+            <w:r/>
+            <w:r>
+              <w:rPr>
+                <w:rFonts w:ascii="Microsoft JhengHei" w:hAnsi="Microsoft JhengHei" w:eastAsia="Microsoft JhengHei"/>
+                <w:color w:val="20242C"/>
+                <w:sz w:val="18"/>
+              </w:rPr>
+              <w:t>三星 3 枚；四星 4 枚</w:t>
+            </w:r>
+          </w:p>
+        </w:tc>
+      </w:tr>
+      <w:tr>
+        <w:tc>
+          <w:tcPr>
+            <w:tcW w:type="dxa" w:w="2016"/>
+            <w:vAlign w:val="center"/>
+            <w:shd w:fill="FFFFFF"/>
+            <w:tcBorders>
+              <w:top w:val="single" w:sz="6" w:space="0" w:color="D9D9D9"/>
+              <w:left w:val="single" w:sz="6" w:space="0" w:color="D9D9D9"/>
+              <w:bottom w:val="single" w:sz="6" w:space="0" w:color="D9D9D9"/>
+              <w:right w:val="single" w:sz="6" w:space="0" w:color="D9D9D9"/>
+              <w:insideH w:val="single" w:sz="6" w:space="0" w:color="D9D9D9"/>
+              <w:insideV w:val="single" w:sz="6" w:space="0" w:color="D9D9D9"/>
+            </w:tcBorders>
+            <w:tcMar>
+              <w:top w:w="100" w:type="dxa"/>
+              <w:start w:w="120" w:type="dxa"/>
+              <w:bottom w:w="100" w:type="dxa"/>
+              <w:end w:w="120" w:type="dxa"/>
+            </w:tcMar>
+          </w:tcPr>
+          <w:p>
+            <w:pPr>
+              <w:spacing w:after="20" w:line="276" w:lineRule="auto"/>
+            </w:pPr>
+            <w:r/>
+            <w:r>
+              <w:rPr>
+                <w:rFonts w:ascii="Microsoft JhengHei" w:hAnsi="Microsoft JhengHei" w:eastAsia="Microsoft JhengHei"/>
+                <w:color w:val="20242C"/>
+                <w:sz w:val="18"/>
+              </w:rPr>
+              <w:t>風廊獵王</w:t>
+            </w:r>
+          </w:p>
+        </w:tc>
+        <w:tc>
+          <w:tcPr>
+            <w:tcW w:type="dxa" w:w="1944"/>
+            <w:vAlign w:val="center"/>
+            <w:shd w:fill="FFFFFF"/>
+            <w:tcBorders>
+              <w:top w:val="single" w:sz="6" w:space="0" w:color="D9D9D9"/>
+              <w:left w:val="single" w:sz="6" w:space="0" w:color="D9D9D9"/>
+              <w:bottom w:val="single" w:sz="6" w:space="0" w:color="D9D9D9"/>
+              <w:right w:val="single" w:sz="6" w:space="0" w:color="D9D9D9"/>
+              <w:insideH w:val="single" w:sz="6" w:space="0" w:color="D9D9D9"/>
+              <w:insideV w:val="single" w:sz="6" w:space="0" w:color="D9D9D9"/>
+            </w:tcBorders>
+            <w:tcMar>
+              <w:top w:w="100" w:type="dxa"/>
+              <w:start w:w="120" w:type="dxa"/>
+              <w:bottom w:w="100" w:type="dxa"/>
+              <w:end w:w="120" w:type="dxa"/>
+            </w:tcMar>
+          </w:tcPr>
+          <w:p>
+            <w:pPr>
+              <w:spacing w:after="20" w:line="276" w:lineRule="auto"/>
+            </w:pPr>
+            <w:r/>
+            <w:r>
+              <w:rPr>
+                <w:rFonts w:ascii="Microsoft JhengHei" w:hAnsi="Microsoft JhengHei" w:eastAsia="Microsoft JhengHei"/>
+                <w:color w:val="20242C"/>
+                <w:sz w:val="18"/>
+              </w:rPr>
+              <w:t>風標獵核</w:t>
+            </w:r>
+          </w:p>
+        </w:tc>
+        <w:tc>
+          <w:tcPr>
+            <w:tcW w:type="dxa" w:w="3528"/>
+            <w:vAlign w:val="center"/>
+            <w:shd w:fill="FFFFFF"/>
+            <w:tcBorders>
+              <w:top w:val="single" w:sz="6" w:space="0" w:color="D9D9D9"/>
+              <w:left w:val="single" w:sz="6" w:space="0" w:color="D9D9D9"/>
+              <w:bottom w:val="single" w:sz="6" w:space="0" w:color="D9D9D9"/>
+              <w:right w:val="single" w:sz="6" w:space="0" w:color="D9D9D9"/>
+              <w:insideH w:val="single" w:sz="6" w:space="0" w:color="D9D9D9"/>
+              <w:insideV w:val="single" w:sz="6" w:space="0" w:color="D9D9D9"/>
+            </w:tcBorders>
+            <w:tcMar>
+              <w:top w:w="100" w:type="dxa"/>
+              <w:start w:w="120" w:type="dxa"/>
+              <w:bottom w:w="100" w:type="dxa"/>
+              <w:end w:w="120" w:type="dxa"/>
+            </w:tcMar>
+          </w:tcPr>
+          <w:p>
+            <w:pPr>
+              <w:spacing w:after="20" w:line="276" w:lineRule="auto"/>
+            </w:pPr>
+            <w:r/>
+            <w:r>
+              <w:rPr>
+                <w:rFonts w:ascii="Microsoft JhengHei" w:hAnsi="Microsoft JhengHei" w:eastAsia="Microsoft JhengHei"/>
+                <w:color w:val="20242C"/>
+                <w:sz w:val="18"/>
+              </w:rPr>
+              <w:t>Hina、菲芮、諾嵐、索萊</w:t>
+            </w:r>
+          </w:p>
+        </w:tc>
+        <w:tc>
+          <w:tcPr>
+            <w:tcW w:type="dxa" w:w="2016"/>
+            <w:vAlign w:val="center"/>
+            <w:shd w:fill="FFFFFF"/>
+            <w:tcBorders>
+              <w:top w:val="single" w:sz="6" w:space="0" w:color="D9D9D9"/>
+              <w:left w:val="single" w:sz="6" w:space="0" w:color="D9D9D9"/>
+              <w:bottom w:val="single" w:sz="6" w:space="0" w:color="D9D9D9"/>
+              <w:right w:val="single" w:sz="6" w:space="0" w:color="D9D9D9"/>
+              <w:insideH w:val="single" w:sz="6" w:space="0" w:color="D9D9D9"/>
+              <w:insideV w:val="single" w:sz="6" w:space="0" w:color="D9D9D9"/>
+            </w:tcBorders>
+            <w:tcMar>
+              <w:top w:w="100" w:type="dxa"/>
+              <w:start w:w="120" w:type="dxa"/>
+              <w:bottom w:w="100" w:type="dxa"/>
+              <w:end w:w="120" w:type="dxa"/>
+            </w:tcMar>
+          </w:tcPr>
+          <w:p>
+            <w:pPr>
+              <w:spacing w:after="20" w:line="276" w:lineRule="auto"/>
+            </w:pPr>
+            <w:r/>
+            <w:r>
+              <w:rPr>
+                <w:rFonts w:ascii="Microsoft JhengHei" w:hAnsi="Microsoft JhengHei" w:eastAsia="Microsoft JhengHei"/>
+                <w:color w:val="20242C"/>
+                <w:sz w:val="18"/>
+              </w:rPr>
+              <w:t>三星 3 枚；四星 4 枚</w:t>
+            </w:r>
+          </w:p>
+        </w:tc>
+      </w:tr>
+      <w:tr>
+        <w:tc>
+          <w:tcPr>
+            <w:tcW w:type="dxa" w:w="2016"/>
+            <w:vAlign w:val="center"/>
+            <w:shd w:fill="F4F7FB"/>
+            <w:tcBorders>
+              <w:top w:val="single" w:sz="6" w:space="0" w:color="D9D9D9"/>
+              <w:left w:val="single" w:sz="6" w:space="0" w:color="D9D9D9"/>
+              <w:bottom w:val="single" w:sz="6" w:space="0" w:color="D9D9D9"/>
+              <w:right w:val="single" w:sz="6" w:space="0" w:color="D9D9D9"/>
+              <w:insideH w:val="single" w:sz="6" w:space="0" w:color="D9D9D9"/>
+              <w:insideV w:val="single" w:sz="6" w:space="0" w:color="D9D9D9"/>
+            </w:tcBorders>
+            <w:tcMar>
+              <w:top w:w="100" w:type="dxa"/>
+              <w:start w:w="120" w:type="dxa"/>
+              <w:bottom w:w="100" w:type="dxa"/>
+              <w:end w:w="120" w:type="dxa"/>
+            </w:tcMar>
+          </w:tcPr>
+          <w:p>
+            <w:pPr>
+              <w:spacing w:after="20" w:line="276" w:lineRule="auto"/>
+            </w:pPr>
+            <w:r/>
+            <w:r>
+              <w:rPr>
+                <w:rFonts w:ascii="Microsoft JhengHei" w:hAnsi="Microsoft JhengHei" w:eastAsia="Microsoft JhengHei"/>
+                <w:color w:val="20242C"/>
+                <w:sz w:val="18"/>
+              </w:rPr>
+              <w:t>霧鏡裁定核</w:t>
+            </w:r>
+          </w:p>
+        </w:tc>
+        <w:tc>
+          <w:tcPr>
+            <w:tcW w:type="dxa" w:w="1944"/>
+            <w:vAlign w:val="center"/>
+            <w:shd w:fill="F4F7FB"/>
+            <w:tcBorders>
+              <w:top w:val="single" w:sz="6" w:space="0" w:color="D9D9D9"/>
+              <w:left w:val="single" w:sz="6" w:space="0" w:color="D9D9D9"/>
+              <w:bottom w:val="single" w:sz="6" w:space="0" w:color="D9D9D9"/>
+              <w:right w:val="single" w:sz="6" w:space="0" w:color="D9D9D9"/>
+              <w:insideH w:val="single" w:sz="6" w:space="0" w:color="D9D9D9"/>
+              <w:insideV w:val="single" w:sz="6" w:space="0" w:color="D9D9D9"/>
+            </w:tcBorders>
+            <w:tcMar>
+              <w:top w:w="100" w:type="dxa"/>
+              <w:start w:w="120" w:type="dxa"/>
+              <w:bottom w:w="100" w:type="dxa"/>
+              <w:end w:w="120" w:type="dxa"/>
+            </w:tcMar>
+          </w:tcPr>
+          <w:p>
+            <w:pPr>
+              <w:spacing w:after="20" w:line="276" w:lineRule="auto"/>
+            </w:pPr>
+            <w:r/>
+            <w:r>
+              <w:rPr>
+                <w:rFonts w:ascii="Microsoft JhengHei" w:hAnsi="Microsoft JhengHei" w:eastAsia="Microsoft JhengHei"/>
+                <w:color w:val="20242C"/>
+                <w:sz w:val="18"/>
+              </w:rPr>
+              <w:t>霧鏡映核</w:t>
+            </w:r>
+          </w:p>
+        </w:tc>
+        <w:tc>
+          <w:tcPr>
+            <w:tcW w:type="dxa" w:w="3528"/>
+            <w:vAlign w:val="center"/>
+            <w:shd w:fill="F4F7FB"/>
+            <w:tcBorders>
+              <w:top w:val="single" w:sz="6" w:space="0" w:color="D9D9D9"/>
+              <w:left w:val="single" w:sz="6" w:space="0" w:color="D9D9D9"/>
+              <w:bottom w:val="single" w:sz="6" w:space="0" w:color="D9D9D9"/>
+              <w:right w:val="single" w:sz="6" w:space="0" w:color="D9D9D9"/>
+              <w:insideH w:val="single" w:sz="6" w:space="0" w:color="D9D9D9"/>
+              <w:insideV w:val="single" w:sz="6" w:space="0" w:color="D9D9D9"/>
+            </w:tcBorders>
+            <w:tcMar>
+              <w:top w:w="100" w:type="dxa"/>
+              <w:start w:w="120" w:type="dxa"/>
+              <w:bottom w:w="100" w:type="dxa"/>
+              <w:end w:w="120" w:type="dxa"/>
+            </w:tcMar>
+          </w:tcPr>
+          <w:p>
+            <w:pPr>
+              <w:spacing w:after="20" w:line="276" w:lineRule="auto"/>
+            </w:pPr>
+            <w:r/>
+            <w:r>
+              <w:rPr>
+                <w:rFonts w:ascii="Microsoft JhengHei" w:hAnsi="Microsoft JhengHei" w:eastAsia="Microsoft JhengHei"/>
+                <w:color w:val="20242C"/>
+                <w:sz w:val="18"/>
+              </w:rPr>
+              <w:t>薇珂、梅芙、伊芙琳、霽羅、蘿堤亞、涅芙</w:t>
+            </w:r>
+          </w:p>
+        </w:tc>
+        <w:tc>
+          <w:tcPr>
+            <w:tcW w:type="dxa" w:w="2016"/>
+            <w:vAlign w:val="center"/>
+            <w:shd w:fill="F4F7FB"/>
+            <w:tcBorders>
+              <w:top w:val="single" w:sz="6" w:space="0" w:color="D9D9D9"/>
+              <w:left w:val="single" w:sz="6" w:space="0" w:color="D9D9D9"/>
+              <w:bottom w:val="single" w:sz="6" w:space="0" w:color="D9D9D9"/>
+              <w:right w:val="single" w:sz="6" w:space="0" w:color="D9D9D9"/>
+              <w:insideH w:val="single" w:sz="6" w:space="0" w:color="D9D9D9"/>
+              <w:insideV w:val="single" w:sz="6" w:space="0" w:color="D9D9D9"/>
+            </w:tcBorders>
+            <w:tcMar>
+              <w:top w:w="100" w:type="dxa"/>
+              <w:start w:w="120" w:type="dxa"/>
+              <w:bottom w:w="100" w:type="dxa"/>
+              <w:end w:w="120" w:type="dxa"/>
+            </w:tcMar>
+          </w:tcPr>
+          <w:p>
+            <w:pPr>
+              <w:spacing w:after="20" w:line="276" w:lineRule="auto"/>
+            </w:pPr>
+            <w:r/>
+            <w:r>
+              <w:rPr>
+                <w:rFonts w:ascii="Microsoft JhengHei" w:hAnsi="Microsoft JhengHei" w:eastAsia="Microsoft JhengHei"/>
+                <w:color w:val="20242C"/>
+                <w:sz w:val="18"/>
+              </w:rPr>
+              <w:t>三星 3 枚；四星 4 枚</w:t>
+            </w:r>
+          </w:p>
+        </w:tc>
+      </w:tr>
+    </w:tbl>
+    <w:p>
+      <w:pPr>
+        <w:spacing w:after="20"/>
+      </w:pPr>
+    </w:p>
+    <w:p>
+      <w:pPr>
+        <w:pStyle w:val="ListBullet"/>
+        <w:spacing w:after="60" w:line="288" w:lineRule="auto"/>
+      </w:pPr>
+      <w:r>
+        <w:rPr>
+          <w:rFonts w:ascii="Microsoft JhengHei" w:hAnsi="Microsoft JhengHei" w:eastAsia="Microsoft JhengHei"/>
+          <w:color w:val="20242C"/>
+          <w:sz w:val="20"/>
+        </w:rPr>
+        <w:t>每個 Boss 每版本最多成功領取 10 次獎勵；勝利取得 1 枚對應突破材料與 360 角色經驗，失敗不扣成功獎勵次數。</w:t>
+      </w:r>
+    </w:p>
+    <w:p>
+      <w:pPr>
+        <w:pStyle w:val="ListBullet"/>
+        <w:spacing w:after="60" w:line="288" w:lineRule="auto"/>
+      </w:pPr>
+      <w:r>
+        <w:rPr>
+          <w:rFonts w:ascii="Microsoft JhengHei" w:hAnsi="Microsoft JhengHei" w:eastAsia="Microsoft JhengHei"/>
+          <w:color w:val="20242C"/>
+          <w:sz w:val="20"/>
+        </w:rPr>
+        <w:t>Boss 的版本挑戰紀錄、編隊與上次戰報會在版本更新時重置；突破材料、角色等級和突破狀態保留在玩家帳號。</w:t>
+      </w:r>
+    </w:p>
+    <w:p>
+      <w:pPr>
+        <w:pStyle w:val="ListBullet"/>
+        <w:spacing w:after="60" w:line="288" w:lineRule="auto"/>
+      </w:pPr>
+      <w:r>
+        <w:rPr>
+          <w:rFonts w:ascii="Microsoft JhengHei" w:hAnsi="Microsoft JhengHei" w:eastAsia="Microsoft JhengHei"/>
+          <w:color w:val="20242C"/>
+          <w:sz w:val="20"/>
+        </w:rPr>
+        <w:t>Boss 戰同樣採自走棋式自動戰鬥，推薦戰力只作參考；角色技能、元素、速度與隊伍協同會影響勝負。</w:t>
+      </w:r>
+    </w:p>
+    <w:p>
+      <w:r>
+        <w:br w:type="page"/>
+      </w:r>
+    </w:p>
+    <w:p>
+      <w:pPr>
+        <w:pStyle w:val="Heading1"/>
+        <w:keepNext/>
+        <w:spacing w:before="240" w:after="100"/>
+      </w:pPr>
+      <w:r>
+        <w:rPr>
+          <w:rFonts w:ascii="Microsoft JhengHei" w:hAnsi="Microsoft JhengHei" w:eastAsia="Microsoft JhengHei"/>
+          <w:b/>
+          <w:color w:val="000000"/>
+          <w:sz w:val="36"/>
+        </w:rPr>
         <w:t>星港委託</w:t>
       </w:r>
     </w:p>
@@ -6770,7 +8046,7 @@
                 <w:color w:val="20242C"/>
                 <w:sz w:val="18"/>
               </w:rPr>
-              <w:t>180 星砂、220 角色經驗、4 回響粉</w:t>
+              <w:t>180 星砂、1,200 角色經驗、4 回響粉</w:t>
             </w:r>
           </w:p>
         </w:tc>
@@ -6877,7 +8153,7 @@
                 <w:color w:val="20242C"/>
                 <w:sz w:val="18"/>
               </w:rPr>
-              <w:t>220 星砂、260 角色經驗、1 共鳴券</w:t>
+              <w:t>380 星砂、1,500 角色經驗</w:t>
             </w:r>
           </w:p>
         </w:tc>
@@ -6984,7 +8260,7 @@
                 <w:color w:val="20242C"/>
                 <w:sz w:val="18"/>
               </w:rPr>
-              <w:t>260 星砂、300 角色經驗、1 星痕</w:t>
+              <w:t>260 星砂、1,800 角色經驗、1 星痕</w:t>
             </w:r>
           </w:p>
         </w:tc>

</xml_diff>

<commit_message>
sync latest game rules and rewards
</commit_message>
<xml_diff>
--- a/星界之律遊戲設定總覽.docx
+++ b/星界之律遊戲設定總覽.docx
@@ -43,7 +43,7 @@
           <w:color w:val="20242C"/>
           <w:sz w:val="21"/>
         </w:rPr>
-        <w:t>本文件是目前遊戲程式的單一規則總覽，供製作、測試、部署與後續版本維護使用。現行玩家內容開放至 2.5；3.0–4.5 的內容已整理完成但維持鎖定。任何數值或開放狀態調整，都應同步檢查 src/data.js、玩家介面與測試。</w:t>
+        <w:t>本文件是目前遊戲程式的單一規則總覽，供製作、測試、部署與後續版本維護使用。現行玩家內容開放至 2.5；3.0–4.5 的內容已整理完成但維持鎖定。除抽卡、劇情、角色培養與戰鬥外，星海迷航和星伴培育也已納入同一套帳號保存規則。任何數值或開放狀態調整，都應同步檢查 src/data.js、玩家介面與測試。</w:t>
       </w:r>
     </w:p>
     <w:p>
@@ -682,7 +682,7 @@
                 <w:color w:val="20242C"/>
                 <w:sz w:val="18"/>
               </w:rPr>
-              <w:t>6 種 Boss；角色 80 等後取得指定材料，突破至 90 等</w:t>
+              <w:t>6 種素材 Boss 分成 Lv.1–3 三檔；Lv.3 給更豐富獎勵，通用印記避免卡關</w:t>
             </w:r>
           </w:p>
         </w:tc>
@@ -790,6 +790,220 @@
                 <w:sz w:val="18"/>
               </w:rPr>
               <w:t>3 份短篇戰鬥任務，每版本各完成一次</w:t>
+            </w:r>
+          </w:p>
+        </w:tc>
+        <w:tc>
+          <w:tcPr>
+            <w:tcW w:type="dxa" w:w="1584"/>
+            <w:vAlign w:val="center"/>
+            <w:shd w:fill="F4F7FB"/>
+            <w:tcBorders>
+              <w:top w:val="single" w:sz="6" w:space="0" w:color="D9D9D9"/>
+              <w:left w:val="single" w:sz="6" w:space="0" w:color="D9D9D9"/>
+              <w:bottom w:val="single" w:sz="6" w:space="0" w:color="D9D9D9"/>
+              <w:right w:val="single" w:sz="6" w:space="0" w:color="D9D9D9"/>
+              <w:insideH w:val="single" w:sz="6" w:space="0" w:color="D9D9D9"/>
+              <w:insideV w:val="single" w:sz="6" w:space="0" w:color="D9D9D9"/>
+            </w:tcBorders>
+            <w:tcMar>
+              <w:top w:w="100" w:type="dxa"/>
+              <w:start w:w="120" w:type="dxa"/>
+              <w:bottom w:w="100" w:type="dxa"/>
+              <w:end w:w="120" w:type="dxa"/>
+            </w:tcMar>
+          </w:tcPr>
+          <w:p>
+            <w:pPr>
+              <w:spacing w:after="20" w:line="276" w:lineRule="auto"/>
+            </w:pPr>
+            <w:r/>
+            <w:r>
+              <w:rPr>
+                <w:rFonts w:ascii="Microsoft JhengHei" w:hAnsi="Microsoft JhengHei" w:eastAsia="Microsoft JhengHei"/>
+                <w:color w:val="20242C"/>
+                <w:sz w:val="18"/>
+              </w:rPr>
+              <w:t>新增玩法</w:t>
+            </w:r>
+          </w:p>
+        </w:tc>
+      </w:tr>
+      <w:tr>
+        <w:tc>
+          <w:tcPr>
+            <w:tcW w:type="dxa" w:w="1944"/>
+            <w:vAlign w:val="center"/>
+            <w:shd w:fill="FFFFFF"/>
+            <w:tcBorders>
+              <w:top w:val="single" w:sz="6" w:space="0" w:color="D9D9D9"/>
+              <w:left w:val="single" w:sz="6" w:space="0" w:color="D9D9D9"/>
+              <w:bottom w:val="single" w:sz="6" w:space="0" w:color="D9D9D9"/>
+              <w:right w:val="single" w:sz="6" w:space="0" w:color="D9D9D9"/>
+              <w:insideH w:val="single" w:sz="6" w:space="0" w:color="D9D9D9"/>
+              <w:insideV w:val="single" w:sz="6" w:space="0" w:color="D9D9D9"/>
+            </w:tcBorders>
+            <w:tcMar>
+              <w:top w:w="100" w:type="dxa"/>
+              <w:start w:w="120" w:type="dxa"/>
+              <w:bottom w:w="100" w:type="dxa"/>
+              <w:end w:w="120" w:type="dxa"/>
+            </w:tcMar>
+          </w:tcPr>
+          <w:p>
+            <w:pPr>
+              <w:spacing w:after="20" w:line="276" w:lineRule="auto"/>
+            </w:pPr>
+            <w:r/>
+            <w:r>
+              <w:rPr>
+                <w:rFonts w:ascii="Microsoft JhengHei" w:hAnsi="Microsoft JhengHei" w:eastAsia="Microsoft JhengHei"/>
+                <w:color w:val="20242C"/>
+                <w:sz w:val="18"/>
+              </w:rPr>
+              <w:t>星海迷航</w:t>
+            </w:r>
+          </w:p>
+        </w:tc>
+        <w:tc>
+          <w:tcPr>
+            <w:tcW w:type="dxa" w:w="5976"/>
+            <w:vAlign w:val="center"/>
+            <w:shd w:fill="FFFFFF"/>
+            <w:tcBorders>
+              <w:top w:val="single" w:sz="6" w:space="0" w:color="D9D9D9"/>
+              <w:left w:val="single" w:sz="6" w:space="0" w:color="D9D9D9"/>
+              <w:bottom w:val="single" w:sz="6" w:space="0" w:color="D9D9D9"/>
+              <w:right w:val="single" w:sz="6" w:space="0" w:color="D9D9D9"/>
+              <w:insideH w:val="single" w:sz="6" w:space="0" w:color="D9D9D9"/>
+              <w:insideV w:val="single" w:sz="6" w:space="0" w:color="D9D9D9"/>
+            </w:tcBorders>
+            <w:tcMar>
+              <w:top w:w="100" w:type="dxa"/>
+              <w:start w:w="120" w:type="dxa"/>
+              <w:bottom w:w="100" w:type="dxa"/>
+              <w:end w:w="120" w:type="dxa"/>
+            </w:tcMar>
+          </w:tcPr>
+          <w:p>
+            <w:pPr>
+              <w:spacing w:after="20" w:line="276" w:lineRule="auto"/>
+            </w:pPr>
+            <w:r/>
+            <w:r>
+              <w:rPr>
+                <w:rFonts w:ascii="Microsoft JhengHei" w:hAnsi="Microsoft JhengHei" w:eastAsia="Microsoft JhengHei"/>
+                <w:color w:val="20242C"/>
+                <w:sz w:val="18"/>
+              </w:rPr>
+              <w:t>3 條航線、事件選擇、普通／隱藏／特殊結局與季裝</w:t>
+            </w:r>
+          </w:p>
+        </w:tc>
+        <w:tc>
+          <w:tcPr>
+            <w:tcW w:type="dxa" w:w="1584"/>
+            <w:vAlign w:val="center"/>
+            <w:shd w:fill="FFFFFF"/>
+            <w:tcBorders>
+              <w:top w:val="single" w:sz="6" w:space="0" w:color="D9D9D9"/>
+              <w:left w:val="single" w:sz="6" w:space="0" w:color="D9D9D9"/>
+              <w:bottom w:val="single" w:sz="6" w:space="0" w:color="D9D9D9"/>
+              <w:right w:val="single" w:sz="6" w:space="0" w:color="D9D9D9"/>
+              <w:insideH w:val="single" w:sz="6" w:space="0" w:color="D9D9D9"/>
+              <w:insideV w:val="single" w:sz="6" w:space="0" w:color="D9D9D9"/>
+            </w:tcBorders>
+            <w:tcMar>
+              <w:top w:w="100" w:type="dxa"/>
+              <w:start w:w="120" w:type="dxa"/>
+              <w:bottom w:w="100" w:type="dxa"/>
+              <w:end w:w="120" w:type="dxa"/>
+            </w:tcMar>
+          </w:tcPr>
+          <w:p>
+            <w:pPr>
+              <w:spacing w:after="20" w:line="276" w:lineRule="auto"/>
+            </w:pPr>
+            <w:r/>
+            <w:r>
+              <w:rPr>
+                <w:rFonts w:ascii="Microsoft JhengHei" w:hAnsi="Microsoft JhengHei" w:eastAsia="Microsoft JhengHei"/>
+                <w:color w:val="20242C"/>
+                <w:sz w:val="18"/>
+              </w:rPr>
+              <w:t>新增玩法</w:t>
+            </w:r>
+          </w:p>
+        </w:tc>
+      </w:tr>
+      <w:tr>
+        <w:tc>
+          <w:tcPr>
+            <w:tcW w:type="dxa" w:w="1944"/>
+            <w:vAlign w:val="center"/>
+            <w:shd w:fill="F4F7FB"/>
+            <w:tcBorders>
+              <w:top w:val="single" w:sz="6" w:space="0" w:color="D9D9D9"/>
+              <w:left w:val="single" w:sz="6" w:space="0" w:color="D9D9D9"/>
+              <w:bottom w:val="single" w:sz="6" w:space="0" w:color="D9D9D9"/>
+              <w:right w:val="single" w:sz="6" w:space="0" w:color="D9D9D9"/>
+              <w:insideH w:val="single" w:sz="6" w:space="0" w:color="D9D9D9"/>
+              <w:insideV w:val="single" w:sz="6" w:space="0" w:color="D9D9D9"/>
+            </w:tcBorders>
+            <w:tcMar>
+              <w:top w:w="100" w:type="dxa"/>
+              <w:start w:w="120" w:type="dxa"/>
+              <w:bottom w:w="100" w:type="dxa"/>
+              <w:end w:w="120" w:type="dxa"/>
+            </w:tcMar>
+          </w:tcPr>
+          <w:p>
+            <w:pPr>
+              <w:spacing w:after="20" w:line="276" w:lineRule="auto"/>
+            </w:pPr>
+            <w:r/>
+            <w:r>
+              <w:rPr>
+                <w:rFonts w:ascii="Microsoft JhengHei" w:hAnsi="Microsoft JhengHei" w:eastAsia="Microsoft JhengHei"/>
+                <w:color w:val="20242C"/>
+                <w:sz w:val="18"/>
+              </w:rPr>
+              <w:t>星伴培育</w:t>
+            </w:r>
+          </w:p>
+        </w:tc>
+        <w:tc>
+          <w:tcPr>
+            <w:tcW w:type="dxa" w:w="5976"/>
+            <w:vAlign w:val="center"/>
+            <w:shd w:fill="F4F7FB"/>
+            <w:tcBorders>
+              <w:top w:val="single" w:sz="6" w:space="0" w:color="D9D9D9"/>
+              <w:left w:val="single" w:sz="6" w:space="0" w:color="D9D9D9"/>
+              <w:bottom w:val="single" w:sz="6" w:space="0" w:color="D9D9D9"/>
+              <w:right w:val="single" w:sz="6" w:space="0" w:color="D9D9D9"/>
+              <w:insideH w:val="single" w:sz="6" w:space="0" w:color="D9D9D9"/>
+              <w:insideV w:val="single" w:sz="6" w:space="0" w:color="D9D9D9"/>
+            </w:tcBorders>
+            <w:tcMar>
+              <w:top w:w="100" w:type="dxa"/>
+              <w:start w:w="120" w:type="dxa"/>
+              <w:bottom w:w="100" w:type="dxa"/>
+              <w:end w:w="120" w:type="dxa"/>
+            </w:tcMar>
+          </w:tcPr>
+          <w:p>
+            <w:pPr>
+              <w:spacing w:after="20" w:line="276" w:lineRule="auto"/>
+            </w:pPr>
+            <w:r/>
+            <w:r>
+              <w:rPr>
+                <w:rFonts w:ascii="Microsoft JhengHei" w:hAnsi="Microsoft JhengHei" w:eastAsia="Microsoft JhengHei"/>
+                <w:color w:val="20242C"/>
+                <w:sz w:val="18"/>
+              </w:rPr>
+              <w:t>寵物等級、裝扮、特效、公開展示與玩家評分</w:t>
             </w:r>
           </w:p>
         </w:tc>
@@ -3154,7 +3368,7 @@
                 <w:color w:val="20242C"/>
                 <w:sz w:val="18"/>
               </w:rPr>
-              <w:t>指定 Boss 勝利</w:t>
+              <w:t>Boss 各等級勝利</w:t>
             </w:r>
           </w:p>
         </w:tc>
@@ -3189,7 +3403,7 @@
                 <w:color w:val="20242C"/>
                 <w:sz w:val="18"/>
               </w:rPr>
-              <w:t>依角色指定 Boss 取得；80 等突破後升到 90 等</w:t>
+              <w:t>指定材料或星界通用突破印記；80 等突破後升到 90 等</w:t>
             </w:r>
           </w:p>
         </w:tc>
@@ -3301,11 +3515,793 @@
           </w:p>
         </w:tc>
       </w:tr>
+      <w:tr>
+        <w:tc>
+          <w:tcPr>
+            <w:tcW w:type="dxa" w:w="2160"/>
+            <w:vAlign w:val="center"/>
+            <w:shd w:fill="FFFFFF"/>
+            <w:tcBorders>
+              <w:top w:val="single" w:sz="6" w:space="0" w:color="D9D9D9"/>
+              <w:left w:val="single" w:sz="6" w:space="0" w:color="D9D9D9"/>
+              <w:bottom w:val="single" w:sz="6" w:space="0" w:color="D9D9D9"/>
+              <w:right w:val="single" w:sz="6" w:space="0" w:color="D9D9D9"/>
+              <w:insideH w:val="single" w:sz="6" w:space="0" w:color="D9D9D9"/>
+              <w:insideV w:val="single" w:sz="6" w:space="0" w:color="D9D9D9"/>
+            </w:tcBorders>
+            <w:tcMar>
+              <w:top w:w="100" w:type="dxa"/>
+              <w:start w:w="120" w:type="dxa"/>
+              <w:bottom w:w="100" w:type="dxa"/>
+              <w:end w:w="120" w:type="dxa"/>
+            </w:tcMar>
+          </w:tcPr>
+          <w:p>
+            <w:pPr>
+              <w:spacing w:after="20" w:line="276" w:lineRule="auto"/>
+            </w:pPr>
+            <w:r/>
+            <w:r>
+              <w:rPr>
+                <w:rFonts w:ascii="Microsoft JhengHei" w:hAnsi="Microsoft JhengHei" w:eastAsia="Microsoft JhengHei"/>
+                <w:color w:val="20242C"/>
+                <w:sz w:val="18"/>
+              </w:rPr>
+              <w:t>寵物資源</w:t>
+            </w:r>
+          </w:p>
+        </w:tc>
+        <w:tc>
+          <w:tcPr>
+            <w:tcW w:type="dxa" w:w="4320"/>
+            <w:vAlign w:val="center"/>
+            <w:shd w:fill="FFFFFF"/>
+            <w:tcBorders>
+              <w:top w:val="single" w:sz="6" w:space="0" w:color="D9D9D9"/>
+              <w:left w:val="single" w:sz="6" w:space="0" w:color="D9D9D9"/>
+              <w:bottom w:val="single" w:sz="6" w:space="0" w:color="D9D9D9"/>
+              <w:right w:val="single" w:sz="6" w:space="0" w:color="D9D9D9"/>
+              <w:insideH w:val="single" w:sz="6" w:space="0" w:color="D9D9D9"/>
+              <w:insideV w:val="single" w:sz="6" w:space="0" w:color="D9D9D9"/>
+            </w:tcBorders>
+            <w:tcMar>
+              <w:top w:w="100" w:type="dxa"/>
+              <w:start w:w="120" w:type="dxa"/>
+              <w:bottom w:w="100" w:type="dxa"/>
+              <w:end w:w="120" w:type="dxa"/>
+            </w:tcMar>
+          </w:tcPr>
+          <w:p>
+            <w:pPr>
+              <w:spacing w:after="20" w:line="276" w:lineRule="auto"/>
+            </w:pPr>
+            <w:r/>
+            <w:r>
+              <w:rPr>
+                <w:rFonts w:ascii="Microsoft JhengHei" w:hAnsi="Microsoft JhengHei" w:eastAsia="Microsoft JhengHei"/>
+                <w:color w:val="20242C"/>
+                <w:sz w:val="18"/>
+              </w:rPr>
+              <w:t>星伴探索、培育、玩家展示評分</w:t>
+            </w:r>
+          </w:p>
+        </w:tc>
+        <w:tc>
+          <w:tcPr>
+            <w:tcW w:type="dxa" w:w="3024"/>
+            <w:vAlign w:val="center"/>
+            <w:shd w:fill="FFFFFF"/>
+            <w:tcBorders>
+              <w:top w:val="single" w:sz="6" w:space="0" w:color="D9D9D9"/>
+              <w:left w:val="single" w:sz="6" w:space="0" w:color="D9D9D9"/>
+              <w:bottom w:val="single" w:sz="6" w:space="0" w:color="D9D9D9"/>
+              <w:right w:val="single" w:sz="6" w:space="0" w:color="D9D9D9"/>
+              <w:insideH w:val="single" w:sz="6" w:space="0" w:color="D9D9D9"/>
+              <w:insideV w:val="single" w:sz="6" w:space="0" w:color="D9D9D9"/>
+            </w:tcBorders>
+            <w:tcMar>
+              <w:top w:w="100" w:type="dxa"/>
+              <w:start w:w="120" w:type="dxa"/>
+              <w:bottom w:w="100" w:type="dxa"/>
+              <w:end w:w="120" w:type="dxa"/>
+            </w:tcMar>
+          </w:tcPr>
+          <w:p>
+            <w:pPr>
+              <w:spacing w:after="20" w:line="276" w:lineRule="auto"/>
+            </w:pPr>
+            <w:r/>
+            <w:r>
+              <w:rPr>
+                <w:rFonts w:ascii="Microsoft JhengHei" w:hAnsi="Microsoft JhengHei" w:eastAsia="Microsoft JhengHei"/>
+                <w:color w:val="20242C"/>
+                <w:sz w:val="18"/>
+              </w:rPr>
+              <w:t>只用於寵物等級、裝扮與公開展示</w:t>
+            </w:r>
+          </w:p>
+        </w:tc>
+      </w:tr>
     </w:tbl>
     <w:p>
       <w:pPr>
         <w:spacing w:after="20"/>
       </w:pPr>
+    </w:p>
+    <w:p>
+      <w:pPr>
+        <w:pStyle w:val="Heading2"/>
+        <w:keepNext/>
+        <w:spacing w:before="160" w:after="100"/>
+      </w:pPr>
+      <w:r>
+        <w:rPr>
+          <w:rFonts w:ascii="Microsoft JhengHei" w:hAnsi="Microsoft JhengHei" w:eastAsia="Microsoft JhengHei"/>
+          <w:b/>
+          <w:color w:val="000000"/>
+          <w:sz w:val="26"/>
+        </w:rPr>
+        <w:t>養成經濟檢查</w:t>
+      </w:r>
+    </w:p>
+    <w:p>
+      <w:pPr>
+        <w:spacing w:after="100" w:line="312" w:lineRule="auto"/>
+      </w:pPr>
+      <w:r>
+        <w:rPr>
+          <w:rFonts w:ascii="Microsoft JhengHei" w:hAnsi="Microsoft JhengHei" w:eastAsia="Microsoft JhengHei"/>
+          <w:b w:val="0"/>
+          <w:color w:val="20242C"/>
+          <w:sz w:val="21"/>
+        </w:rPr>
+        <w:t>這次調整前先用現行規則跑完整資源盤點，並把劇情的一次性獎勵與試煉／Boss 每版本最多 10 次的可重複獎勵分開計算。角色經驗成本不靠角色面板膨脹來解決，而是讓玩家有穩定、可預期的遊玩來源。</w:t>
+      </w:r>
+    </w:p>
+    <w:tbl>
+      <w:tblPr>
+        <w:tblW w:type="auto" w:w="0"/>
+        <w:jc w:val="center"/>
+        <w:tblLayout w:type="fixed"/>
+        <w:tblLook w:firstColumn="1" w:firstRow="1" w:lastColumn="0" w:lastRow="0" w:noHBand="0" w:noVBand="1" w:val="04A0"/>
+      </w:tblPr>
+      <w:tblGrid>
+        <w:gridCol w:w="3389"/>
+        <w:gridCol w:w="3389"/>
+        <w:gridCol w:w="3389"/>
+      </w:tblGrid>
+      <w:tr>
+        <w:trPr>
+          <w:tblHeader w:val="true"/>
+        </w:trPr>
+        <w:tc>
+          <w:tcPr>
+            <w:tcW w:type="dxa" w:w="2232"/>
+            <w:vAlign w:val="center"/>
+            <w:shd w:fill="193B63"/>
+            <w:tcBorders>
+              <w:top w:val="single" w:sz="6" w:space="0" w:color="D9D9D9"/>
+              <w:left w:val="single" w:sz="6" w:space="0" w:color="D9D9D9"/>
+              <w:bottom w:val="single" w:sz="6" w:space="0" w:color="D9D9D9"/>
+              <w:right w:val="single" w:sz="6" w:space="0" w:color="D9D9D9"/>
+              <w:insideH w:val="single" w:sz="6" w:space="0" w:color="D9D9D9"/>
+              <w:insideV w:val="single" w:sz="6" w:space="0" w:color="D9D9D9"/>
+            </w:tcBorders>
+            <w:tcMar>
+              <w:top w:w="100" w:type="dxa"/>
+              <w:start w:w="120" w:type="dxa"/>
+              <w:bottom w:w="100" w:type="dxa"/>
+              <w:end w:w="120" w:type="dxa"/>
+            </w:tcMar>
+          </w:tcPr>
+          <w:p>
+            <w:pPr>
+              <w:jc w:val="left"/>
+            </w:pPr>
+            <w:r/>
+            <w:r>
+              <w:rPr>
+                <w:rFonts w:ascii="Microsoft JhengHei" w:hAnsi="Microsoft JhengHei" w:eastAsia="Microsoft JhengHei"/>
+                <w:b/>
+                <w:color w:val="FFFFFF"/>
+                <w:sz w:val="18"/>
+              </w:rPr>
+              <w:t>目標</w:t>
+            </w:r>
+          </w:p>
+        </w:tc>
+        <w:tc>
+          <w:tcPr>
+            <w:tcW w:type="dxa" w:w="2592"/>
+            <w:vAlign w:val="center"/>
+            <w:shd w:fill="193B63"/>
+            <w:tcBorders>
+              <w:top w:val="single" w:sz="6" w:space="0" w:color="D9D9D9"/>
+              <w:left w:val="single" w:sz="6" w:space="0" w:color="D9D9D9"/>
+              <w:bottom w:val="single" w:sz="6" w:space="0" w:color="D9D9D9"/>
+              <w:right w:val="single" w:sz="6" w:space="0" w:color="D9D9D9"/>
+              <w:insideH w:val="single" w:sz="6" w:space="0" w:color="D9D9D9"/>
+              <w:insideV w:val="single" w:sz="6" w:space="0" w:color="D9D9D9"/>
+            </w:tcBorders>
+            <w:tcMar>
+              <w:top w:w="100" w:type="dxa"/>
+              <w:start w:w="120" w:type="dxa"/>
+              <w:bottom w:w="100" w:type="dxa"/>
+              <w:end w:w="120" w:type="dxa"/>
+            </w:tcMar>
+          </w:tcPr>
+          <w:p>
+            <w:pPr>
+              <w:jc w:val="left"/>
+            </w:pPr>
+            <w:r/>
+            <w:r>
+              <w:rPr>
+                <w:rFonts w:ascii="Microsoft JhengHei" w:hAnsi="Microsoft JhengHei" w:eastAsia="Microsoft JhengHei"/>
+                <w:b/>
+                <w:color w:val="FFFFFF"/>
+                <w:sz w:val="18"/>
+              </w:rPr>
+              <w:t>需求</w:t>
+            </w:r>
+          </w:p>
+        </w:tc>
+        <w:tc>
+          <w:tcPr>
+            <w:tcW w:type="dxa" w:w="4680"/>
+            <w:vAlign w:val="center"/>
+            <w:shd w:fill="193B63"/>
+            <w:tcBorders>
+              <w:top w:val="single" w:sz="6" w:space="0" w:color="D9D9D9"/>
+              <w:left w:val="single" w:sz="6" w:space="0" w:color="D9D9D9"/>
+              <w:bottom w:val="single" w:sz="6" w:space="0" w:color="D9D9D9"/>
+              <w:right w:val="single" w:sz="6" w:space="0" w:color="D9D9D9"/>
+              <w:insideH w:val="single" w:sz="6" w:space="0" w:color="D9D9D9"/>
+              <w:insideV w:val="single" w:sz="6" w:space="0" w:color="D9D9D9"/>
+            </w:tcBorders>
+            <w:tcMar>
+              <w:top w:w="100" w:type="dxa"/>
+              <w:start w:w="120" w:type="dxa"/>
+              <w:bottom w:w="100" w:type="dxa"/>
+              <w:end w:w="120" w:type="dxa"/>
+            </w:tcMar>
+          </w:tcPr>
+          <w:p>
+            <w:pPr>
+              <w:jc w:val="left"/>
+            </w:pPr>
+            <w:r/>
+            <w:r>
+              <w:rPr>
+                <w:rFonts w:ascii="Microsoft JhengHei" w:hAnsi="Microsoft JhengHei" w:eastAsia="Microsoft JhengHei"/>
+                <w:b/>
+                <w:color w:val="FFFFFF"/>
+                <w:sz w:val="18"/>
+              </w:rPr>
+              <w:t>檢查結果</w:t>
+            </w:r>
+          </w:p>
+        </w:tc>
+      </w:tr>
+      <w:tr>
+        <w:tc>
+          <w:tcPr>
+            <w:tcW w:type="dxa" w:w="2232"/>
+            <w:vAlign w:val="center"/>
+            <w:shd w:fill="FFFFFF"/>
+            <w:tcBorders>
+              <w:top w:val="single" w:sz="6" w:space="0" w:color="D9D9D9"/>
+              <w:left w:val="single" w:sz="6" w:space="0" w:color="D9D9D9"/>
+              <w:bottom w:val="single" w:sz="6" w:space="0" w:color="D9D9D9"/>
+              <w:right w:val="single" w:sz="6" w:space="0" w:color="D9D9D9"/>
+              <w:insideH w:val="single" w:sz="6" w:space="0" w:color="D9D9D9"/>
+              <w:insideV w:val="single" w:sz="6" w:space="0" w:color="D9D9D9"/>
+            </w:tcBorders>
+            <w:tcMar>
+              <w:top w:w="100" w:type="dxa"/>
+              <w:start w:w="120" w:type="dxa"/>
+              <w:bottom w:w="100" w:type="dxa"/>
+              <w:end w:w="120" w:type="dxa"/>
+            </w:tcMar>
+          </w:tcPr>
+          <w:p>
+            <w:pPr>
+              <w:spacing w:after="20" w:line="276" w:lineRule="auto"/>
+            </w:pPr>
+            <w:r/>
+            <w:r>
+              <w:rPr>
+                <w:rFonts w:ascii="Microsoft JhengHei" w:hAnsi="Microsoft JhengHei" w:eastAsia="Microsoft JhengHei"/>
+                <w:color w:val="20242C"/>
+                <w:sz w:val="18"/>
+              </w:rPr>
+              <w:t>單名四星 1→70</w:t>
+            </w:r>
+          </w:p>
+        </w:tc>
+        <w:tc>
+          <w:tcPr>
+            <w:tcW w:type="dxa" w:w="2592"/>
+            <w:vAlign w:val="center"/>
+            <w:shd w:fill="FFFFFF"/>
+            <w:tcBorders>
+              <w:top w:val="single" w:sz="6" w:space="0" w:color="D9D9D9"/>
+              <w:left w:val="single" w:sz="6" w:space="0" w:color="D9D9D9"/>
+              <w:bottom w:val="single" w:sz="6" w:space="0" w:color="D9D9D9"/>
+              <w:right w:val="single" w:sz="6" w:space="0" w:color="D9D9D9"/>
+              <w:insideH w:val="single" w:sz="6" w:space="0" w:color="D9D9D9"/>
+              <w:insideV w:val="single" w:sz="6" w:space="0" w:color="D9D9D9"/>
+            </w:tcBorders>
+            <w:tcMar>
+              <w:top w:w="100" w:type="dxa"/>
+              <w:start w:w="120" w:type="dxa"/>
+              <w:bottom w:w="100" w:type="dxa"/>
+              <w:end w:w="120" w:type="dxa"/>
+            </w:tcMar>
+          </w:tcPr>
+          <w:p>
+            <w:pPr>
+              <w:spacing w:after="20" w:line="276" w:lineRule="auto"/>
+            </w:pPr>
+            <w:r/>
+            <w:r>
+              <w:rPr>
+                <w:rFonts w:ascii="Microsoft JhengHei" w:hAnsi="Microsoft JhengHei" w:eastAsia="Microsoft JhengHei"/>
+                <w:color w:val="20242C"/>
+                <w:sz w:val="18"/>
+              </w:rPr>
+              <w:t>79,902 角色經驗</w:t>
+            </w:r>
+          </w:p>
+        </w:tc>
+        <w:tc>
+          <w:tcPr>
+            <w:tcW w:type="dxa" w:w="4680"/>
+            <w:vAlign w:val="center"/>
+            <w:shd w:fill="FFFFFF"/>
+            <w:tcBorders>
+              <w:top w:val="single" w:sz="6" w:space="0" w:color="D9D9D9"/>
+              <w:left w:val="single" w:sz="6" w:space="0" w:color="D9D9D9"/>
+              <w:bottom w:val="single" w:sz="6" w:space="0" w:color="D9D9D9"/>
+              <w:right w:val="single" w:sz="6" w:space="0" w:color="D9D9D9"/>
+              <w:insideH w:val="single" w:sz="6" w:space="0" w:color="D9D9D9"/>
+              <w:insideV w:val="single" w:sz="6" w:space="0" w:color="D9D9D9"/>
+            </w:tcBorders>
+            <w:tcMar>
+              <w:top w:w="100" w:type="dxa"/>
+              <w:start w:w="120" w:type="dxa"/>
+              <w:bottom w:w="100" w:type="dxa"/>
+              <w:end w:w="120" w:type="dxa"/>
+            </w:tcMar>
+          </w:tcPr>
+          <w:p>
+            <w:pPr>
+              <w:spacing w:after="20" w:line="276" w:lineRule="auto"/>
+            </w:pPr>
+            <w:r/>
+            <w:r>
+              <w:rPr>
+                <w:rFonts w:ascii="Microsoft JhengHei" w:hAnsi="Microsoft JhengHei" w:eastAsia="Microsoft JhengHei"/>
+                <w:color w:val="20242C"/>
+                <w:sz w:val="18"/>
+              </w:rPr>
+              <w:t>可由前期劇情與試煉逐步取得</w:t>
+            </w:r>
+          </w:p>
+        </w:tc>
+      </w:tr>
+      <w:tr>
+        <w:tc>
+          <w:tcPr>
+            <w:tcW w:type="dxa" w:w="2232"/>
+            <w:vAlign w:val="center"/>
+            <w:shd w:fill="F4F7FB"/>
+            <w:tcBorders>
+              <w:top w:val="single" w:sz="6" w:space="0" w:color="D9D9D9"/>
+              <w:left w:val="single" w:sz="6" w:space="0" w:color="D9D9D9"/>
+              <w:bottom w:val="single" w:sz="6" w:space="0" w:color="D9D9D9"/>
+              <w:right w:val="single" w:sz="6" w:space="0" w:color="D9D9D9"/>
+              <w:insideH w:val="single" w:sz="6" w:space="0" w:color="D9D9D9"/>
+              <w:insideV w:val="single" w:sz="6" w:space="0" w:color="D9D9D9"/>
+            </w:tcBorders>
+            <w:tcMar>
+              <w:top w:w="100" w:type="dxa"/>
+              <w:start w:w="120" w:type="dxa"/>
+              <w:bottom w:w="100" w:type="dxa"/>
+              <w:end w:w="120" w:type="dxa"/>
+            </w:tcMar>
+          </w:tcPr>
+          <w:p>
+            <w:pPr>
+              <w:spacing w:after="20" w:line="276" w:lineRule="auto"/>
+            </w:pPr>
+            <w:r/>
+            <w:r>
+              <w:rPr>
+                <w:rFonts w:ascii="Microsoft JhengHei" w:hAnsi="Microsoft JhengHei" w:eastAsia="Microsoft JhengHei"/>
+                <w:color w:val="20242C"/>
+                <w:sz w:val="18"/>
+              </w:rPr>
+              <w:t>單名四星 1→80</w:t>
+            </w:r>
+          </w:p>
+        </w:tc>
+        <w:tc>
+          <w:tcPr>
+            <w:tcW w:type="dxa" w:w="2592"/>
+            <w:vAlign w:val="center"/>
+            <w:shd w:fill="F4F7FB"/>
+            <w:tcBorders>
+              <w:top w:val="single" w:sz="6" w:space="0" w:color="D9D9D9"/>
+              <w:left w:val="single" w:sz="6" w:space="0" w:color="D9D9D9"/>
+              <w:bottom w:val="single" w:sz="6" w:space="0" w:color="D9D9D9"/>
+              <w:right w:val="single" w:sz="6" w:space="0" w:color="D9D9D9"/>
+              <w:insideH w:val="single" w:sz="6" w:space="0" w:color="D9D9D9"/>
+              <w:insideV w:val="single" w:sz="6" w:space="0" w:color="D9D9D9"/>
+            </w:tcBorders>
+            <w:tcMar>
+              <w:top w:w="100" w:type="dxa"/>
+              <w:start w:w="120" w:type="dxa"/>
+              <w:bottom w:w="100" w:type="dxa"/>
+              <w:end w:w="120" w:type="dxa"/>
+            </w:tcMar>
+          </w:tcPr>
+          <w:p>
+            <w:pPr>
+              <w:spacing w:after="20" w:line="276" w:lineRule="auto"/>
+            </w:pPr>
+            <w:r/>
+            <w:r>
+              <w:rPr>
+                <w:rFonts w:ascii="Microsoft JhengHei" w:hAnsi="Microsoft JhengHei" w:eastAsia="Microsoft JhengHei"/>
+                <w:color w:val="20242C"/>
+                <w:sz w:val="18"/>
+              </w:rPr>
+              <w:t>104,122 角色經驗</w:t>
+            </w:r>
+          </w:p>
+        </w:tc>
+        <w:tc>
+          <w:tcPr>
+            <w:tcW w:type="dxa" w:w="4680"/>
+            <w:vAlign w:val="center"/>
+            <w:shd w:fill="F4F7FB"/>
+            <w:tcBorders>
+              <w:top w:val="single" w:sz="6" w:space="0" w:color="D9D9D9"/>
+              <w:left w:val="single" w:sz="6" w:space="0" w:color="D9D9D9"/>
+              <w:bottom w:val="single" w:sz="6" w:space="0" w:color="D9D9D9"/>
+              <w:right w:val="single" w:sz="6" w:space="0" w:color="D9D9D9"/>
+              <w:insideH w:val="single" w:sz="6" w:space="0" w:color="D9D9D9"/>
+              <w:insideV w:val="single" w:sz="6" w:space="0" w:color="D9D9D9"/>
+            </w:tcBorders>
+            <w:tcMar>
+              <w:top w:w="100" w:type="dxa"/>
+              <w:start w:w="120" w:type="dxa"/>
+              <w:bottom w:w="100" w:type="dxa"/>
+              <w:end w:w="120" w:type="dxa"/>
+            </w:tcMar>
+          </w:tcPr>
+          <w:p>
+            <w:pPr>
+              <w:spacing w:after="20" w:line="276" w:lineRule="auto"/>
+            </w:pPr>
+            <w:r/>
+            <w:r>
+              <w:rPr>
+                <w:rFonts w:ascii="Microsoft JhengHei" w:hAnsi="Microsoft JhengHei" w:eastAsia="Microsoft JhengHei"/>
+                <w:color w:val="20242C"/>
+                <w:sz w:val="18"/>
+              </w:rPr>
+              <w:t>80 等突破前可完成</w:t>
+            </w:r>
+          </w:p>
+        </w:tc>
+      </w:tr>
+      <w:tr>
+        <w:tc>
+          <w:tcPr>
+            <w:tcW w:type="dxa" w:w="2232"/>
+            <w:vAlign w:val="center"/>
+            <w:shd w:fill="FFFFFF"/>
+            <w:tcBorders>
+              <w:top w:val="single" w:sz="6" w:space="0" w:color="D9D9D9"/>
+              <w:left w:val="single" w:sz="6" w:space="0" w:color="D9D9D9"/>
+              <w:bottom w:val="single" w:sz="6" w:space="0" w:color="D9D9D9"/>
+              <w:right w:val="single" w:sz="6" w:space="0" w:color="D9D9D9"/>
+              <w:insideH w:val="single" w:sz="6" w:space="0" w:color="D9D9D9"/>
+              <w:insideV w:val="single" w:sz="6" w:space="0" w:color="D9D9D9"/>
+            </w:tcBorders>
+            <w:tcMar>
+              <w:top w:w="100" w:type="dxa"/>
+              <w:start w:w="120" w:type="dxa"/>
+              <w:bottom w:w="100" w:type="dxa"/>
+              <w:end w:w="120" w:type="dxa"/>
+            </w:tcMar>
+          </w:tcPr>
+          <w:p>
+            <w:pPr>
+              <w:spacing w:after="20" w:line="276" w:lineRule="auto"/>
+            </w:pPr>
+            <w:r/>
+            <w:r>
+              <w:rPr>
+                <w:rFonts w:ascii="Microsoft JhengHei" w:hAnsi="Microsoft JhengHei" w:eastAsia="Microsoft JhengHei"/>
+                <w:color w:val="20242C"/>
+                <w:sz w:val="18"/>
+              </w:rPr>
+              <w:t>單名四星 1→90</w:t>
+            </w:r>
+          </w:p>
+        </w:tc>
+        <w:tc>
+          <w:tcPr>
+            <w:tcW w:type="dxa" w:w="2592"/>
+            <w:vAlign w:val="center"/>
+            <w:shd w:fill="FFFFFF"/>
+            <w:tcBorders>
+              <w:top w:val="single" w:sz="6" w:space="0" w:color="D9D9D9"/>
+              <w:left w:val="single" w:sz="6" w:space="0" w:color="D9D9D9"/>
+              <w:bottom w:val="single" w:sz="6" w:space="0" w:color="D9D9D9"/>
+              <w:right w:val="single" w:sz="6" w:space="0" w:color="D9D9D9"/>
+              <w:insideH w:val="single" w:sz="6" w:space="0" w:color="D9D9D9"/>
+              <w:insideV w:val="single" w:sz="6" w:space="0" w:color="D9D9D9"/>
+            </w:tcBorders>
+            <w:tcMar>
+              <w:top w:w="100" w:type="dxa"/>
+              <w:start w:w="120" w:type="dxa"/>
+              <w:bottom w:w="100" w:type="dxa"/>
+              <w:end w:w="120" w:type="dxa"/>
+            </w:tcMar>
+          </w:tcPr>
+          <w:p>
+            <w:pPr>
+              <w:spacing w:after="20" w:line="276" w:lineRule="auto"/>
+            </w:pPr>
+            <w:r/>
+            <w:r>
+              <w:rPr>
+                <w:rFonts w:ascii="Microsoft JhengHei" w:hAnsi="Microsoft JhengHei" w:eastAsia="Microsoft JhengHei"/>
+                <w:color w:val="20242C"/>
+                <w:sz w:val="18"/>
+              </w:rPr>
+              <w:t>131,542 角色經驗</w:t>
+            </w:r>
+          </w:p>
+        </w:tc>
+        <w:tc>
+          <w:tcPr>
+            <w:tcW w:type="dxa" w:w="4680"/>
+            <w:vAlign w:val="center"/>
+            <w:shd w:fill="FFFFFF"/>
+            <w:tcBorders>
+              <w:top w:val="single" w:sz="6" w:space="0" w:color="D9D9D9"/>
+              <w:left w:val="single" w:sz="6" w:space="0" w:color="D9D9D9"/>
+              <w:bottom w:val="single" w:sz="6" w:space="0" w:color="D9D9D9"/>
+              <w:right w:val="single" w:sz="6" w:space="0" w:color="D9D9D9"/>
+              <w:insideH w:val="single" w:sz="6" w:space="0" w:color="D9D9D9"/>
+              <w:insideV w:val="single" w:sz="6" w:space="0" w:color="D9D9D9"/>
+            </w:tcBorders>
+            <w:tcMar>
+              <w:top w:w="100" w:type="dxa"/>
+              <w:start w:w="120" w:type="dxa"/>
+              <w:bottom w:w="100" w:type="dxa"/>
+              <w:end w:w="120" w:type="dxa"/>
+            </w:tcMar>
+          </w:tcPr>
+          <w:p>
+            <w:pPr>
+              <w:spacing w:after="20" w:line="276" w:lineRule="auto"/>
+            </w:pPr>
+            <w:r/>
+            <w:r>
+              <w:rPr>
+                <w:rFonts w:ascii="Microsoft JhengHei" w:hAnsi="Microsoft JhengHei" w:eastAsia="Microsoft JhengHei"/>
+                <w:color w:val="20242C"/>
+                <w:sz w:val="18"/>
+              </w:rPr>
+              <w:t>需完成 80 等突破並使用 Boss 材料</w:t>
+            </w:r>
+          </w:p>
+        </w:tc>
+      </w:tr>
+      <w:tr>
+        <w:tc>
+          <w:tcPr>
+            <w:tcW w:type="dxa" w:w="2232"/>
+            <w:vAlign w:val="center"/>
+            <w:shd w:fill="F4F7FB"/>
+            <w:tcBorders>
+              <w:top w:val="single" w:sz="6" w:space="0" w:color="D9D9D9"/>
+              <w:left w:val="single" w:sz="6" w:space="0" w:color="D9D9D9"/>
+              <w:bottom w:val="single" w:sz="6" w:space="0" w:color="D9D9D9"/>
+              <w:right w:val="single" w:sz="6" w:space="0" w:color="D9D9D9"/>
+              <w:insideH w:val="single" w:sz="6" w:space="0" w:color="D9D9D9"/>
+              <w:insideV w:val="single" w:sz="6" w:space="0" w:color="D9D9D9"/>
+            </w:tcBorders>
+            <w:tcMar>
+              <w:top w:w="100" w:type="dxa"/>
+              <w:start w:w="120" w:type="dxa"/>
+              <w:bottom w:w="100" w:type="dxa"/>
+              <w:end w:w="120" w:type="dxa"/>
+            </w:tcMar>
+          </w:tcPr>
+          <w:p>
+            <w:pPr>
+              <w:spacing w:after="20" w:line="276" w:lineRule="auto"/>
+            </w:pPr>
+            <w:r/>
+            <w:r>
+              <w:rPr>
+                <w:rFonts w:ascii="Microsoft JhengHei" w:hAnsi="Microsoft JhengHei" w:eastAsia="Microsoft JhengHei"/>
+                <w:color w:val="20242C"/>
+                <w:sz w:val="18"/>
+              </w:rPr>
+              <w:t>四名四星 1→90</w:t>
+            </w:r>
+          </w:p>
+        </w:tc>
+        <w:tc>
+          <w:tcPr>
+            <w:tcW w:type="dxa" w:w="2592"/>
+            <w:vAlign w:val="center"/>
+            <w:shd w:fill="F4F7FB"/>
+            <w:tcBorders>
+              <w:top w:val="single" w:sz="6" w:space="0" w:color="D9D9D9"/>
+              <w:left w:val="single" w:sz="6" w:space="0" w:color="D9D9D9"/>
+              <w:bottom w:val="single" w:sz="6" w:space="0" w:color="D9D9D9"/>
+              <w:right w:val="single" w:sz="6" w:space="0" w:color="D9D9D9"/>
+              <w:insideH w:val="single" w:sz="6" w:space="0" w:color="D9D9D9"/>
+              <w:insideV w:val="single" w:sz="6" w:space="0" w:color="D9D9D9"/>
+            </w:tcBorders>
+            <w:tcMar>
+              <w:top w:w="100" w:type="dxa"/>
+              <w:start w:w="120" w:type="dxa"/>
+              <w:bottom w:w="100" w:type="dxa"/>
+              <w:end w:w="120" w:type="dxa"/>
+            </w:tcMar>
+          </w:tcPr>
+          <w:p>
+            <w:pPr>
+              <w:spacing w:after="20" w:line="276" w:lineRule="auto"/>
+            </w:pPr>
+            <w:r/>
+            <w:r>
+              <w:rPr>
+                <w:rFonts w:ascii="Microsoft JhengHei" w:hAnsi="Microsoft JhengHei" w:eastAsia="Microsoft JhengHei"/>
+                <w:color w:val="20242C"/>
+                <w:sz w:val="18"/>
+              </w:rPr>
+              <w:t>526,168 角色經驗</w:t>
+            </w:r>
+          </w:p>
+        </w:tc>
+        <w:tc>
+          <w:tcPr>
+            <w:tcW w:type="dxa" w:w="4680"/>
+            <w:vAlign w:val="center"/>
+            <w:shd w:fill="F4F7FB"/>
+            <w:tcBorders>
+              <w:top w:val="single" w:sz="6" w:space="0" w:color="D9D9D9"/>
+              <w:left w:val="single" w:sz="6" w:space="0" w:color="D9D9D9"/>
+              <w:bottom w:val="single" w:sz="6" w:space="0" w:color="D9D9D9"/>
+              <w:right w:val="single" w:sz="6" w:space="0" w:color="D9D9D9"/>
+              <w:insideH w:val="single" w:sz="6" w:space="0" w:color="D9D9D9"/>
+              <w:insideV w:val="single" w:sz="6" w:space="0" w:color="D9D9D9"/>
+            </w:tcBorders>
+            <w:tcMar>
+              <w:top w:w="100" w:type="dxa"/>
+              <w:start w:w="120" w:type="dxa"/>
+              <w:bottom w:w="100" w:type="dxa"/>
+              <w:end w:w="120" w:type="dxa"/>
+            </w:tcMar>
+          </w:tcPr>
+          <w:p>
+            <w:pPr>
+              <w:spacing w:after="20" w:line="276" w:lineRule="auto"/>
+            </w:pPr>
+            <w:r/>
+            <w:r>
+              <w:rPr>
+                <w:rFonts w:ascii="Microsoft JhengHei" w:hAnsi="Microsoft JhengHei" w:eastAsia="Microsoft JhengHei"/>
+                <w:color w:val="20242C"/>
+                <w:sz w:val="18"/>
+              </w:rPr>
+              <w:t>目前版本列出的全部來源合計 541,200，餘 15,032</w:t>
+            </w:r>
+          </w:p>
+        </w:tc>
+      </w:tr>
+    </w:tbl>
+    <w:p>
+      <w:pPr>
+        <w:spacing w:after="20"/>
+      </w:pPr>
+    </w:p>
+    <w:p>
+      <w:pPr>
+        <w:pStyle w:val="ListBullet"/>
+        <w:spacing w:after="60" w:line="288" w:lineRule="auto"/>
+      </w:pPr>
+      <w:r>
+        <w:rPr>
+          <w:rFonts w:ascii="Microsoft JhengHei" w:hAnsi="Microsoft JhengHei" w:eastAsia="Microsoft JhengHei"/>
+          <w:color w:val="20242C"/>
+          <w:sz w:val="20"/>
+        </w:rPr>
+        <w:t>開放劇情 78 幕是一次性獎勵：每幕 +100 星砂、+650 角色經驗，重看不會重複領取。</w:t>
+      </w:r>
+    </w:p>
+    <w:p>
+      <w:pPr>
+        <w:pStyle w:val="ListBullet"/>
+        <w:spacing w:after="60" w:line="288" w:lineRule="auto"/>
+      </w:pPr>
+      <w:r>
+        <w:rPr>
+          <w:rFonts w:ascii="Microsoft JhengHei" w:hAnsi="Microsoft JhengHei" w:eastAsia="Microsoft JhengHei"/>
+          <w:color w:val="20242C"/>
+          <w:sz w:val="20"/>
+        </w:rPr>
+        <w:t>星界試煉 30 關每關每版本最多成功領 10 次：每次 +50 星砂、+1,500 角色經驗；保留挑戰次數是為了維持主要可重複的角色經驗來源。</w:t>
+      </w:r>
+    </w:p>
+    <w:p>
+      <w:pPr>
+        <w:pStyle w:val="ListBullet"/>
+        <w:spacing w:after="60" w:line="288" w:lineRule="auto"/>
+      </w:pPr>
+      <w:r>
+        <w:rPr>
+          <w:rFonts w:ascii="Microsoft JhengHei" w:hAnsi="Microsoft JhengHei" w:eastAsia="Microsoft JhengHei"/>
+          <w:color w:val="20242C"/>
+          <w:sz w:val="20"/>
+        </w:rPr>
+        <w:t>六個 Boss 各 10 次、分布於 Lv.1–3 三檔，合計 +32,400 角色經驗、80 枚專屬材料與 60 枚通用印記；星港委託、星海迷航、新手教學和初始資源合計再提供 8,100 經驗。</w:t>
+      </w:r>
+    </w:p>
+    <w:p>
+      <w:pPr>
+        <w:pStyle w:val="ListBullet"/>
+        <w:spacing w:after="60" w:line="288" w:lineRule="auto"/>
+      </w:pPr>
+      <w:r>
+        <w:rPr>
+          <w:rFonts w:ascii="Microsoft JhengHei" w:hAnsi="Microsoft JhengHei" w:eastAsia="Microsoft JhengHei"/>
+          <w:color w:val="20242C"/>
+          <w:sz w:val="20"/>
+        </w:rPr>
+        <w:t>完整使用當期玩法上限可取得 28,860 星砂：18 次十連，並剩 60 星砂；抽卡重複角色帶來的經驗與每格 8% 隨機星砂未列入安全估算。</w:t>
+      </w:r>
+    </w:p>
+    <w:p>
+      <w:pPr>
+        <w:pStyle w:val="Heading2"/>
+        <w:keepNext/>
+        <w:spacing w:before="160" w:after="100"/>
+      </w:pPr>
+      <w:r>
+        <w:rPr>
+          <w:rFonts w:ascii="Microsoft JhengHei" w:hAnsi="Microsoft JhengHei" w:eastAsia="Microsoft JhengHei"/>
+          <w:b/>
+          <w:color w:val="000000"/>
+          <w:sz w:val="26"/>
+        </w:rPr>
+        <w:t>後續角色天賦預留</w:t>
+      </w:r>
+    </w:p>
+    <w:p>
+      <w:pPr>
+        <w:spacing w:after="80" w:line="312" w:lineRule="auto"/>
+      </w:pPr>
+      <w:r>
+        <w:rPr>
+          <w:rFonts w:ascii="Microsoft JhengHei" w:hAnsi="Microsoft JhengHei" w:eastAsia="Microsoft JhengHei"/>
+          <w:b w:val="0"/>
+          <w:color w:val="20242C"/>
+          <w:sz w:val="21"/>
+        </w:rPr>
+        <w:t>3.0 之後才開放角色天賦。每名角色固定三條分支：「攻擊手段」「定位專精」「界痕共鳴」，各 5 級；使用獨立的專屬天賦手冊，不消耗星砂或突破材料。每條分支上限約 4–6%，三條合計受 10% 低幅度上限約束，技能效果以功能提升為主，不會把角色面板無限乘高。</w:t>
+      </w:r>
     </w:p>
     <w:p>
       <w:r>
@@ -5241,7 +6237,7 @@
           <w:color w:val="20242C"/>
           <w:sz w:val="20"/>
         </w:rPr>
-        <w:t>每幕第一次完成時加入 100 星砂，完成紀錄以 chapterId:sceneId 儲存，重看不會重複領取。</w:t>
+        <w:t>每幕第一次完成時加入 100 星砂與 650 角色經驗，完成紀錄以 chapterId:sceneId 儲存，重看不會重複領取。</w:t>
       </w:r>
     </w:p>
     <w:p>
@@ -5304,7 +6300,7 @@
           <w:color w:val="20242C"/>
           <w:sz w:val="21"/>
         </w:rPr>
-        <w:t>角色頁先顯示已取得角色，再以完整立繪、名稱、星級、元素、戰鬥定位與成長按鈕提供詳細培養。立繪比例使用 contain，名稱、星級與元素以固定標籤疊加，避免瑟蕾雅等角色在手機畫面被裁切。</w:t>
+        <w:t>角色頁先顯示已取得角色，再以完整立繪、名稱、星級、元素、戰鬥定位與成長按鈕提供詳細培養。立繪比例使用 contain，名稱、星級與元素以固定標籤疊加，避免瑟蕾雅等角色在手機畫面被裁切。角色戰力成長依實際基礎面板分成標準帶與平衡帶，不以性別決定倍率，讓低基礎的功能型四星在 70–90 等仍有追趕空間。</w:t>
       </w:r>
     </w:p>
     <w:tbl>
@@ -5606,7 +6602,7 @@
                 <w:color w:val="20242C"/>
                 <w:sz w:val="18"/>
               </w:rPr>
-              <w:t>每級 2.2% 主要屬性、1.7% 防禦、0.7% 速度</w:t>
+              <w:t>每級 3% 主要屬性、2.2% 防禦、0.9% 速度</w:t>
             </w:r>
           </w:p>
         </w:tc>
@@ -5641,7 +6637,7 @@
                 <w:color w:val="20242C"/>
                 <w:sz w:val="18"/>
               </w:rPr>
-              <w:t>每級 3.2% 主要屬性、2.5% 防禦、1.1% 速度</w:t>
+              <w:t>標準每級 4%／3%／1.2%；低基礎戰力 4★進入平衡帶後為 5%／3.6%／1.4%</w:t>
             </w:r>
           </w:p>
         </w:tc>
@@ -5893,7 +6889,7 @@
           <w:color w:val="20242C"/>
           <w:sz w:val="20"/>
         </w:rPr>
-        <w:t>現行角色等級上限為 90；角色可先升到 80 等，達到 80 等後必須完成指定 Boss 突破才能繼續升級。</w:t>
+        <w:t>現行角色等級上限為 90；角色可先升到 80 等，達到 80 等後必須取得突破材料才能繼續升級。</w:t>
       </w:r>
     </w:p>
     <w:p>
@@ -5907,7 +6903,7 @@
           <w:color w:val="20242C"/>
           <w:sz w:val="20"/>
         </w:rPr>
-        <w:t>每名角色只對應一種 Boss 與一種突破材料：三星角色每次突破需要 3 枚，四星角色需要 4 枚。</w:t>
+        <w:t>每名角色有偏好的 Boss 與專屬材料：三星角色每次突破需要 3 枚，四星角色需要 4 枚；指定材料不足時可用星界通用突破印記補足。</w:t>
       </w:r>
     </w:p>
     <w:p>
@@ -5979,7 +6975,7 @@
           <w:color w:val="20242C"/>
           <w:sz w:val="20"/>
         </w:rPr>
-        <w:t>培養頁每按一次提升命座消耗該角色 1 枚個人晶核，命座上限 6；不使用全角色共用的晶核。</w:t>
+        <w:t>重複角色已在抽卡結算時自動增加命座；培養頁不再放置重複的手動提升按鈕，個人晶核保留作為存檔相容與後續系統資源。</w:t>
       </w:r>
     </w:p>
     <w:p>
@@ -5993,7 +6989,7 @@
           <w:color w:val="20242C"/>
           <w:sz w:val="20"/>
         </w:rPr>
-        <w:t>共鳴晶核仍是抽卡重複 4★ 的轉換資源，與角色個人命座晶核分開顯示。</w:t>
+        <w:t>抽卡不再產生全域共鳴晶核；命座只由重複角色自動增加，該角色專用晶核僅作為個人命座資源與舊存檔相容資料保留。</w:t>
       </w:r>
     </w:p>
     <w:p>
@@ -6402,7 +7398,7 @@
                 <w:color w:val="20242C"/>
                 <w:sz w:val="18"/>
               </w:rPr>
-              <w:t>260 星砂、該關角色經驗</w:t>
+              <w:t>50 星砂、1,500 角色經驗</w:t>
             </w:r>
           </w:p>
         </w:tc>
@@ -6719,7 +7715,7 @@
           <w:color w:val="20242C"/>
           <w:sz w:val="21"/>
         </w:rPr>
-        <w:t>Boss 是角色 80 等後的專屬突破玩法。玩家在 Boss 頁選擇首領、查看敵人與環境情報，再從已取得角色中派出最多 4 人。每名角色的培養頁會明確顯示指定 Boss、材料名稱、需求數量與目前持有量。</w:t>
+        <w:t>Boss 是角色 80 等後的專屬突破玩法。玩家在 Boss 頁選擇首領、查看敵人與環境情報，再從已取得角色中派出最多 4 人。六種素材 Boss 分成 Lv.1–3 三個獎勵檔位，每個檔位有兩個 Boss；Boss 等級不是角色能否突破的硬門檻。每名角色仍會顯示偏好的專屬材料來源，但所有 Boss 都會掉落可替代指定材料的星界通用突破印記。</w:t>
       </w:r>
     </w:p>
     <w:tbl>
@@ -6741,7 +7737,7 @@
         </w:trPr>
         <w:tc>
           <w:tcPr>
-            <w:tcW w:type="dxa" w:w="2016"/>
+            <w:tcW w:type="dxa" w:w="2088"/>
             <w:vAlign w:val="center"/>
             <w:shd w:fill="193B63"/>
             <w:tcBorders>
@@ -6777,7 +7773,7 @@
         </w:tc>
         <w:tc>
           <w:tcPr>
-            <w:tcW w:type="dxa" w:w="1944"/>
+            <w:tcW w:type="dxa" w:w="1080"/>
             <w:vAlign w:val="center"/>
             <w:shd w:fill="193B63"/>
             <w:tcBorders>
@@ -6807,13 +7803,13 @@
                 <w:color w:val="FFFFFF"/>
                 <w:sz w:val="18"/>
               </w:rPr>
-              <w:t>突破材料</w:t>
+              <w:t>等級</w:t>
             </w:r>
           </w:p>
         </w:tc>
         <w:tc>
           <w:tcPr>
-            <w:tcW w:type="dxa" w:w="3528"/>
+            <w:tcW w:type="dxa" w:w="3600"/>
             <w:vAlign w:val="center"/>
             <w:shd w:fill="193B63"/>
             <w:tcBorders>
@@ -6843,13 +7839,13 @@
                 <w:color w:val="FFFFFF"/>
                 <w:sz w:val="18"/>
               </w:rPr>
-              <w:t>對應角色群</w:t>
+              <w:t>獎勵檔位</w:t>
             </w:r>
           </w:p>
         </w:tc>
         <w:tc>
           <w:tcPr>
-            <w:tcW w:type="dxa" w:w="2016"/>
+            <w:tcW w:type="dxa" w:w="2880"/>
             <w:vAlign w:val="center"/>
             <w:shd w:fill="193B63"/>
             <w:tcBorders>
@@ -6879,7 +7875,7 @@
                 <w:color w:val="FFFFFF"/>
                 <w:sz w:val="18"/>
               </w:rPr>
-              <w:t>每名角色需求</w:t>
+              <w:t>材料用途</w:t>
             </w:r>
           </w:p>
         </w:tc>
@@ -6887,7 +7883,7 @@
       <w:tr>
         <w:tc>
           <w:tcPr>
-            <w:tcW w:type="dxa" w:w="2016"/>
+            <w:tcW w:type="dxa" w:w="2088"/>
             <w:vAlign w:val="center"/>
             <w:shd w:fill="FFFFFF"/>
             <w:tcBorders>
@@ -6922,7 +7918,7 @@
         </w:tc>
         <w:tc>
           <w:tcPr>
-            <w:tcW w:type="dxa" w:w="1944"/>
+            <w:tcW w:type="dxa" w:w="1080"/>
             <w:vAlign w:val="center"/>
             <w:shd w:fill="FFFFFF"/>
             <w:tcBorders>
@@ -6951,13 +7947,13 @@
                 <w:color w:val="20242C"/>
                 <w:sz w:val="18"/>
               </w:rPr>
-              <w:t>星序碎晶</w:t>
+              <w:t>Lv.1</w:t>
             </w:r>
           </w:p>
         </w:tc>
         <w:tc>
           <w:tcPr>
-            <w:tcW w:type="dxa" w:w="3528"/>
+            <w:tcW w:type="dxa" w:w="3600"/>
             <w:vAlign w:val="center"/>
             <w:shd w:fill="FFFFFF"/>
             <w:tcBorders>
@@ -6986,13 +7982,13 @@
                 <w:color w:val="20242C"/>
                 <w:sz w:val="18"/>
               </w:rPr>
-              <w:t>瑟蕾雅、艾妲、諾芮亞、奧蕾雅、伊萊拉</w:t>
+              <w:t>1 專屬材料、420 經驗、1 通用印記</w:t>
             </w:r>
           </w:p>
         </w:tc>
         <w:tc>
           <w:tcPr>
-            <w:tcW w:type="dxa" w:w="2016"/>
+            <w:tcW w:type="dxa" w:w="2880"/>
             <w:vAlign w:val="center"/>
             <w:shd w:fill="FFFFFF"/>
             <w:tcBorders>
@@ -7021,7 +8017,7 @@
                 <w:color w:val="20242C"/>
                 <w:sz w:val="18"/>
               </w:rPr>
-              <w:t>三星 3 枚；四星 4 枚</w:t>
+              <w:t>星序碎晶；通用印記可替代</w:t>
             </w:r>
           </w:p>
         </w:tc>
@@ -7029,7 +8025,7 @@
       <w:tr>
         <w:tc>
           <w:tcPr>
-            <w:tcW w:type="dxa" w:w="2016"/>
+            <w:tcW w:type="dxa" w:w="2088"/>
             <w:vAlign w:val="center"/>
             <w:shd w:fill="F4F7FB"/>
             <w:tcBorders>
@@ -7064,7 +8060,7 @@
         </w:tc>
         <w:tc>
           <w:tcPr>
-            <w:tcW w:type="dxa" w:w="1944"/>
+            <w:tcW w:type="dxa" w:w="1080"/>
             <w:vAlign w:val="center"/>
             <w:shd w:fill="F4F7FB"/>
             <w:tcBorders>
@@ -7093,13 +8089,13 @@
                 <w:color w:val="20242C"/>
                 <w:sz w:val="18"/>
               </w:rPr>
-              <w:t>潮眼晶核</w:t>
+              <w:t>Lv.1</w:t>
             </w:r>
           </w:p>
         </w:tc>
         <w:tc>
           <w:tcPr>
-            <w:tcW w:type="dxa" w:w="3528"/>
+            <w:tcW w:type="dxa" w:w="3600"/>
             <w:vAlign w:val="center"/>
             <w:shd w:fill="F4F7FB"/>
             <w:tcBorders>
@@ -7128,13 +8124,13 @@
                 <w:color w:val="20242C"/>
                 <w:sz w:val="18"/>
               </w:rPr>
-              <w:t>莉亞、蕾娜、艾洛娜、璃珊、澪歌、奧薇拉等</w:t>
+              <w:t>1 專屬材料、420 經驗、1 通用印記</w:t>
             </w:r>
           </w:p>
         </w:tc>
         <w:tc>
           <w:tcPr>
-            <w:tcW w:type="dxa" w:w="2016"/>
+            <w:tcW w:type="dxa" w:w="2880"/>
             <w:vAlign w:val="center"/>
             <w:shd w:fill="F4F7FB"/>
             <w:tcBorders>
@@ -7163,7 +8159,7 @@
                 <w:color w:val="20242C"/>
                 <w:sz w:val="18"/>
               </w:rPr>
-              <w:t>三星 3 枚；四星 4 枚</w:t>
+              <w:t>潮眼晶核；通用印記可替代</w:t>
             </w:r>
           </w:p>
         </w:tc>
@@ -7171,7 +8167,7 @@
       <w:tr>
         <w:tc>
           <w:tcPr>
-            <w:tcW w:type="dxa" w:w="2016"/>
+            <w:tcW w:type="dxa" w:w="2088"/>
             <w:vAlign w:val="center"/>
             <w:shd w:fill="FFFFFF"/>
             <w:tcBorders>
@@ -7206,7 +8202,7 @@
         </w:tc>
         <w:tc>
           <w:tcPr>
-            <w:tcW w:type="dxa" w:w="1944"/>
+            <w:tcW w:type="dxa" w:w="1080"/>
             <w:vAlign w:val="center"/>
             <w:shd w:fill="FFFFFF"/>
             <w:tcBorders>
@@ -7235,13 +8231,13 @@
                 <w:color w:val="20242C"/>
                 <w:sz w:val="18"/>
               </w:rPr>
-              <w:t>逆時鐘核</w:t>
+              <w:t>Lv.2</w:t>
             </w:r>
           </w:p>
         </w:tc>
         <w:tc>
           <w:tcPr>
-            <w:tcW w:type="dxa" w:w="3528"/>
+            <w:tcW w:type="dxa" w:w="3600"/>
             <w:vAlign w:val="center"/>
             <w:shd w:fill="FFFFFF"/>
             <w:tcBorders>
@@ -7270,13 +8266,13 @@
                 <w:color w:val="20242C"/>
                 <w:sz w:val="18"/>
               </w:rPr>
-              <w:t>雷恩、Chodan、Siyeon</w:t>
+              <w:t>1 專屬材料、540 經驗、1 通用印記</w:t>
             </w:r>
           </w:p>
         </w:tc>
         <w:tc>
           <w:tcPr>
-            <w:tcW w:type="dxa" w:w="2016"/>
+            <w:tcW w:type="dxa" w:w="2880"/>
             <w:vAlign w:val="center"/>
             <w:shd w:fill="FFFFFF"/>
             <w:tcBorders>
@@ -7305,7 +8301,7 @@
                 <w:color w:val="20242C"/>
                 <w:sz w:val="18"/>
               </w:rPr>
-              <w:t>三星 3 枚；四星 4 枚</w:t>
+              <w:t>逆時鐘核；通用印記可替代</w:t>
             </w:r>
           </w:p>
         </w:tc>
@@ -7313,7 +8309,7 @@
       <w:tr>
         <w:tc>
           <w:tcPr>
-            <w:tcW w:type="dxa" w:w="2016"/>
+            <w:tcW w:type="dxa" w:w="2088"/>
             <w:vAlign w:val="center"/>
             <w:shd w:fill="F4F7FB"/>
             <w:tcBorders>
@@ -7348,7 +8344,7 @@
         </w:tc>
         <w:tc>
           <w:tcPr>
-            <w:tcW w:type="dxa" w:w="1944"/>
+            <w:tcW w:type="dxa" w:w="1080"/>
             <w:vAlign w:val="center"/>
             <w:shd w:fill="F4F7FB"/>
             <w:tcBorders>
@@ -7377,13 +8373,13 @@
                 <w:color w:val="20242C"/>
                 <w:sz w:val="18"/>
               </w:rPr>
-              <w:t>熱管熔核</w:t>
+              <w:t>Lv.2</w:t>
             </w:r>
           </w:p>
         </w:tc>
         <w:tc>
           <w:tcPr>
-            <w:tcW w:type="dxa" w:w="3528"/>
+            <w:tcW w:type="dxa" w:w="3600"/>
             <w:vAlign w:val="center"/>
             <w:shd w:fill="F4F7FB"/>
             <w:tcBorders>
@@ -7412,13 +8408,13 @@
                 <w:color w:val="20242C"/>
                 <w:sz w:val="18"/>
               </w:rPr>
-              <w:t>伊薩爾、赫洛、Magenta、曜澤、洛恩、凱嵐等</w:t>
+              <w:t>1 專屬材料、540 經驗、1 通用印記</w:t>
             </w:r>
           </w:p>
         </w:tc>
         <w:tc>
           <w:tcPr>
-            <w:tcW w:type="dxa" w:w="2016"/>
+            <w:tcW w:type="dxa" w:w="2880"/>
             <w:vAlign w:val="center"/>
             <w:shd w:fill="F4F7FB"/>
             <w:tcBorders>
@@ -7447,7 +8443,7 @@
                 <w:color w:val="20242C"/>
                 <w:sz w:val="18"/>
               </w:rPr>
-              <w:t>三星 3 枚；四星 4 枚</w:t>
+              <w:t>熱管熔核；通用印記可替代</w:t>
             </w:r>
           </w:p>
         </w:tc>
@@ -7455,7 +8451,7 @@
       <w:tr>
         <w:tc>
           <w:tcPr>
-            <w:tcW w:type="dxa" w:w="2016"/>
+            <w:tcW w:type="dxa" w:w="2088"/>
             <w:vAlign w:val="center"/>
             <w:shd w:fill="FFFFFF"/>
             <w:tcBorders>
@@ -7490,7 +8486,7 @@
         </w:tc>
         <w:tc>
           <w:tcPr>
-            <w:tcW w:type="dxa" w:w="1944"/>
+            <w:tcW w:type="dxa" w:w="1080"/>
             <w:vAlign w:val="center"/>
             <w:shd w:fill="FFFFFF"/>
             <w:tcBorders>
@@ -7519,13 +8515,13 @@
                 <w:color w:val="20242C"/>
                 <w:sz w:val="18"/>
               </w:rPr>
-              <w:t>風標獵核</w:t>
+              <w:t>Lv.3</w:t>
             </w:r>
           </w:p>
         </w:tc>
         <w:tc>
           <w:tcPr>
-            <w:tcW w:type="dxa" w:w="3528"/>
+            <w:tcW w:type="dxa" w:w="3600"/>
             <w:vAlign w:val="center"/>
             <w:shd w:fill="FFFFFF"/>
             <w:tcBorders>
@@ -7554,13 +8550,13 @@
                 <w:color w:val="20242C"/>
                 <w:sz w:val="18"/>
               </w:rPr>
-              <w:t>Hina、菲芮、諾嵐、索萊</w:t>
+              <w:t>2 專屬材料、660 經驗、1 通用印記</w:t>
             </w:r>
           </w:p>
         </w:tc>
         <w:tc>
           <w:tcPr>
-            <w:tcW w:type="dxa" w:w="2016"/>
+            <w:tcW w:type="dxa" w:w="2880"/>
             <w:vAlign w:val="center"/>
             <w:shd w:fill="FFFFFF"/>
             <w:tcBorders>
@@ -7589,7 +8585,7 @@
                 <w:color w:val="20242C"/>
                 <w:sz w:val="18"/>
               </w:rPr>
-              <w:t>三星 3 枚；四星 4 枚</w:t>
+              <w:t>風標獵核；通用印記可替代</w:t>
             </w:r>
           </w:p>
         </w:tc>
@@ -7597,7 +8593,7 @@
       <w:tr>
         <w:tc>
           <w:tcPr>
-            <w:tcW w:type="dxa" w:w="2016"/>
+            <w:tcW w:type="dxa" w:w="2088"/>
             <w:vAlign w:val="center"/>
             <w:shd w:fill="F4F7FB"/>
             <w:tcBorders>
@@ -7632,7 +8628,7 @@
         </w:tc>
         <w:tc>
           <w:tcPr>
-            <w:tcW w:type="dxa" w:w="1944"/>
+            <w:tcW w:type="dxa" w:w="1080"/>
             <w:vAlign w:val="center"/>
             <w:shd w:fill="F4F7FB"/>
             <w:tcBorders>
@@ -7661,13 +8657,13 @@
                 <w:color w:val="20242C"/>
                 <w:sz w:val="18"/>
               </w:rPr>
-              <w:t>霧鏡映核</w:t>
+              <w:t>Lv.3</w:t>
             </w:r>
           </w:p>
         </w:tc>
         <w:tc>
           <w:tcPr>
-            <w:tcW w:type="dxa" w:w="3528"/>
+            <w:tcW w:type="dxa" w:w="3600"/>
             <w:vAlign w:val="center"/>
             <w:shd w:fill="F4F7FB"/>
             <w:tcBorders>
@@ -7696,13 +8692,13 @@
                 <w:color w:val="20242C"/>
                 <w:sz w:val="18"/>
               </w:rPr>
-              <w:t>薇珂、梅芙、伊芙琳、霽羅、蘿堤亞、涅芙</w:t>
+              <w:t>2 專屬材料、660 經驗、1 通用印記</w:t>
             </w:r>
           </w:p>
         </w:tc>
         <w:tc>
           <w:tcPr>
-            <w:tcW w:type="dxa" w:w="2016"/>
+            <w:tcW w:type="dxa" w:w="2880"/>
             <w:vAlign w:val="center"/>
             <w:shd w:fill="F4F7FB"/>
             <w:tcBorders>
@@ -7731,7 +8727,7 @@
                 <w:color w:val="20242C"/>
                 <w:sz w:val="18"/>
               </w:rPr>
-              <w:t>三星 3 枚；四星 4 枚</w:t>
+              <w:t>霧鏡映核；通用印記可替代</w:t>
             </w:r>
           </w:p>
         </w:tc>
@@ -7753,7 +8749,21 @@
           <w:color w:val="20242C"/>
           <w:sz w:val="20"/>
         </w:rPr>
-        <w:t>每個 Boss 每版本最多成功領取 10 次獎勵；勝利取得 1 枚對應突破材料與 360 角色經驗，失敗不扣成功獎勵次數。</w:t>
+        <w:t>每個 Boss 每版本最多成功領取 10 次獎勵；Lv.3 的獎勵較多，但不是突破的唯一道路，失敗不扣成功獎勵次數。</w:t>
+      </w:r>
+    </w:p>
+    <w:p>
+      <w:pPr>
+        <w:pStyle w:val="ListBullet"/>
+        <w:spacing w:after="60" w:line="288" w:lineRule="auto"/>
+      </w:pPr>
+      <w:r>
+        <w:rPr>
+          <w:rFonts w:ascii="Microsoft JhengHei" w:hAnsi="Microsoft JhengHei" w:eastAsia="Microsoft JhengHei"/>
+          <w:color w:val="20242C"/>
+          <w:sz w:val="20"/>
+        </w:rPr>
+        <w:t>三星角色突破需要 3 枚材料，四星角色突破需要 4 枚材料；指定材料不足時可以用星界通用突破印記補足。</w:t>
       </w:r>
     </w:p>
     <w:p>
@@ -7781,8 +8791,1221 @@
           <w:color w:val="20242C"/>
           <w:sz w:val="20"/>
         </w:rPr>
-        <w:t>Boss 戰同樣採自走棋式自動戰鬥，推薦戰力只作參考；角色技能、元素、速度與隊伍協同會影響勝負。</w:t>
+        <w:t>Boss 戰同樣採自走棋式自動戰鬥，參考戰力只作提示；角色技能、元素、速度與隊伍協同會影響勝負。</w:t>
       </w:r>
+    </w:p>
+    <w:p>
+      <w:r>
+        <w:br w:type="page"/>
+      </w:r>
+    </w:p>
+    <w:p>
+      <w:pPr>
+        <w:pStyle w:val="Heading1"/>
+        <w:keepNext/>
+        <w:spacing w:before="240" w:after="100"/>
+      </w:pPr>
+      <w:r>
+        <w:rPr>
+          <w:rFonts w:ascii="Microsoft JhengHei" w:hAnsi="Microsoft JhengHei" w:eastAsia="Microsoft JhengHei"/>
+          <w:b/>
+          <w:color w:val="000000"/>
+          <w:sz w:val="36"/>
+        </w:rPr>
+        <w:t>星海迷航</w:t>
+      </w:r>
+    </w:p>
+    <w:p>
+      <w:pPr>
+        <w:spacing w:after="140" w:line="312" w:lineRule="auto"/>
+      </w:pPr>
+      <w:r>
+        <w:rPr>
+          <w:rFonts w:ascii="Microsoft JhengHei" w:hAnsi="Microsoft JhengHei" w:eastAsia="Microsoft JhengHei"/>
+          <w:b w:val="0"/>
+          <w:color w:val="20242C"/>
+          <w:sz w:val="21"/>
+        </w:rPr>
+        <w:t>星海迷航是獨立於主線的短局航程。玩家從三條航線中選擇一條，在戰鬥、事件、休整、商店和終端節點之間前進；臨時增益與碎片只在本次航程生效，不會污染角色與主線存檔。</w:t>
+      </w:r>
+    </w:p>
+    <w:tbl>
+      <w:tblPr>
+        <w:tblW w:type="auto" w:w="0"/>
+        <w:jc w:val="center"/>
+        <w:tblLayout w:type="fixed"/>
+        <w:tblLook w:firstColumn="1" w:firstRow="1" w:lastColumn="0" w:lastRow="0" w:noHBand="0" w:noVBand="1" w:val="04A0"/>
+      </w:tblPr>
+      <w:tblGrid>
+        <w:gridCol w:w="3389"/>
+        <w:gridCol w:w="3389"/>
+        <w:gridCol w:w="3389"/>
+      </w:tblGrid>
+      <w:tr>
+        <w:trPr>
+          <w:tblHeader w:val="true"/>
+        </w:trPr>
+        <w:tc>
+          <w:tcPr>
+            <w:tcW w:type="dxa" w:w="1872"/>
+            <w:vAlign w:val="center"/>
+            <w:shd w:fill="193B63"/>
+            <w:tcBorders>
+              <w:top w:val="single" w:sz="6" w:space="0" w:color="D9D9D9"/>
+              <w:left w:val="single" w:sz="6" w:space="0" w:color="D9D9D9"/>
+              <w:bottom w:val="single" w:sz="6" w:space="0" w:color="D9D9D9"/>
+              <w:right w:val="single" w:sz="6" w:space="0" w:color="D9D9D9"/>
+              <w:insideH w:val="single" w:sz="6" w:space="0" w:color="D9D9D9"/>
+              <w:insideV w:val="single" w:sz="6" w:space="0" w:color="D9D9D9"/>
+            </w:tcBorders>
+            <w:tcMar>
+              <w:top w:w="100" w:type="dxa"/>
+              <w:start w:w="120" w:type="dxa"/>
+              <w:bottom w:w="100" w:type="dxa"/>
+              <w:end w:w="120" w:type="dxa"/>
+            </w:tcMar>
+          </w:tcPr>
+          <w:p>
+            <w:pPr>
+              <w:jc w:val="left"/>
+            </w:pPr>
+            <w:r/>
+            <w:r>
+              <w:rPr>
+                <w:rFonts w:ascii="Microsoft JhengHei" w:hAnsi="Microsoft JhengHei" w:eastAsia="Microsoft JhengHei"/>
+                <w:b/>
+                <w:color w:val="FFFFFF"/>
+                <w:sz w:val="18"/>
+              </w:rPr>
+              <w:t>系統</w:t>
+            </w:r>
+          </w:p>
+        </w:tc>
+        <w:tc>
+          <w:tcPr>
+            <w:tcW w:type="dxa" w:w="5400"/>
+            <w:vAlign w:val="center"/>
+            <w:shd w:fill="193B63"/>
+            <w:tcBorders>
+              <w:top w:val="single" w:sz="6" w:space="0" w:color="D9D9D9"/>
+              <w:left w:val="single" w:sz="6" w:space="0" w:color="D9D9D9"/>
+              <w:bottom w:val="single" w:sz="6" w:space="0" w:color="D9D9D9"/>
+              <w:right w:val="single" w:sz="6" w:space="0" w:color="D9D9D9"/>
+              <w:insideH w:val="single" w:sz="6" w:space="0" w:color="D9D9D9"/>
+              <w:insideV w:val="single" w:sz="6" w:space="0" w:color="D9D9D9"/>
+            </w:tcBorders>
+            <w:tcMar>
+              <w:top w:w="100" w:type="dxa"/>
+              <w:start w:w="120" w:type="dxa"/>
+              <w:bottom w:w="100" w:type="dxa"/>
+              <w:end w:w="120" w:type="dxa"/>
+            </w:tcMar>
+          </w:tcPr>
+          <w:p>
+            <w:pPr>
+              <w:jc w:val="left"/>
+            </w:pPr>
+            <w:r/>
+            <w:r>
+              <w:rPr>
+                <w:rFonts w:ascii="Microsoft JhengHei" w:hAnsi="Microsoft JhengHei" w:eastAsia="Microsoft JhengHei"/>
+                <w:b/>
+                <w:color w:val="FFFFFF"/>
+                <w:sz w:val="18"/>
+              </w:rPr>
+              <w:t>內容</w:t>
+            </w:r>
+          </w:p>
+        </w:tc>
+        <w:tc>
+          <w:tcPr>
+            <w:tcW w:type="dxa" w:w="2376"/>
+            <w:vAlign w:val="center"/>
+            <w:shd w:fill="193B63"/>
+            <w:tcBorders>
+              <w:top w:val="single" w:sz="6" w:space="0" w:color="D9D9D9"/>
+              <w:left w:val="single" w:sz="6" w:space="0" w:color="D9D9D9"/>
+              <w:bottom w:val="single" w:sz="6" w:space="0" w:color="D9D9D9"/>
+              <w:right w:val="single" w:sz="6" w:space="0" w:color="D9D9D9"/>
+              <w:insideH w:val="single" w:sz="6" w:space="0" w:color="D9D9D9"/>
+              <w:insideV w:val="single" w:sz="6" w:space="0" w:color="D9D9D9"/>
+            </w:tcBorders>
+            <w:tcMar>
+              <w:top w:w="100" w:type="dxa"/>
+              <w:start w:w="120" w:type="dxa"/>
+              <w:bottom w:w="100" w:type="dxa"/>
+              <w:end w:w="120" w:type="dxa"/>
+            </w:tcMar>
+          </w:tcPr>
+          <w:p>
+            <w:pPr>
+              <w:jc w:val="left"/>
+            </w:pPr>
+            <w:r/>
+            <w:r>
+              <w:rPr>
+                <w:rFonts w:ascii="Microsoft JhengHei" w:hAnsi="Microsoft JhengHei" w:eastAsia="Microsoft JhengHei"/>
+                <w:b/>
+                <w:color w:val="FFFFFF"/>
+                <w:sz w:val="18"/>
+              </w:rPr>
+              <w:t>獎勵</w:t>
+            </w:r>
+          </w:p>
+        </w:tc>
+      </w:tr>
+      <w:tr>
+        <w:tc>
+          <w:tcPr>
+            <w:tcW w:type="dxa" w:w="1872"/>
+            <w:vAlign w:val="center"/>
+            <w:shd w:fill="FFFFFF"/>
+            <w:tcBorders>
+              <w:top w:val="single" w:sz="6" w:space="0" w:color="D9D9D9"/>
+              <w:left w:val="single" w:sz="6" w:space="0" w:color="D9D9D9"/>
+              <w:bottom w:val="single" w:sz="6" w:space="0" w:color="D9D9D9"/>
+              <w:right w:val="single" w:sz="6" w:space="0" w:color="D9D9D9"/>
+              <w:insideH w:val="single" w:sz="6" w:space="0" w:color="D9D9D9"/>
+              <w:insideV w:val="single" w:sz="6" w:space="0" w:color="D9D9D9"/>
+            </w:tcBorders>
+            <w:tcMar>
+              <w:top w:w="100" w:type="dxa"/>
+              <w:start w:w="120" w:type="dxa"/>
+              <w:bottom w:w="100" w:type="dxa"/>
+              <w:end w:w="120" w:type="dxa"/>
+            </w:tcMar>
+          </w:tcPr>
+          <w:p>
+            <w:pPr>
+              <w:spacing w:after="20" w:line="276" w:lineRule="auto"/>
+            </w:pPr>
+            <w:r/>
+            <w:r>
+              <w:rPr>
+                <w:rFonts w:ascii="Microsoft JhengHei" w:hAnsi="Microsoft JhengHei" w:eastAsia="Microsoft JhengHei"/>
+                <w:color w:val="20242C"/>
+                <w:sz w:val="18"/>
+              </w:rPr>
+              <w:t>回聲航線</w:t>
+            </w:r>
+          </w:p>
+        </w:tc>
+        <w:tc>
+          <w:tcPr>
+            <w:tcW w:type="dxa" w:w="5400"/>
+            <w:vAlign w:val="center"/>
+            <w:shd w:fill="FFFFFF"/>
+            <w:tcBorders>
+              <w:top w:val="single" w:sz="6" w:space="0" w:color="D9D9D9"/>
+              <w:left w:val="single" w:sz="6" w:space="0" w:color="D9D9D9"/>
+              <w:bottom w:val="single" w:sz="6" w:space="0" w:color="D9D9D9"/>
+              <w:right w:val="single" w:sz="6" w:space="0" w:color="D9D9D9"/>
+              <w:insideH w:val="single" w:sz="6" w:space="0" w:color="D9D9D9"/>
+              <w:insideV w:val="single" w:sz="6" w:space="0" w:color="D9D9D9"/>
+            </w:tcBorders>
+            <w:tcMar>
+              <w:top w:w="100" w:type="dxa"/>
+              <w:start w:w="120" w:type="dxa"/>
+              <w:bottom w:w="100" w:type="dxa"/>
+              <w:end w:w="120" w:type="dxa"/>
+            </w:tcMar>
+          </w:tcPr>
+          <w:p>
+            <w:pPr>
+              <w:spacing w:after="20" w:line="276" w:lineRule="auto"/>
+            </w:pPr>
+            <w:r/>
+            <w:r>
+              <w:rPr>
+                <w:rFonts w:ascii="Microsoft JhengHei" w:hAnsi="Microsoft JhengHei" w:eastAsia="Microsoft JhengHei"/>
+                <w:color w:val="20242C"/>
+                <w:sz w:val="18"/>
+              </w:rPr>
+              <w:t>收集回聲並調和不同星級隊伍</w:t>
+            </w:r>
+          </w:p>
+        </w:tc>
+        <w:tc>
+          <w:tcPr>
+            <w:tcW w:type="dxa" w:w="2376"/>
+            <w:vAlign w:val="center"/>
+            <w:shd w:fill="FFFFFF"/>
+            <w:tcBorders>
+              <w:top w:val="single" w:sz="6" w:space="0" w:color="D9D9D9"/>
+              <w:left w:val="single" w:sz="6" w:space="0" w:color="D9D9D9"/>
+              <w:bottom w:val="single" w:sz="6" w:space="0" w:color="D9D9D9"/>
+              <w:right w:val="single" w:sz="6" w:space="0" w:color="D9D9D9"/>
+              <w:insideH w:val="single" w:sz="6" w:space="0" w:color="D9D9D9"/>
+              <w:insideV w:val="single" w:sz="6" w:space="0" w:color="D9D9D9"/>
+            </w:tcBorders>
+            <w:tcMar>
+              <w:top w:w="100" w:type="dxa"/>
+              <w:start w:w="120" w:type="dxa"/>
+              <w:bottom w:w="100" w:type="dxa"/>
+              <w:end w:w="120" w:type="dxa"/>
+            </w:tcMar>
+          </w:tcPr>
+          <w:p>
+            <w:pPr>
+              <w:spacing w:after="20" w:line="276" w:lineRule="auto"/>
+            </w:pPr>
+            <w:r/>
+            <w:r>
+              <w:rPr>
+                <w:rFonts w:ascii="Microsoft JhengHei" w:hAnsi="Microsoft JhengHei" w:eastAsia="Microsoft JhengHei"/>
+                <w:color w:val="20242C"/>
+                <w:sz w:val="18"/>
+              </w:rPr>
+              <w:t>普通或特殊結局</w:t>
+            </w:r>
+          </w:p>
+        </w:tc>
+      </w:tr>
+      <w:tr>
+        <w:tc>
+          <w:tcPr>
+            <w:tcW w:type="dxa" w:w="1872"/>
+            <w:vAlign w:val="center"/>
+            <w:shd w:fill="F4F7FB"/>
+            <w:tcBorders>
+              <w:top w:val="single" w:sz="6" w:space="0" w:color="D9D9D9"/>
+              <w:left w:val="single" w:sz="6" w:space="0" w:color="D9D9D9"/>
+              <w:bottom w:val="single" w:sz="6" w:space="0" w:color="D9D9D9"/>
+              <w:right w:val="single" w:sz="6" w:space="0" w:color="D9D9D9"/>
+              <w:insideH w:val="single" w:sz="6" w:space="0" w:color="D9D9D9"/>
+              <w:insideV w:val="single" w:sz="6" w:space="0" w:color="D9D9D9"/>
+            </w:tcBorders>
+            <w:tcMar>
+              <w:top w:w="100" w:type="dxa"/>
+              <w:start w:w="120" w:type="dxa"/>
+              <w:bottom w:w="100" w:type="dxa"/>
+              <w:end w:w="120" w:type="dxa"/>
+            </w:tcMar>
+          </w:tcPr>
+          <w:p>
+            <w:pPr>
+              <w:spacing w:after="20" w:line="276" w:lineRule="auto"/>
+            </w:pPr>
+            <w:r/>
+            <w:r>
+              <w:rPr>
+                <w:rFonts w:ascii="Microsoft JhengHei" w:hAnsi="Microsoft JhengHei" w:eastAsia="Microsoft JhengHei"/>
+                <w:color w:val="20242C"/>
+                <w:sz w:val="18"/>
+              </w:rPr>
+              <w:t>漂流商路</w:t>
+            </w:r>
+          </w:p>
+        </w:tc>
+        <w:tc>
+          <w:tcPr>
+            <w:tcW w:type="dxa" w:w="5400"/>
+            <w:vAlign w:val="center"/>
+            <w:shd w:fill="F4F7FB"/>
+            <w:tcBorders>
+              <w:top w:val="single" w:sz="6" w:space="0" w:color="D9D9D9"/>
+              <w:left w:val="single" w:sz="6" w:space="0" w:color="D9D9D9"/>
+              <w:bottom w:val="single" w:sz="6" w:space="0" w:color="D9D9D9"/>
+              <w:right w:val="single" w:sz="6" w:space="0" w:color="D9D9D9"/>
+              <w:insideH w:val="single" w:sz="6" w:space="0" w:color="D9D9D9"/>
+              <w:insideV w:val="single" w:sz="6" w:space="0" w:color="D9D9D9"/>
+            </w:tcBorders>
+            <w:tcMar>
+              <w:top w:w="100" w:type="dxa"/>
+              <w:start w:w="120" w:type="dxa"/>
+              <w:bottom w:w="100" w:type="dxa"/>
+              <w:end w:w="120" w:type="dxa"/>
+            </w:tcMar>
+          </w:tcPr>
+          <w:p>
+            <w:pPr>
+              <w:spacing w:after="20" w:line="276" w:lineRule="auto"/>
+            </w:pPr>
+            <w:r/>
+            <w:r>
+              <w:rPr>
+                <w:rFonts w:ascii="Microsoft JhengHei" w:hAnsi="Microsoft JhengHei" w:eastAsia="Microsoft JhengHei"/>
+                <w:color w:val="20242C"/>
+                <w:sz w:val="18"/>
+              </w:rPr>
+              <w:t>用碎片購買臨時增益，安排終局爆發</w:t>
+            </w:r>
+          </w:p>
+        </w:tc>
+        <w:tc>
+          <w:tcPr>
+            <w:tcW w:type="dxa" w:w="2376"/>
+            <w:vAlign w:val="center"/>
+            <w:shd w:fill="F4F7FB"/>
+            <w:tcBorders>
+              <w:top w:val="single" w:sz="6" w:space="0" w:color="D9D9D9"/>
+              <w:left w:val="single" w:sz="6" w:space="0" w:color="D9D9D9"/>
+              <w:bottom w:val="single" w:sz="6" w:space="0" w:color="D9D9D9"/>
+              <w:right w:val="single" w:sz="6" w:space="0" w:color="D9D9D9"/>
+              <w:insideH w:val="single" w:sz="6" w:space="0" w:color="D9D9D9"/>
+              <w:insideV w:val="single" w:sz="6" w:space="0" w:color="D9D9D9"/>
+            </w:tcBorders>
+            <w:tcMar>
+              <w:top w:w="100" w:type="dxa"/>
+              <w:start w:w="120" w:type="dxa"/>
+              <w:bottom w:w="100" w:type="dxa"/>
+              <w:end w:w="120" w:type="dxa"/>
+            </w:tcMar>
+          </w:tcPr>
+          <w:p>
+            <w:pPr>
+              <w:spacing w:after="20" w:line="276" w:lineRule="auto"/>
+            </w:pPr>
+            <w:r/>
+            <w:r>
+              <w:rPr>
+                <w:rFonts w:ascii="Microsoft JhengHei" w:hAnsi="Microsoft JhengHei" w:eastAsia="Microsoft JhengHei"/>
+                <w:color w:val="20242C"/>
+                <w:sz w:val="18"/>
+              </w:rPr>
+              <w:t>普通或隱藏結局</w:t>
+            </w:r>
+          </w:p>
+        </w:tc>
+      </w:tr>
+      <w:tr>
+        <w:tc>
+          <w:tcPr>
+            <w:tcW w:type="dxa" w:w="1872"/>
+            <w:vAlign w:val="center"/>
+            <w:shd w:fill="FFFFFF"/>
+            <w:tcBorders>
+              <w:top w:val="single" w:sz="6" w:space="0" w:color="D9D9D9"/>
+              <w:left w:val="single" w:sz="6" w:space="0" w:color="D9D9D9"/>
+              <w:bottom w:val="single" w:sz="6" w:space="0" w:color="D9D9D9"/>
+              <w:right w:val="single" w:sz="6" w:space="0" w:color="D9D9D9"/>
+              <w:insideH w:val="single" w:sz="6" w:space="0" w:color="D9D9D9"/>
+              <w:insideV w:val="single" w:sz="6" w:space="0" w:color="D9D9D9"/>
+            </w:tcBorders>
+            <w:tcMar>
+              <w:top w:w="100" w:type="dxa"/>
+              <w:start w:w="120" w:type="dxa"/>
+              <w:bottom w:w="100" w:type="dxa"/>
+              <w:end w:w="120" w:type="dxa"/>
+            </w:tcMar>
+          </w:tcPr>
+          <w:p>
+            <w:pPr>
+              <w:spacing w:after="20" w:line="276" w:lineRule="auto"/>
+            </w:pPr>
+            <w:r/>
+            <w:r>
+              <w:rPr>
+                <w:rFonts w:ascii="Microsoft JhengHei" w:hAnsi="Microsoft JhengHei" w:eastAsia="Microsoft JhengHei"/>
+                <w:color w:val="20242C"/>
+                <w:sz w:val="18"/>
+              </w:rPr>
+              <w:t>無名檔案線</w:t>
+            </w:r>
+          </w:p>
+        </w:tc>
+        <w:tc>
+          <w:tcPr>
+            <w:tcW w:type="dxa" w:w="5400"/>
+            <w:vAlign w:val="center"/>
+            <w:shd w:fill="FFFFFF"/>
+            <w:tcBorders>
+              <w:top w:val="single" w:sz="6" w:space="0" w:color="D9D9D9"/>
+              <w:left w:val="single" w:sz="6" w:space="0" w:color="D9D9D9"/>
+              <w:bottom w:val="single" w:sz="6" w:space="0" w:color="D9D9D9"/>
+              <w:right w:val="single" w:sz="6" w:space="0" w:color="D9D9D9"/>
+              <w:insideH w:val="single" w:sz="6" w:space="0" w:color="D9D9D9"/>
+              <w:insideV w:val="single" w:sz="6" w:space="0" w:color="D9D9D9"/>
+            </w:tcBorders>
+            <w:tcMar>
+              <w:top w:w="100" w:type="dxa"/>
+              <w:start w:w="120" w:type="dxa"/>
+              <w:bottom w:w="100" w:type="dxa"/>
+              <w:end w:w="120" w:type="dxa"/>
+            </w:tcMar>
+          </w:tcPr>
+          <w:p>
+            <w:pPr>
+              <w:spacing w:after="20" w:line="276" w:lineRule="auto"/>
+            </w:pPr>
+            <w:r/>
+            <w:r>
+              <w:rPr>
+                <w:rFonts w:ascii="Microsoft JhengHei" w:hAnsi="Microsoft JhengHei" w:eastAsia="Microsoft JhengHei"/>
+                <w:color w:val="20242C"/>
+                <w:sz w:val="18"/>
+              </w:rPr>
+              <w:t>讀取空白頁、開啟檔案門</w:t>
+            </w:r>
+          </w:p>
+        </w:tc>
+        <w:tc>
+          <w:tcPr>
+            <w:tcW w:type="dxa" w:w="2376"/>
+            <w:vAlign w:val="center"/>
+            <w:shd w:fill="FFFFFF"/>
+            <w:tcBorders>
+              <w:top w:val="single" w:sz="6" w:space="0" w:color="D9D9D9"/>
+              <w:left w:val="single" w:sz="6" w:space="0" w:color="D9D9D9"/>
+              <w:bottom w:val="single" w:sz="6" w:space="0" w:color="D9D9D9"/>
+              <w:right w:val="single" w:sz="6" w:space="0" w:color="D9D9D9"/>
+              <w:insideH w:val="single" w:sz="6" w:space="0" w:color="D9D9D9"/>
+              <w:insideV w:val="single" w:sz="6" w:space="0" w:color="D9D9D9"/>
+            </w:tcBorders>
+            <w:tcMar>
+              <w:top w:w="100" w:type="dxa"/>
+              <w:start w:w="120" w:type="dxa"/>
+              <w:bottom w:w="100" w:type="dxa"/>
+              <w:end w:w="120" w:type="dxa"/>
+            </w:tcMar>
+          </w:tcPr>
+          <w:p>
+            <w:pPr>
+              <w:spacing w:after="20" w:line="276" w:lineRule="auto"/>
+            </w:pPr>
+            <w:r/>
+            <w:r>
+              <w:rPr>
+                <w:rFonts w:ascii="Microsoft JhengHei" w:hAnsi="Microsoft JhengHei" w:eastAsia="Microsoft JhengHei"/>
+                <w:color w:val="20242C"/>
+                <w:sz w:val="18"/>
+              </w:rPr>
+              <w:t>隱藏結局</w:t>
+            </w:r>
+          </w:p>
+        </w:tc>
+      </w:tr>
+      <w:tr>
+        <w:tc>
+          <w:tcPr>
+            <w:tcW w:type="dxa" w:w="1872"/>
+            <w:vAlign w:val="center"/>
+            <w:shd w:fill="F4F7FB"/>
+            <w:tcBorders>
+              <w:top w:val="single" w:sz="6" w:space="0" w:color="D9D9D9"/>
+              <w:left w:val="single" w:sz="6" w:space="0" w:color="D9D9D9"/>
+              <w:bottom w:val="single" w:sz="6" w:space="0" w:color="D9D9D9"/>
+              <w:right w:val="single" w:sz="6" w:space="0" w:color="D9D9D9"/>
+              <w:insideH w:val="single" w:sz="6" w:space="0" w:color="D9D9D9"/>
+              <w:insideV w:val="single" w:sz="6" w:space="0" w:color="D9D9D9"/>
+            </w:tcBorders>
+            <w:tcMar>
+              <w:top w:w="100" w:type="dxa"/>
+              <w:start w:w="120" w:type="dxa"/>
+              <w:bottom w:w="100" w:type="dxa"/>
+              <w:end w:w="120" w:type="dxa"/>
+            </w:tcMar>
+          </w:tcPr>
+          <w:p>
+            <w:pPr>
+              <w:spacing w:after="20" w:line="276" w:lineRule="auto"/>
+            </w:pPr>
+            <w:r/>
+            <w:r>
+              <w:rPr>
+                <w:rFonts w:ascii="Microsoft JhengHei" w:hAnsi="Microsoft JhengHei" w:eastAsia="Microsoft JhengHei"/>
+                <w:color w:val="20242C"/>
+                <w:sz w:val="18"/>
+              </w:rPr>
+              <w:t>版本獎勵</w:t>
+            </w:r>
+          </w:p>
+        </w:tc>
+        <w:tc>
+          <w:tcPr>
+            <w:tcW w:type="dxa" w:w="5400"/>
+            <w:vAlign w:val="center"/>
+            <w:shd w:fill="F4F7FB"/>
+            <w:tcBorders>
+              <w:top w:val="single" w:sz="6" w:space="0" w:color="D9D9D9"/>
+              <w:left w:val="single" w:sz="6" w:space="0" w:color="D9D9D9"/>
+              <w:bottom w:val="single" w:sz="6" w:space="0" w:color="D9D9D9"/>
+              <w:right w:val="single" w:sz="6" w:space="0" w:color="D9D9D9"/>
+              <w:insideH w:val="single" w:sz="6" w:space="0" w:color="D9D9D9"/>
+              <w:insideV w:val="single" w:sz="6" w:space="0" w:color="D9D9D9"/>
+            </w:tcBorders>
+            <w:tcMar>
+              <w:top w:w="100" w:type="dxa"/>
+              <w:start w:w="120" w:type="dxa"/>
+              <w:bottom w:w="100" w:type="dxa"/>
+              <w:end w:w="120" w:type="dxa"/>
+            </w:tcMar>
+          </w:tcPr>
+          <w:p>
+            <w:pPr>
+              <w:spacing w:after="20" w:line="276" w:lineRule="auto"/>
+            </w:pPr>
+            <w:r/>
+            <w:r>
+              <w:rPr>
+                <w:rFonts w:ascii="Microsoft JhengHei" w:hAnsi="Microsoft JhengHei" w:eastAsia="Microsoft JhengHei"/>
+                <w:color w:val="20242C"/>
+                <w:sz w:val="18"/>
+              </w:rPr>
+              <w:t>普通、隱藏、特殊結局各版本領一次</w:t>
+            </w:r>
+          </w:p>
+        </w:tc>
+        <w:tc>
+          <w:tcPr>
+            <w:tcW w:type="dxa" w:w="2376"/>
+            <w:vAlign w:val="center"/>
+            <w:shd w:fill="F4F7FB"/>
+            <w:tcBorders>
+              <w:top w:val="single" w:sz="6" w:space="0" w:color="D9D9D9"/>
+              <w:left w:val="single" w:sz="6" w:space="0" w:color="D9D9D9"/>
+              <w:bottom w:val="single" w:sz="6" w:space="0" w:color="D9D9D9"/>
+              <w:right w:val="single" w:sz="6" w:space="0" w:color="D9D9D9"/>
+              <w:insideH w:val="single" w:sz="6" w:space="0" w:color="D9D9D9"/>
+              <w:insideV w:val="single" w:sz="6" w:space="0" w:color="D9D9D9"/>
+            </w:tcBorders>
+            <w:tcMar>
+              <w:top w:w="100" w:type="dxa"/>
+              <w:start w:w="120" w:type="dxa"/>
+              <w:bottom w:w="100" w:type="dxa"/>
+              <w:end w:w="120" w:type="dxa"/>
+            </w:tcMar>
+          </w:tcPr>
+          <w:p>
+            <w:pPr>
+              <w:spacing w:after="20" w:line="276" w:lineRule="auto"/>
+            </w:pPr>
+            <w:r/>
+            <w:r>
+              <w:rPr>
+                <w:rFonts w:ascii="Microsoft JhengHei" w:hAnsi="Microsoft JhengHei" w:eastAsia="Microsoft JhengHei"/>
+                <w:color w:val="20242C"/>
+                <w:sz w:val="18"/>
+              </w:rPr>
+              <w:t>星砂、角色經驗、通用資源</w:t>
+            </w:r>
+          </w:p>
+        </w:tc>
+      </w:tr>
+      <w:tr>
+        <w:tc>
+          <w:tcPr>
+            <w:tcW w:type="dxa" w:w="1872"/>
+            <w:vAlign w:val="center"/>
+            <w:shd w:fill="FFFFFF"/>
+            <w:tcBorders>
+              <w:top w:val="single" w:sz="6" w:space="0" w:color="D9D9D9"/>
+              <w:left w:val="single" w:sz="6" w:space="0" w:color="D9D9D9"/>
+              <w:bottom w:val="single" w:sz="6" w:space="0" w:color="D9D9D9"/>
+              <w:right w:val="single" w:sz="6" w:space="0" w:color="D9D9D9"/>
+              <w:insideH w:val="single" w:sz="6" w:space="0" w:color="D9D9D9"/>
+              <w:insideV w:val="single" w:sz="6" w:space="0" w:color="D9D9D9"/>
+            </w:tcBorders>
+            <w:tcMar>
+              <w:top w:w="100" w:type="dxa"/>
+              <w:start w:w="120" w:type="dxa"/>
+              <w:bottom w:w="100" w:type="dxa"/>
+              <w:end w:w="120" w:type="dxa"/>
+            </w:tcMar>
+          </w:tcPr>
+          <w:p>
+            <w:pPr>
+              <w:spacing w:after="20" w:line="276" w:lineRule="auto"/>
+            </w:pPr>
+            <w:r/>
+            <w:r>
+              <w:rPr>
+                <w:rFonts w:ascii="Microsoft JhengHei" w:hAnsi="Microsoft JhengHei" w:eastAsia="Microsoft JhengHei"/>
+                <w:color w:val="20242C"/>
+                <w:sz w:val="18"/>
+              </w:rPr>
+              <w:t>季節裝扮</w:t>
+            </w:r>
+          </w:p>
+        </w:tc>
+        <w:tc>
+          <w:tcPr>
+            <w:tcW w:type="dxa" w:w="5400"/>
+            <w:vAlign w:val="center"/>
+            <w:shd w:fill="FFFFFF"/>
+            <w:tcBorders>
+              <w:top w:val="single" w:sz="6" w:space="0" w:color="D9D9D9"/>
+              <w:left w:val="single" w:sz="6" w:space="0" w:color="D9D9D9"/>
+              <w:bottom w:val="single" w:sz="6" w:space="0" w:color="D9D9D9"/>
+              <w:right w:val="single" w:sz="6" w:space="0" w:color="D9D9D9"/>
+              <w:insideH w:val="single" w:sz="6" w:space="0" w:color="D9D9D9"/>
+              <w:insideV w:val="single" w:sz="6" w:space="0" w:color="D9D9D9"/>
+            </w:tcBorders>
+            <w:tcMar>
+              <w:top w:w="100" w:type="dxa"/>
+              <w:start w:w="120" w:type="dxa"/>
+              <w:bottom w:w="100" w:type="dxa"/>
+              <w:end w:w="120" w:type="dxa"/>
+            </w:tcMar>
+          </w:tcPr>
+          <w:p>
+            <w:pPr>
+              <w:spacing w:after="20" w:line="276" w:lineRule="auto"/>
+            </w:pPr>
+            <w:r/>
+            <w:r>
+              <w:rPr>
+                <w:rFonts w:ascii="Microsoft JhengHei" w:hAnsi="Microsoft JhengHei" w:eastAsia="Microsoft JhengHei"/>
+                <w:color w:val="20242C"/>
+                <w:sz w:val="18"/>
+              </w:rPr>
+              <w:t>特殊結局完成後解鎖當期一名四星裝扮</w:t>
+            </w:r>
+          </w:p>
+        </w:tc>
+        <w:tc>
+          <w:tcPr>
+            <w:tcW w:type="dxa" w:w="2376"/>
+            <w:vAlign w:val="center"/>
+            <w:shd w:fill="FFFFFF"/>
+            <w:tcBorders>
+              <w:top w:val="single" w:sz="6" w:space="0" w:color="D9D9D9"/>
+              <w:left w:val="single" w:sz="6" w:space="0" w:color="D9D9D9"/>
+              <w:bottom w:val="single" w:sz="6" w:space="0" w:color="D9D9D9"/>
+              <w:right w:val="single" w:sz="6" w:space="0" w:color="D9D9D9"/>
+              <w:insideH w:val="single" w:sz="6" w:space="0" w:color="D9D9D9"/>
+              <w:insideV w:val="single" w:sz="6" w:space="0" w:color="D9D9D9"/>
+            </w:tcBorders>
+            <w:tcMar>
+              <w:top w:w="100" w:type="dxa"/>
+              <w:start w:w="120" w:type="dxa"/>
+              <w:bottom w:w="100" w:type="dxa"/>
+              <w:end w:w="120" w:type="dxa"/>
+            </w:tcMar>
+          </w:tcPr>
+          <w:p>
+            <w:pPr>
+              <w:spacing w:after="20" w:line="276" w:lineRule="auto"/>
+            </w:pPr>
+            <w:r/>
+            <w:r>
+              <w:rPr>
+                <w:rFonts w:ascii="Microsoft JhengHei" w:hAnsi="Microsoft JhengHei" w:eastAsia="Microsoft JhengHei"/>
+                <w:color w:val="20242C"/>
+                <w:sz w:val="18"/>
+              </w:rPr>
+              <w:t>2.0–2.5：梅芙「流光檔案裝」</w:t>
+            </w:r>
+          </w:p>
+        </w:tc>
+      </w:tr>
+    </w:tbl>
+    <w:p>
+      <w:pPr>
+        <w:spacing w:after="20"/>
+      </w:pPr>
+    </w:p>
+    <w:p>
+      <w:pPr>
+        <w:pStyle w:val="ListBullet"/>
+        <w:spacing w:after="60" w:line="288" w:lineRule="auto"/>
+      </w:pPr>
+      <w:r>
+        <w:rPr>
+          <w:rFonts w:ascii="Microsoft JhengHei" w:hAnsi="Microsoft JhengHei" w:eastAsia="Microsoft JhengHei"/>
+          <w:color w:val="20242C"/>
+          <w:sz w:val="20"/>
+        </w:rPr>
+        <w:t>特殊結局需要三星與四星混編並完成協鳴條件；隱藏結局需要檔案線索或足夠回聲。</w:t>
+      </w:r>
+    </w:p>
+    <w:p>
+      <w:pPr>
+        <w:pStyle w:val="ListBullet"/>
+        <w:spacing w:after="60" w:line="288" w:lineRule="auto"/>
+      </w:pPr>
+      <w:r>
+        <w:rPr>
+          <w:rFonts w:ascii="Microsoft JhengHei" w:hAnsi="Microsoft JhengHei" w:eastAsia="Microsoft JhengHei"/>
+          <w:color w:val="20242C"/>
+          <w:sz w:val="20"/>
+        </w:rPr>
+        <w:t>航程失敗可以重新開始；版本更新只重置航程、結局領取紀錄與臨時進度，不重置角色。</w:t>
+      </w:r>
+    </w:p>
+    <w:p>
+      <w:pPr>
+        <w:pStyle w:val="Heading1"/>
+        <w:keepNext/>
+        <w:spacing w:before="240" w:after="100"/>
+      </w:pPr>
+      <w:r>
+        <w:rPr>
+          <w:rFonts w:ascii="Microsoft JhengHei" w:hAnsi="Microsoft JhengHei" w:eastAsia="Microsoft JhengHei"/>
+          <w:b/>
+          <w:color w:val="000000"/>
+          <w:sz w:val="36"/>
+        </w:rPr>
+        <w:t>星伴培育</w:t>
+      </w:r>
+    </w:p>
+    <w:p>
+      <w:pPr>
+        <w:spacing w:after="140" w:line="312" w:lineRule="auto"/>
+      </w:pPr>
+      <w:r>
+        <w:rPr>
+          <w:rFonts w:ascii="Microsoft JhengHei" w:hAnsi="Microsoft JhengHei" w:eastAsia="Microsoft JhengHei"/>
+          <w:b w:val="0"/>
+          <w:color w:val="20242C"/>
+          <w:sz w:val="21"/>
+        </w:rPr>
+        <w:t>星伴培育是與主線和角色養成分開的寵物收藏系統。玩家可領養、餵食、玩耍、訓練與探索寵物，並替寵物設定裝扮與出場特效。</w:t>
+      </w:r>
+    </w:p>
+    <w:tbl>
+      <w:tblPr>
+        <w:tblW w:type="auto" w:w="0"/>
+        <w:jc w:val="center"/>
+        <w:tblLayout w:type="fixed"/>
+        <w:tblLook w:firstColumn="1" w:firstRow="1" w:lastColumn="0" w:lastRow="0" w:noHBand="0" w:noVBand="1" w:val="04A0"/>
+      </w:tblPr>
+      <w:tblGrid>
+        <w:gridCol w:w="5083"/>
+        <w:gridCol w:w="5083"/>
+      </w:tblGrid>
+      <w:tr>
+        <w:trPr>
+          <w:tblHeader w:val="true"/>
+        </w:trPr>
+        <w:tc>
+          <w:tcPr>
+            <w:tcW w:type="dxa" w:w="2088"/>
+            <w:vAlign w:val="center"/>
+            <w:shd w:fill="193B63"/>
+            <w:tcBorders>
+              <w:top w:val="single" w:sz="6" w:space="0" w:color="D9D9D9"/>
+              <w:left w:val="single" w:sz="6" w:space="0" w:color="D9D9D9"/>
+              <w:bottom w:val="single" w:sz="6" w:space="0" w:color="D9D9D9"/>
+              <w:right w:val="single" w:sz="6" w:space="0" w:color="D9D9D9"/>
+              <w:insideH w:val="single" w:sz="6" w:space="0" w:color="D9D9D9"/>
+              <w:insideV w:val="single" w:sz="6" w:space="0" w:color="D9D9D9"/>
+            </w:tcBorders>
+            <w:tcMar>
+              <w:top w:w="100" w:type="dxa"/>
+              <w:start w:w="120" w:type="dxa"/>
+              <w:bottom w:w="100" w:type="dxa"/>
+              <w:end w:w="120" w:type="dxa"/>
+            </w:tcMar>
+          </w:tcPr>
+          <w:p>
+            <w:pPr>
+              <w:jc w:val="left"/>
+            </w:pPr>
+            <w:r/>
+            <w:r>
+              <w:rPr>
+                <w:rFonts w:ascii="Microsoft JhengHei" w:hAnsi="Microsoft JhengHei" w:eastAsia="Microsoft JhengHei"/>
+                <w:b/>
+                <w:color w:val="FFFFFF"/>
+                <w:sz w:val="18"/>
+              </w:rPr>
+              <w:t>項目</w:t>
+            </w:r>
+          </w:p>
+        </w:tc>
+        <w:tc>
+          <w:tcPr>
+            <w:tcW w:type="dxa" w:w="7560"/>
+            <w:vAlign w:val="center"/>
+            <w:shd w:fill="193B63"/>
+            <w:tcBorders>
+              <w:top w:val="single" w:sz="6" w:space="0" w:color="D9D9D9"/>
+              <w:left w:val="single" w:sz="6" w:space="0" w:color="D9D9D9"/>
+              <w:bottom w:val="single" w:sz="6" w:space="0" w:color="D9D9D9"/>
+              <w:right w:val="single" w:sz="6" w:space="0" w:color="D9D9D9"/>
+              <w:insideH w:val="single" w:sz="6" w:space="0" w:color="D9D9D9"/>
+              <w:insideV w:val="single" w:sz="6" w:space="0" w:color="D9D9D9"/>
+            </w:tcBorders>
+            <w:tcMar>
+              <w:top w:w="100" w:type="dxa"/>
+              <w:start w:w="120" w:type="dxa"/>
+              <w:bottom w:w="100" w:type="dxa"/>
+              <w:end w:w="120" w:type="dxa"/>
+            </w:tcMar>
+          </w:tcPr>
+          <w:p>
+            <w:pPr>
+              <w:jc w:val="left"/>
+            </w:pPr>
+            <w:r/>
+            <w:r>
+              <w:rPr>
+                <w:rFonts w:ascii="Microsoft JhengHei" w:hAnsi="Microsoft JhengHei" w:eastAsia="Microsoft JhengHei"/>
+                <w:b/>
+                <w:color w:val="FFFFFF"/>
+                <w:sz w:val="18"/>
+              </w:rPr>
+              <w:t>規則</w:t>
+            </w:r>
+          </w:p>
+        </w:tc>
+      </w:tr>
+      <w:tr>
+        <w:tc>
+          <w:tcPr>
+            <w:tcW w:type="dxa" w:w="2088"/>
+            <w:vAlign w:val="center"/>
+            <w:shd w:fill="FFFFFF"/>
+            <w:tcBorders>
+              <w:top w:val="single" w:sz="6" w:space="0" w:color="D9D9D9"/>
+              <w:left w:val="single" w:sz="6" w:space="0" w:color="D9D9D9"/>
+              <w:bottom w:val="single" w:sz="6" w:space="0" w:color="D9D9D9"/>
+              <w:right w:val="single" w:sz="6" w:space="0" w:color="D9D9D9"/>
+              <w:insideH w:val="single" w:sz="6" w:space="0" w:color="D9D9D9"/>
+              <w:insideV w:val="single" w:sz="6" w:space="0" w:color="D9D9D9"/>
+            </w:tcBorders>
+            <w:tcMar>
+              <w:top w:w="100" w:type="dxa"/>
+              <w:start w:w="120" w:type="dxa"/>
+              <w:bottom w:w="100" w:type="dxa"/>
+              <w:end w:w="120" w:type="dxa"/>
+            </w:tcMar>
+          </w:tcPr>
+          <w:p>
+            <w:pPr>
+              <w:spacing w:after="20" w:line="276" w:lineRule="auto"/>
+            </w:pPr>
+            <w:r/>
+            <w:r>
+              <w:rPr>
+                <w:rFonts w:ascii="Microsoft JhengHei" w:hAnsi="Microsoft JhengHei" w:eastAsia="Microsoft JhengHei"/>
+                <w:color w:val="20242C"/>
+                <w:sz w:val="18"/>
+              </w:rPr>
+              <w:t>獨立資源</w:t>
+            </w:r>
+          </w:p>
+        </w:tc>
+        <w:tc>
+          <w:tcPr>
+            <w:tcW w:type="dxa" w:w="7560"/>
+            <w:vAlign w:val="center"/>
+            <w:shd w:fill="FFFFFF"/>
+            <w:tcBorders>
+              <w:top w:val="single" w:sz="6" w:space="0" w:color="D9D9D9"/>
+              <w:left w:val="single" w:sz="6" w:space="0" w:color="D9D9D9"/>
+              <w:bottom w:val="single" w:sz="6" w:space="0" w:color="D9D9D9"/>
+              <w:right w:val="single" w:sz="6" w:space="0" w:color="D9D9D9"/>
+              <w:insideH w:val="single" w:sz="6" w:space="0" w:color="D9D9D9"/>
+              <w:insideV w:val="single" w:sz="6" w:space="0" w:color="D9D9D9"/>
+            </w:tcBorders>
+            <w:tcMar>
+              <w:top w:w="100" w:type="dxa"/>
+              <w:start w:w="120" w:type="dxa"/>
+              <w:bottom w:w="100" w:type="dxa"/>
+              <w:end w:w="120" w:type="dxa"/>
+            </w:tcMar>
+          </w:tcPr>
+          <w:p>
+            <w:pPr>
+              <w:spacing w:after="20" w:line="276" w:lineRule="auto"/>
+            </w:pPr>
+            <w:r/>
+            <w:r>
+              <w:rPr>
+                <w:rFonts w:ascii="Microsoft JhengHei" w:hAnsi="Microsoft JhengHei" w:eastAsia="Microsoft JhengHei"/>
+                <w:color w:val="20242C"/>
+                <w:sz w:val="18"/>
+              </w:rPr>
+              <w:t>飼料、玩具、星伴代幣，不消耗星砂、角色經驗或突破材料</w:t>
+            </w:r>
+          </w:p>
+        </w:tc>
+      </w:tr>
+      <w:tr>
+        <w:tc>
+          <w:tcPr>
+            <w:tcW w:type="dxa" w:w="2088"/>
+            <w:vAlign w:val="center"/>
+            <w:shd w:fill="F4F7FB"/>
+            <w:tcBorders>
+              <w:top w:val="single" w:sz="6" w:space="0" w:color="D9D9D9"/>
+              <w:left w:val="single" w:sz="6" w:space="0" w:color="D9D9D9"/>
+              <w:bottom w:val="single" w:sz="6" w:space="0" w:color="D9D9D9"/>
+              <w:right w:val="single" w:sz="6" w:space="0" w:color="D9D9D9"/>
+              <w:insideH w:val="single" w:sz="6" w:space="0" w:color="D9D9D9"/>
+              <w:insideV w:val="single" w:sz="6" w:space="0" w:color="D9D9D9"/>
+            </w:tcBorders>
+            <w:tcMar>
+              <w:top w:w="100" w:type="dxa"/>
+              <w:start w:w="120" w:type="dxa"/>
+              <w:bottom w:w="100" w:type="dxa"/>
+              <w:end w:w="120" w:type="dxa"/>
+            </w:tcMar>
+          </w:tcPr>
+          <w:p>
+            <w:pPr>
+              <w:spacing w:after="20" w:line="276" w:lineRule="auto"/>
+            </w:pPr>
+            <w:r/>
+            <w:r>
+              <w:rPr>
+                <w:rFonts w:ascii="Microsoft JhengHei" w:hAnsi="Microsoft JhengHei" w:eastAsia="Microsoft JhengHei"/>
+                <w:color w:val="20242C"/>
+                <w:sz w:val="18"/>
+              </w:rPr>
+              <w:t>培育</w:t>
+            </w:r>
+          </w:p>
+        </w:tc>
+        <w:tc>
+          <w:tcPr>
+            <w:tcW w:type="dxa" w:w="7560"/>
+            <w:vAlign w:val="center"/>
+            <w:shd w:fill="F4F7FB"/>
+            <w:tcBorders>
+              <w:top w:val="single" w:sz="6" w:space="0" w:color="D9D9D9"/>
+              <w:left w:val="single" w:sz="6" w:space="0" w:color="D9D9D9"/>
+              <w:bottom w:val="single" w:sz="6" w:space="0" w:color="D9D9D9"/>
+              <w:right w:val="single" w:sz="6" w:space="0" w:color="D9D9D9"/>
+              <w:insideH w:val="single" w:sz="6" w:space="0" w:color="D9D9D9"/>
+              <w:insideV w:val="single" w:sz="6" w:space="0" w:color="D9D9D9"/>
+            </w:tcBorders>
+            <w:tcMar>
+              <w:top w:w="100" w:type="dxa"/>
+              <w:start w:w="120" w:type="dxa"/>
+              <w:bottom w:w="100" w:type="dxa"/>
+              <w:end w:w="120" w:type="dxa"/>
+            </w:tcMar>
+          </w:tcPr>
+          <w:p>
+            <w:pPr>
+              <w:spacing w:after="20" w:line="276" w:lineRule="auto"/>
+            </w:pPr>
+            <w:r/>
+            <w:r>
+              <w:rPr>
+                <w:rFonts w:ascii="Microsoft JhengHei" w:hAnsi="Microsoft JhengHei" w:eastAsia="Microsoft JhengHei"/>
+                <w:color w:val="20242C"/>
+                <w:sz w:val="18"/>
+              </w:rPr>
+              <w:t>寵物等級上限 30；餵食、玩耍、訓練提升經驗、親密度、心情與訓練紀錄</w:t>
+            </w:r>
+          </w:p>
+        </w:tc>
+      </w:tr>
+      <w:tr>
+        <w:tc>
+          <w:tcPr>
+            <w:tcW w:type="dxa" w:w="2088"/>
+            <w:vAlign w:val="center"/>
+            <w:shd w:fill="FFFFFF"/>
+            <w:tcBorders>
+              <w:top w:val="single" w:sz="6" w:space="0" w:color="D9D9D9"/>
+              <w:left w:val="single" w:sz="6" w:space="0" w:color="D9D9D9"/>
+              <w:bottom w:val="single" w:sz="6" w:space="0" w:color="D9D9D9"/>
+              <w:right w:val="single" w:sz="6" w:space="0" w:color="D9D9D9"/>
+              <w:insideH w:val="single" w:sz="6" w:space="0" w:color="D9D9D9"/>
+              <w:insideV w:val="single" w:sz="6" w:space="0" w:color="D9D9D9"/>
+            </w:tcBorders>
+            <w:tcMar>
+              <w:top w:w="100" w:type="dxa"/>
+              <w:start w:w="120" w:type="dxa"/>
+              <w:bottom w:w="100" w:type="dxa"/>
+              <w:end w:w="120" w:type="dxa"/>
+            </w:tcMar>
+          </w:tcPr>
+          <w:p>
+            <w:pPr>
+              <w:spacing w:after="20" w:line="276" w:lineRule="auto"/>
+            </w:pPr>
+            <w:r/>
+            <w:r>
+              <w:rPr>
+                <w:rFonts w:ascii="Microsoft JhengHei" w:hAnsi="Microsoft JhengHei" w:eastAsia="Microsoft JhengHei"/>
+                <w:color w:val="20242C"/>
+                <w:sz w:val="18"/>
+              </w:rPr>
+              <w:t>展示</w:t>
+            </w:r>
+          </w:p>
+        </w:tc>
+        <w:tc>
+          <w:tcPr>
+            <w:tcW w:type="dxa" w:w="7560"/>
+            <w:vAlign w:val="center"/>
+            <w:shd w:fill="FFFFFF"/>
+            <w:tcBorders>
+              <w:top w:val="single" w:sz="6" w:space="0" w:color="D9D9D9"/>
+              <w:left w:val="single" w:sz="6" w:space="0" w:color="D9D9D9"/>
+              <w:bottom w:val="single" w:sz="6" w:space="0" w:color="D9D9D9"/>
+              <w:right w:val="single" w:sz="6" w:space="0" w:color="D9D9D9"/>
+              <w:insideH w:val="single" w:sz="6" w:space="0" w:color="D9D9D9"/>
+              <w:insideV w:val="single" w:sz="6" w:space="0" w:color="D9D9D9"/>
+            </w:tcBorders>
+            <w:tcMar>
+              <w:top w:w="100" w:type="dxa"/>
+              <w:start w:w="120" w:type="dxa"/>
+              <w:bottom w:w="100" w:type="dxa"/>
+              <w:end w:w="120" w:type="dxa"/>
+            </w:tcMar>
+          </w:tcPr>
+          <w:p>
+            <w:pPr>
+              <w:spacing w:after="20" w:line="276" w:lineRule="auto"/>
+            </w:pPr>
+            <w:r/>
+            <w:r>
+              <w:rPr>
+                <w:rFonts w:ascii="Microsoft JhengHei" w:hAnsi="Microsoft JhengHei" w:eastAsia="Microsoft JhengHei"/>
+                <w:color w:val="20242C"/>
+                <w:sz w:val="18"/>
+              </w:rPr>
+              <w:t>可選寵物、裝扮、特效；展示可設為私人或公開</w:t>
+            </w:r>
+          </w:p>
+        </w:tc>
+      </w:tr>
+      <w:tr>
+        <w:tc>
+          <w:tcPr>
+            <w:tcW w:type="dxa" w:w="2088"/>
+            <w:vAlign w:val="center"/>
+            <w:shd w:fill="F4F7FB"/>
+            <w:tcBorders>
+              <w:top w:val="single" w:sz="6" w:space="0" w:color="D9D9D9"/>
+              <w:left w:val="single" w:sz="6" w:space="0" w:color="D9D9D9"/>
+              <w:bottom w:val="single" w:sz="6" w:space="0" w:color="D9D9D9"/>
+              <w:right w:val="single" w:sz="6" w:space="0" w:color="D9D9D9"/>
+              <w:insideH w:val="single" w:sz="6" w:space="0" w:color="D9D9D9"/>
+              <w:insideV w:val="single" w:sz="6" w:space="0" w:color="D9D9D9"/>
+            </w:tcBorders>
+            <w:tcMar>
+              <w:top w:w="100" w:type="dxa"/>
+              <w:start w:w="120" w:type="dxa"/>
+              <w:bottom w:w="100" w:type="dxa"/>
+              <w:end w:w="120" w:type="dxa"/>
+            </w:tcMar>
+          </w:tcPr>
+          <w:p>
+            <w:pPr>
+              <w:spacing w:after="20" w:line="276" w:lineRule="auto"/>
+            </w:pPr>
+            <w:r/>
+            <w:r>
+              <w:rPr>
+                <w:rFonts w:ascii="Microsoft JhengHei" w:hAnsi="Microsoft JhengHei" w:eastAsia="Microsoft JhengHei"/>
+                <w:color w:val="20242C"/>
+                <w:sz w:val="18"/>
+              </w:rPr>
+              <w:t>社群評分</w:t>
+            </w:r>
+          </w:p>
+        </w:tc>
+        <w:tc>
+          <w:tcPr>
+            <w:tcW w:type="dxa" w:w="7560"/>
+            <w:vAlign w:val="center"/>
+            <w:shd w:fill="F4F7FB"/>
+            <w:tcBorders>
+              <w:top w:val="single" w:sz="6" w:space="0" w:color="D9D9D9"/>
+              <w:left w:val="single" w:sz="6" w:space="0" w:color="D9D9D9"/>
+              <w:bottom w:val="single" w:sz="6" w:space="0" w:color="D9D9D9"/>
+              <w:right w:val="single" w:sz="6" w:space="0" w:color="D9D9D9"/>
+              <w:insideH w:val="single" w:sz="6" w:space="0" w:color="D9D9D9"/>
+              <w:insideV w:val="single" w:sz="6" w:space="0" w:color="D9D9D9"/>
+            </w:tcBorders>
+            <w:tcMar>
+              <w:top w:w="100" w:type="dxa"/>
+              <w:start w:w="120" w:type="dxa"/>
+              <w:bottom w:w="100" w:type="dxa"/>
+              <w:end w:w="120" w:type="dxa"/>
+            </w:tcMar>
+          </w:tcPr>
+          <w:p>
+            <w:pPr>
+              <w:spacing w:after="20" w:line="276" w:lineRule="auto"/>
+            </w:pPr>
+            <w:r/>
+            <w:r>
+              <w:rPr>
+                <w:rFonts w:ascii="Microsoft JhengHei" w:hAnsi="Microsoft JhengHei" w:eastAsia="Microsoft JhengHei"/>
+                <w:color w:val="20242C"/>
+                <w:sz w:val="18"/>
+              </w:rPr>
+              <w:t>其他玩家可瀏覽公開展示；每期每人對同一作品評分一次，評分者 +1 飼料、擁有者 +1 玩具</w:t>
+            </w:r>
+          </w:p>
+        </w:tc>
+      </w:tr>
+      <w:tr>
+        <w:tc>
+          <w:tcPr>
+            <w:tcW w:type="dxa" w:w="2088"/>
+            <w:vAlign w:val="center"/>
+            <w:shd w:fill="FFFFFF"/>
+            <w:tcBorders>
+              <w:top w:val="single" w:sz="6" w:space="0" w:color="D9D9D9"/>
+              <w:left w:val="single" w:sz="6" w:space="0" w:color="D9D9D9"/>
+              <w:bottom w:val="single" w:sz="6" w:space="0" w:color="D9D9D9"/>
+              <w:right w:val="single" w:sz="6" w:space="0" w:color="D9D9D9"/>
+              <w:insideH w:val="single" w:sz="6" w:space="0" w:color="D9D9D9"/>
+              <w:insideV w:val="single" w:sz="6" w:space="0" w:color="D9D9D9"/>
+            </w:tcBorders>
+            <w:tcMar>
+              <w:top w:w="100" w:type="dxa"/>
+              <w:start w:w="120" w:type="dxa"/>
+              <w:bottom w:w="100" w:type="dxa"/>
+              <w:end w:w="120" w:type="dxa"/>
+            </w:tcMar>
+          </w:tcPr>
+          <w:p>
+            <w:pPr>
+              <w:spacing w:after="20" w:line="276" w:lineRule="auto"/>
+            </w:pPr>
+            <w:r/>
+            <w:r>
+              <w:rPr>
+                <w:rFonts w:ascii="Microsoft JhengHei" w:hAnsi="Microsoft JhengHei" w:eastAsia="Microsoft JhengHei"/>
+                <w:color w:val="20242C"/>
+                <w:sz w:val="18"/>
+              </w:rPr>
+              <w:t>版本處理</w:t>
+            </w:r>
+          </w:p>
+        </w:tc>
+        <w:tc>
+          <w:tcPr>
+            <w:tcW w:type="dxa" w:w="7560"/>
+            <w:vAlign w:val="center"/>
+            <w:shd w:fill="FFFFFF"/>
+            <w:tcBorders>
+              <w:top w:val="single" w:sz="6" w:space="0" w:color="D9D9D9"/>
+              <w:left w:val="single" w:sz="6" w:space="0" w:color="D9D9D9"/>
+              <w:bottom w:val="single" w:sz="6" w:space="0" w:color="D9D9D9"/>
+              <w:right w:val="single" w:sz="6" w:space="0" w:color="D9D9D9"/>
+              <w:insideH w:val="single" w:sz="6" w:space="0" w:color="D9D9D9"/>
+              <w:insideV w:val="single" w:sz="6" w:space="0" w:color="D9D9D9"/>
+            </w:tcBorders>
+            <w:tcMar>
+              <w:top w:w="100" w:type="dxa"/>
+              <w:start w:w="120" w:type="dxa"/>
+              <w:bottom w:w="100" w:type="dxa"/>
+              <w:end w:w="120" w:type="dxa"/>
+            </w:tcMar>
+          </w:tcPr>
+          <w:p>
+            <w:pPr>
+              <w:spacing w:after="20" w:line="276" w:lineRule="auto"/>
+            </w:pPr>
+            <w:r/>
+            <w:r>
+              <w:rPr>
+                <w:rFonts w:ascii="Microsoft JhengHei" w:hAnsi="Microsoft JhengHei" w:eastAsia="Microsoft JhengHei"/>
+                <w:color w:val="20242C"/>
+                <w:sz w:val="18"/>
+              </w:rPr>
+              <w:t>只重置外出探索次數與評分紀錄，寵物等級、收藏與裝扮設定保留</w:t>
+            </w:r>
+          </w:p>
+        </w:tc>
+      </w:tr>
+    </w:tbl>
+    <w:p>
+      <w:pPr>
+        <w:spacing w:after="20"/>
+      </w:pPr>
     </w:p>
     <w:p>
       <w:r>

</xml_diff>

<commit_message>
sync 5.0-5.5 story and compact lobby links
</commit_message>
<xml_diff>
--- a/星界之律遊戲設定總覽.docx
+++ b/星界之律遊戲設定總覽.docx
@@ -37,13 +37,7 @@
         <w:spacing w:after="200" w:line="312" w:lineRule="auto"/>
       </w:pPr>
       <w:r>
-        <w:rPr>
-          <w:rFonts w:ascii="Microsoft JhengHei" w:hAnsi="Microsoft JhengHei" w:eastAsia="Microsoft JhengHei"/>
-          <w:b w:val="0"/>
-          <w:color w:val="20242C"/>
-          <w:sz w:val="21"/>
-        </w:rPr>
-        <w:t>本文件是目前遊戲程式的單一規則總覽，供製作、測試、部署與後續版本維護使用。現行玩家內容開放至 2.5；3.0–4.5 的內容已整理完成但維持鎖定。除抽卡、劇情、角色培養與戰鬥外，星海迷航和星伴培育也已納入同一套帳號保存規則。任何數值或開放狀態調整，都應同步檢查 src/data.js、玩家介面與測試。</w:t>
+        <w:t>本文件是目前遊戲程式的單一規則總覽，供製作、測試、部署與後續版本維護使用。現行玩家內容開放至 2.5；3.0–5.5 的內容已整理完成但維持鎖定，4.0 起接入原創的「北境神話篇」。除抽卡、劇情、角色培養與戰鬥外，星海迷航和星伴培育也已納入同一套帳號保存規則。任何數值或開放狀態調整，都應同步檢查 src/data.js、玩家介面與測試。</w:t>
       </w:r>
     </w:p>
     <w:p>
@@ -1103,14 +1097,8 @@
             <w:pPr>
               <w:spacing w:after="20" w:line="276" w:lineRule="auto"/>
             </w:pPr>
-            <w:r/>
             <w:r>
-              <w:rPr>
-                <w:rFonts w:ascii="Microsoft JhengHei" w:hAnsi="Microsoft JhengHei" w:eastAsia="Microsoft JhengHei"/>
-                <w:color w:val="20242C"/>
-                <w:sz w:val="18"/>
-              </w:rPr>
-              <w:t>3.0–4.5 劇情、角色、敵人與數值</w:t>
+              <w:t>3.0–5.5 劇情、角色、敵人與數值</w:t>
             </w:r>
           </w:p>
         </w:tc>
@@ -1243,8 +1231,35 @@
       </w:r>
     </w:p>
     <w:p>
+      <w:pPr>
+        <w:pStyle w:val="Heading2"/>
+      </w:pPr>
       <w:r>
-        <w:br w:type="page"/>
+        <w:t>大廳快速入口</w:t>
+      </w:r>
+    </w:p>
+    <w:p>
+      <w:pPr>
+        <w:pStyle w:val="ListBullet"/>
+      </w:pPr>
+      <w:r>
+        <w:t>公告不再佔用大廳主選單的大型卡片，改放在大廳上方的緊湊快速入口；按鈕使用擴音機圖示，仍可開啟完整公告頁查看版本內容、獎勵與系統優化。</w:t>
+      </w:r>
+    </w:p>
+    <w:p>
+      <w:pPr>
+        <w:pStyle w:val="ListBullet"/>
+      </w:pPr>
+      <w:r>
+        <w:t>新手教學同樣改為大廳角落的小格入口；完成教學後顯示「DONE／已完成」，仍可重新查看規則，但不再以大型選單卡片佔據主畫面。</w:t>
+      </w:r>
+    </w:p>
+    <w:p>
+      <w:pPr>
+        <w:pStyle w:val="ListBullet"/>
+      </w:pPr>
+      <w:r>
+        <w:t>快速入口只有在登入後的大廳顯示，點擊後仍進入原本的公告或新手教學完整頁面，玩家資料與獎勵保存邏輯不變。</w:t>
       </w:r>
     </w:p>
     <w:p>
@@ -4304,11 +4319,6 @@
       </w:r>
     </w:p>
     <w:p>
-      <w:r>
-        <w:br w:type="page"/>
-      </w:r>
-    </w:p>
-    <w:p>
       <w:pPr>
         <w:pStyle w:val="Heading1"/>
         <w:keepNext/>
@@ -4329,13 +4339,7 @@
         <w:spacing w:after="140" w:line="312" w:lineRule="auto"/>
       </w:pPr>
       <w:r>
-        <w:rPr>
-          <w:rFonts w:ascii="Microsoft JhengHei" w:hAnsi="Microsoft JhengHei" w:eastAsia="Microsoft JhengHei"/>
-          <w:b w:val="0"/>
-          <w:color w:val="20242C"/>
-          <w:sz w:val="21"/>
-        </w:rPr>
-        <w:t>玩家進入劇情選單後可以切換主線與支線。章節清單只讓 1.0–2.5 可選；3.0–4.5 仍在同一份檔案中顯示為已建檔但鎖定。選定章節後，當幕內容與本章所有幕次會同時顯示，避免只看到劇情標題。</w:t>
+        <w:t>玩家進入劇情選單後可以切換主線與支線。章節清單只讓 1.0–2.5 可選；3.0–5.5 仍在同一份檔案中顯示為已建檔但鎖定。選定章節後，當幕內容與本章所有幕次會同時顯示，避免只看到劇情標題。</w:t>
       </w:r>
     </w:p>
     <w:tbl>
@@ -6269,11 +6273,6 @@
       </w:r>
     </w:p>
     <w:p>
-      <w:r>
-        <w:br w:type="page"/>
-      </w:r>
-    </w:p>
-    <w:p>
       <w:pPr>
         <w:pStyle w:val="Heading1"/>
         <w:keepNext/>
@@ -6993,11 +6992,6 @@
       </w:r>
     </w:p>
     <w:p>
-      <w:r>
-        <w:br w:type="page"/>
-      </w:r>
-    </w:p>
-    <w:p>
       <w:pPr>
         <w:pStyle w:val="Heading1"/>
         <w:keepNext/>
@@ -7681,11 +7675,6 @@
           <w:sz w:val="20"/>
         </w:rPr>
         <w:t>環境與敵方特性會改變答案，例如治療降低、敵方護盾、噪音延遲技能或高速獵襲。</w:t>
-      </w:r>
-    </w:p>
-    <w:p>
-      <w:r>
-        <w:br w:type="page"/>
       </w:r>
     </w:p>
     <w:p>
@@ -8792,11 +8781,6 @@
           <w:sz w:val="20"/>
         </w:rPr>
         <w:t>Boss 戰同樣採自走棋式自動戰鬥，參考戰力只作提示；角色技能、元素、速度與隊伍協同會影響勝負。</w:t>
-      </w:r>
-    </w:p>
-    <w:p>
-      <w:r>
-        <w:br w:type="page"/>
       </w:r>
     </w:p>
     <w:p>
@@ -10008,11 +9992,6 @@
       </w:pPr>
     </w:p>
     <w:p>
-      <w:r>
-        <w:br w:type="page"/>
-      </w:r>
-    </w:p>
-    <w:p>
       <w:pPr>
         <w:pStyle w:val="Heading1"/>
         <w:keepNext/>
@@ -10555,6 +10534,14 @@
     <w:p>
       <w:pPr>
         <w:pStyle w:val="ListBullet"/>
+      </w:pPr>
+      <w:r>
+        <w:t>季節外觀：每期可讓隨機一名四星取得「夏日海灘派對」造型；只改立繪、動態特效與展示，不改戰力與技能。</w:t>
+      </w:r>
+    </w:p>
+    <w:p>
+      <w:pPr>
+        <w:pStyle w:val="ListBullet"/>
         <w:spacing w:after="60" w:line="288" w:lineRule="auto"/>
       </w:pPr>
       <w:r>
@@ -10564,11 +10551,6 @@
           <w:sz w:val="20"/>
         </w:rPr>
         <w:t>成就與每日任務：追蹤抽卡、培養、戰鬥協同和劇情完成度。</w:t>
-      </w:r>
-    </w:p>
-    <w:p>
-      <w:r>
-        <w:br w:type="page"/>
       </w:r>
     </w:p>
     <w:p>
@@ -10592,13 +10574,7 @@
         <w:spacing w:after="140" w:line="312" w:lineRule="auto"/>
       </w:pPr>
       <w:r>
-        <w:rPr>
-          <w:rFonts w:ascii="Microsoft JhengHei" w:hAnsi="Microsoft JhengHei" w:eastAsia="Microsoft JhengHei"/>
-          <w:b w:val="0"/>
-          <w:color w:val="20242C"/>
-          <w:sz w:val="21"/>
-        </w:rPr>
-        <w:t>3.0–4.5 已完成內容設計並保存於資料層，目前不會被現行卡池或玩家劇情入口使用。每個版本至少一名四星，4.2 另外加入一名三星，維持三星偶爾發布的節奏。</w:t>
+        <w:t>3.0–5.5 已完成內容設計並保存於資料層，目前不會被現行卡池或玩家劇情入口使用。4.0 起接入原創的「北境神話篇」，每個版本至少一名四星，4.2 另外加入一名三星，維持三星偶爾發布的節奏。</w:t>
       </w:r>
     </w:p>
     <w:tbl>
@@ -12476,6 +12452,74 @@
     <w:p>
       <w:pPr>
         <w:pStyle w:val="Heading2"/>
+      </w:pPr>
+      <w:r>
+        <w:t>5.0–5.5 北境神話篇</w:t>
+      </w:r>
+    </w:p>
+    <w:p>
+      <w:pPr/>
+      <w:r>
+        <w:t>4.5 的第二條律留下可拒絕、撤回與重新協商的入口；5.0–5.5 沿著這個入口進入北境，借用北歐神話的世界樹、霜火、彩虹橋、命線與長冬意象，但以星界之律自己的界痕規則重新詮釋，不直接複製既有神話故事。</w:t>
+      </w:r>
+    </w:p>
+    <w:p>
+      <w:pPr>
+        <w:pStyle w:val="ListBullet"/>
+      </w:pPr>
+      <w:r>
+        <w:t>5.0「根冠上的第十盞燈」／「北境的根名冊」：在九重根域之外保留一個未命名的回覆位置，讓缺席者保有自我命名權。</w:t>
+      </w:r>
+    </w:p>
+    <w:p>
+      <w:pPr>
+        <w:pStyle w:val="ListBullet"/>
+      </w:pPr>
+      <w:r>
+        <w:t>5.1「霜火雙核」／「長夜裡的工具架」：以霜與火的協作修復根冠節點，讓生存工具由居民共同維護，而非交給單一英雄。</w:t>
+      </w:r>
+    </w:p>
+    <w:p>
+      <w:pPr>
+        <w:pStyle w:val="ListBullet"/>
+      </w:pPr>
+      <w:r>
+        <w:t>5.2「虹橋以外的回覆」／「橋上不設王座」：重建可中止、可撤回的跨界通路，明確拒絕把彩虹橋變成統治所有界域的王座。</w:t>
+      </w:r>
+    </w:p>
+    <w:p>
+      <w:pPr>
+        <w:pStyle w:val="ListBullet"/>
+      </w:pPr>
+      <w:r>
+        <w:t>5.3「命線織庭的空白梭」／「織線學徒的三次練習」：在命線織庭留下空白梭，將預言改成可被居民反覆修訂的草稿。</w:t>
+      </w:r>
+    </w:p>
+    <w:p>
+      <w:pPr>
+        <w:pStyle w:val="ListBullet"/>
+      </w:pPr>
+      <w:r>
+        <w:t>5.4「深海的回聲守門人」／「第四把鑰匙的交班」：面對深海根門的回聲與守門責任，完成第四把鑰匙的輪班交接。</w:t>
+      </w:r>
+    </w:p>
+    <w:p>
+      <w:pPr>
+        <w:pStyle w:val="ListBullet"/>
+      </w:pPr>
+      <w:r>
+        <w:t>5.5「長冬後的九界新曙」／「把神話寫回人手」：長冬結束後不建立新的神王秩序，而是把神話、規則與修改權交還每一個界域的人。</w:t>
+      </w:r>
+    </w:p>
+    <w:p>
+      <w:pPr/>
+      <w:r>
+        <w:t>5.0–5.5 每版維持 3 幕主線與 3 幕支線的既有劇情長度；程式資料已加入版本主題與 mythicArc metadata，玩家入口仍保持鎖定，待未來版本公告、資產與回歸測試完成後再開放。</w:t>
+      </w:r>
+    </w:p>
+    <w:p>
+      <w:pPr>
+        <w:pStyle w:val="Heading2"/>
         <w:keepNext/>
         <w:spacing w:before="160" w:after="100"/>
       </w:pPr>
@@ -12543,11 +12587,6 @@
           <w:sz w:val="20"/>
         </w:rPr>
         <w:t>確認新角色未誤加入 activeCards 或現行卡池，除非版本正式開放。</w:t>
-      </w:r>
-    </w:p>
-    <w:p>
-      <w:r>
-        <w:br w:type="page"/>
       </w:r>
     </w:p>
     <w:p>
@@ -13444,13 +13483,7 @@
         <w:spacing w:after="0" w:line="312" w:lineRule="auto"/>
       </w:pPr>
       <w:r>
-        <w:rPr>
-          <w:rFonts w:ascii="Microsoft JhengHei" w:hAnsi="Microsoft JhengHei" w:eastAsia="Microsoft JhengHei"/>
-          <w:b/>
-          <w:color w:val="193B63"/>
-          <w:sz w:val="21"/>
-        </w:rPr>
-        <w:t>文件與程式目前以 2.0–2.5 為玩家版本基準；4.5 內容完成建檔但仍需正式版本公告、資產確認與回歸測試後才可開放。</w:t>
+        <w:t>文件與程式目前以 2.0–2.5 為玩家版本基準；3.0–5.5 內容完成建檔並維持鎖定，4.0 起的北境神話篇已完成主線、支線與主題 metadata，但仍需正式版本公告、資產確認與回歸測試後才可開放。</w:t>
       </w:r>
     </w:p>
     <w:sectPr>

</xml_diff>